<commit_message>
Open request scope to all district offices and note Gangneung
Co-Authored-By: Claude Opus 5.5 <noreply@anthropic.com>
Claude-Session: https://claude.ai/code/session_011DrJSR3zzQAfuEGwbEcRfw
</commit_message>
<xml_diff>
--- a/reports/2026-10_RQ1_월간보고.docx
+++ b/reports/2026-10_RQ1_월간보고.docx
@@ -8863,7 +8863,7 @@
           <w:b w:val="false"/>
           <w:bCs w:val="false"/>
         </w:rPr>
-        <w:t xml:space="preserve">북부지방산림청 산하에는 착수보고서 1차 후보인 </w:t>
+        <w:t xml:space="preserve">관리소는 미리 정하지 않고, 두 지방청의 관리소별 실적을 받아 고름. 동부 산하 </w:t>
       </w:r>
       <w:r>
         <w:rPr>
@@ -8871,37 +8871,15 @@
           <w:b/>
           <w:bCs/>
         </w:rPr>
-        <w:t xml:space="preserve">홍천·인제 국유림관리소</w:t>
-      </w:r>
-      <w:r>
-        <w:rPr>
-          <w:rFonts w:ascii="Malgun Gothic" w:cs="Malgun Gothic" w:eastAsia="맑은 고딕" w:hAnsi="Malgun Gothic"/>
-          <w:b w:val="false"/>
-          <w:bCs w:val="false"/>
-        </w:rPr>
-        <w:t xml:space="preserve">가 있어 기존 후보 검토 내용을 그대로 쓸 수 있음.</w:t>
-      </w:r>
-    </w:p>
-    <w:p>
-      <w:pPr>
-        <w:pStyle w:val="ListParagraph"/>
-        <w:numPr>
-          <w:ilvl w:val="0"/>
-          <w:numId w:val="2"/>
-        </w:numPr>
-        <w:pBdr>
-          <w:left w:val="single" w:color="2F5D46" w:sz="18" w:space="8"/>
-        </w:pBdr>
-        <w:shd w:fill="E4EDE6" w:color="auto" w:val="clear"/>
-        <w:spacing w:after="60"/>
-      </w:pPr>
-      <w:r>
-        <w:rPr>
-          <w:rFonts w:ascii="Malgun Gothic" w:cs="Malgun Gothic" w:eastAsia="맑은 고딕" w:hAnsi="Malgun Gothic"/>
-          <w:b w:val="false"/>
-          <w:bCs w:val="false"/>
-        </w:rPr>
-        <w:t xml:space="preserve">동부지방산림청은 착수보고서 후보에 없었으므로, 청구 자료로 산하 관리소별 실적을 받아 관리소를 고름.</w:t>
+        <w:t xml:space="preserve">강릉국유림관리소</w:t>
+      </w:r>
+      <w:r>
+        <w:rPr>
+          <w:rFonts w:ascii="Malgun Gothic" w:cs="Malgun Gothic" w:eastAsia="맑은 고딕" w:hAnsi="Malgun Gothic"/>
+          <w:b w:val="false"/>
+          <w:bCs w:val="false"/>
+        </w:rPr>
+        <w:t xml:space="preserve">의 실적이 많다는 의견이 있으며, 북부 산하에는 착수보고서 후보인 홍천·인제 관리소가 있음.</w:t>
       </w:r>
     </w:p>
     <w:p>
@@ -9587,7 +9565,7 @@
           <w:b w:val="false"/>
           <w:bCs w:val="false"/>
         </w:rPr>
-        <w:t xml:space="preserve">: 산하 국유림관리소별·연도별 벌채(목재매각) 실적 목록과 소반별 벌채 이력. 이 자료로 관리소와 경과연수별 소반을 고름.</w:t>
+        <w:t xml:space="preserve">: 산하 국유림관리소별·연도별 벌채(목재매각) 실적 집계와 소반별 벌채이력 목록. 이 자료로 관리소(강릉 등)와 경과연수별 소반을 고름.</w:t>
       </w:r>
     </w:p>
     <w:p>
@@ -9605,15 +9583,15 @@
           <w:b/>
           <w:bCs/>
         </w:rPr>
-        <w:t xml:space="preserve">2차 청구 또는 협조 요청(11월 초)</w:t>
-      </w:r>
-      <w:r>
-        <w:rPr>
-          <w:rFonts w:ascii="Malgun Gothic" w:cs="Malgun Gothic" w:eastAsia="맑은 고딕" w:hAnsi="Malgun Gothic"/>
-          <w:b w:val="false"/>
-          <w:bCs w:val="false"/>
-        </w:rPr>
-        <w:t xml:space="preserve">: 고른 관리소의 소반별 산림경영계획서, 임도·집재로 노선, 집재 방법. 1차 청구서에 함께 넣되, 자료량이 많아 연장되면 선정 관리소로 범위를 좁혀 다시 청구함.</w:t>
+        <w:t xml:space="preserve">2차 청구(11월 초)</w:t>
+      </w:r>
+      <w:r>
+        <w:rPr>
+          <w:rFonts w:ascii="Malgun Gothic" w:cs="Malgun Gothic" w:eastAsia="맑은 고딕" w:hAnsi="Malgun Gothic"/>
+          <w:b w:val="false"/>
+          <w:bCs w:val="false"/>
+        </w:rPr>
+        <w:t xml:space="preserve">: 고른 관리소 1~2곳의 소반별 산림경영계획서, 임도·집재로 노선, 집재 방법.</w:t>
       </w:r>
     </w:p>
     <w:p>
@@ -9674,7 +9652,7 @@
           <w:b w:val="false"/>
           <w:bCs w:val="false"/>
         </w:rPr>
-        <w:t xml:space="preserve">3. 홍천·인제 국유림관리소(북부) 및 실적 상위 관리소(동부)의 소반별 산림경영계획 자료: 입지(경사·방위·토양), 임상, 영급, 우점 수종, 조림·숲가꾸기 이력</w:t>
+        <w:t xml:space="preserve">3. (2차) 선정 관리소의 소반별 산림경영계획 자료: 입지(경사·방위·토양), 임상, 영급, 우점 수종, 조림·숲가꾸기 이력</w:t>
       </w:r>
     </w:p>
     <w:p>
@@ -13117,7 +13095,7 @@
           <w:b w:val="false"/>
           <w:bCs w:val="false"/>
         </w:rPr>
-        <w:t xml:space="preserve">: 목재매각실적 상위 2곳인 동부·북부지방산림청으로 청구하고, 남부(김천·봉화)는 예비 후보로 두는 방안</w:t>
+        <w:t xml:space="preserve">: 목재매각실적 상위 2곳인 동부·북부지방산림청 전체 목록을 받아 관리소(강릉 등)를 고르고, 남부(김천·봉화)는 예비 후보로 두는 방안</w:t>
       </w:r>
     </w:p>
     <w:p>

</xml_diff>

<commit_message>
Switch to a single one-time information request
Co-Authored-By: Claude Opus 5.5 <noreply@anthropic.com>
Claude-Session: https://claude.ai/code/session_011DrJSR3zzQAfuEGwbEcRfw
</commit_message>
<xml_diff>
--- a/reports/2026-10_RQ1_월간보고.docx
+++ b/reports/2026-10_RQ1_월간보고.docx
@@ -9539,59 +9539,36 @@
           <w:b w:val="false"/>
           <w:bCs w:val="false"/>
         </w:rPr>
-        <w:t xml:space="preserve">청구 단계</w:t>
-      </w:r>
-    </w:p>
-    <w:p>
-      <w:pPr>
-        <w:pStyle w:val="ListParagraph"/>
-        <w:numPr>
-          <w:ilvl w:val="0"/>
-          <w:numId w:val="5"/>
-        </w:numPr>
-        <w:spacing w:after="60"/>
-      </w:pPr>
+        <w:t xml:space="preserve">청구 방식</w:t>
+      </w:r>
+    </w:p>
+    <w:p>
+      <w:pPr>
+        <w:spacing w:after="120"/>
+      </w:pPr>
+      <w:r>
+        <w:rPr>
+          <w:rFonts w:ascii="Malgun Gothic" w:cs="Malgun Gothic" w:eastAsia="맑은 고딕" w:hAnsi="Malgun Gothic"/>
+          <w:b w:val="false"/>
+          <w:bCs w:val="false"/>
+        </w:rPr>
+        <w:t xml:space="preserve">두 지방청에 각각 </w:t>
+      </w:r>
       <w:r>
         <w:rPr>
           <w:rFonts w:ascii="Malgun Gothic" w:cs="Malgun Gothic" w:eastAsia="맑은 고딕" w:hAnsi="Malgun Gothic"/>
           <w:b/>
           <w:bCs/>
         </w:rPr>
-        <w:t xml:space="preserve">1차 청구(10월 중순, 두 지방청 동시)</w:t>
-      </w:r>
-      <w:r>
-        <w:rPr>
-          <w:rFonts w:ascii="Malgun Gothic" w:cs="Malgun Gothic" w:eastAsia="맑은 고딕" w:hAnsi="Malgun Gothic"/>
-          <w:b w:val="false"/>
-          <w:bCs w:val="false"/>
-        </w:rPr>
-        <w:t xml:space="preserve">: 산하 국유림관리소별·연도별 벌채(목재매각) 실적 집계와 소반별 벌채이력 목록. 이 자료로 관리소(강릉 등)와 경과연수별 소반을 고름.</w:t>
-      </w:r>
-    </w:p>
-    <w:p>
-      <w:pPr>
-        <w:pStyle w:val="ListParagraph"/>
-        <w:numPr>
-          <w:ilvl w:val="0"/>
-          <w:numId w:val="5"/>
-        </w:numPr>
-        <w:spacing w:after="60"/>
-      </w:pPr>
-      <w:r>
-        <w:rPr>
-          <w:rFonts w:ascii="Malgun Gothic" w:cs="Malgun Gothic" w:eastAsia="맑은 고딕" w:hAnsi="Malgun Gothic"/>
-          <w:b/>
-          <w:bCs/>
-        </w:rPr>
-        <w:t xml:space="preserve">2차 청구(11월 초)</w:t>
-      </w:r>
-      <w:r>
-        <w:rPr>
-          <w:rFonts w:ascii="Malgun Gothic" w:cs="Malgun Gothic" w:eastAsia="맑은 고딕" w:hAnsi="Malgun Gothic"/>
-          <w:b w:val="false"/>
-          <w:bCs w:val="false"/>
-        </w:rPr>
-        <w:t xml:space="preserve">: 고른 관리소 1~2곳의 소반별 산림경영계획서, 임도·집재로 노선, 집재 방법.</w:t>
+        <w:t xml:space="preserve">1회 일괄 청구</w:t>
+      </w:r>
+      <w:r>
+        <w:rPr>
+          <w:rFonts w:ascii="Malgun Gothic" w:cs="Malgun Gothic" w:eastAsia="맑은 고딕" w:hAnsi="Malgun Gothic"/>
+          <w:b w:val="false"/>
+          <w:bCs w:val="false"/>
+        </w:rPr>
+        <w:t xml:space="preserve">(10월 중순)함. 소반별 상세 자료는 주벌 실적이 있는 소반으로 한정하고, 시스템에 없는 항목은 부존재 처리 후 나머지를 제공해 달라고 명시함. 세부 요청 사양은 별도 「정보공개 청구 계획(안)」에 산림경영계획서 기재요령 항목명으로 정리함.</w:t>
       </w:r>
     </w:p>
     <w:p>
@@ -9652,7 +9629,7 @@
           <w:b w:val="false"/>
           <w:bCs w:val="false"/>
         </w:rPr>
-        <w:t xml:space="preserve">3. (2차) 선정 관리소의 소반별 산림경영계획 자료: 입지(경사·방위·토양), 임상, 영급, 우점 수종, 조림·숲가꾸기 이력</w:t>
+        <w:t xml:space="preserve">3. 주벌 실적이 있는 소반의 산림경영계획 자료: 입지(경사·방위·토양), 임상, 영급, 우점 수종, 조림·숲가꾸기 이력</w:t>
       </w:r>
     </w:p>
     <w:p>
@@ -9668,7 +9645,7 @@
           <w:b w:val="false"/>
           <w:bCs w:val="false"/>
         </w:rPr>
-        <w:t xml:space="preserve">4. 위 관리소 관할 임도 노선(SHP) 및 개설 연도·연장·폭</w:t>
+        <w:t xml:space="preserve">4. 산하 관리소 관할 임도 노선(SHP) 및 개설 연도·연장·폭</w:t>
       </w:r>
     </w:p>
     <w:p>
@@ -9684,7 +9661,7 @@
           <w:b w:val="false"/>
           <w:bCs w:val="false"/>
         </w:rPr>
-        <w:t xml:space="preserve">5. 위 관리소 관할 산불·병해충 피해 이력</w:t>
+        <w:t xml:space="preserve">5. 산하 관리소 관할 산사태 발생·산지사방사업 시행 이력, 산불·병해충 피해 이력</w:t>
       </w:r>
     </w:p>
     <w:p>
@@ -12889,7 +12866,7 @@
                 <w:sz w:val="18"/>
                 <w:szCs w:val="18"/>
               </w:rPr>
-              <w:t xml:space="preserve">정보공개 자료 수령 → 사례지 확정, WEPP 모의(경과연수·벌기령 시나리오), 생물다양성 공간분석, 경제적 최적벌기령 산출 착수</w:t>
+              <w:t xml:space="preserve">정보공개 자료 수령(1회 일괄 청구) → 관리소·소반 선정, 사례지 확정, WEPP 모의(경과연수·벌기령 시나리오), 생물다양성 공간분석, 경제적 최적벌기령 산출 착수</w:t>
             </w:r>
           </w:p>
         </w:tc>
@@ -13051,7 +13028,7 @@
         <w:pStyle w:val="ListParagraph"/>
         <w:numPr>
           <w:ilvl w:val="0"/>
-          <w:numId w:val="6"/>
+          <w:numId w:val="5"/>
         </w:numPr>
         <w:spacing w:after="60"/>
       </w:pPr>
@@ -13077,7 +13054,7 @@
         <w:pStyle w:val="ListParagraph"/>
         <w:numPr>
           <w:ilvl w:val="0"/>
-          <w:numId w:val="6"/>
+          <w:numId w:val="5"/>
         </w:numPr>
         <w:spacing w:after="60"/>
       </w:pPr>
@@ -13103,7 +13080,7 @@
         <w:pStyle w:val="ListParagraph"/>
         <w:numPr>
           <w:ilvl w:val="0"/>
-          <w:numId w:val="6"/>
+          <w:numId w:val="5"/>
         </w:numPr>
         <w:spacing w:after="60"/>
       </w:pPr>
@@ -13121,7 +13098,7 @@
         <w:pStyle w:val="ListParagraph"/>
         <w:numPr>
           <w:ilvl w:val="0"/>
-          <w:numId w:val="6"/>
+          <w:numId w:val="5"/>
         </w:numPr>
         <w:spacing w:after="60"/>
       </w:pPr>
@@ -13554,12 +13531,6 @@
     </w:lvlOverride>
   </w:num>
   <w:num w:numId="5">
-    <w:abstractNumId w:val="3"/>
-    <w:lvlOverride w:ilvl="0">
-      <w:startOverride w:val="1"/>
-    </w:lvlOverride>
-  </w:num>
-  <w:num w:numId="6">
     <w:abstractNumId w:val="4"/>
     <w:lvlOverride w:ilvl="0">
       <w:startOverride w:val="1"/>

</xml_diff>

<commit_message>
Consolidate October report with final request plan and advisor guidance
Co-Authored-By: Claude Opus 5.5 <noreply@anthropic.com>
Claude-Session: https://claude.ai/code/session_011DrJSR3zzQAfuEGwbEcRfw
</commit_message>
<xml_diff>
--- a/reports/2026-10_RQ1_월간보고.docx
+++ b/reports/2026-10_RQ1_월간보고.docx
@@ -340,7 +340,7 @@
           <w:b w:val="false"/>
           <w:bCs w:val="false"/>
         </w:rPr>
-        <w:t xml:space="preserve">: 산림청 국유림 목재매각실적(2020~2024) 분석 결과, 벌채 면적 상위 2곳인 </w:t>
+        <w:t xml:space="preserve">: 교수님 자문에 따라 벌채 실적을 먼저 보고 사례지를 정함. 산림청 국유림 목재매각실적(2020~2024) 분석 결과, 벌채 면적 상위 2곳인 </w:t>
       </w:r>
       <w:r>
         <w:rPr>
@@ -372,7 +372,7 @@
           <w:b w:val="false"/>
           <w:bCs w:val="false"/>
         </w:rPr>
-        <w:t xml:space="preserve">에 정보공개를 청구함. 두 곳이 5년간 지방청 벌채 면적의 56%를 차지함.</w:t>
+        <w:t xml:space="preserve">에 정보공개를 1회 일괄 청구함. 두 곳이 5년간 지방청 벌채 면적의 56%를 차지함.</w:t>
       </w:r>
     </w:p>
     <w:p>
@@ -427,10 +427,10 @@
         </w:tblBorders>
       </w:tblPr>
       <w:tblGrid>
-        <w:gridCol w:w="1876"/>
-        <w:gridCol w:w="682"/>
-        <w:gridCol w:w="682"/>
-        <w:gridCol w:w="6398"/>
+        <w:gridCol w:w="1752"/>
+        <w:gridCol w:w="637"/>
+        <w:gridCol w:w="637"/>
+        <w:gridCol w:w="6612"/>
       </w:tblGrid>
       <w:tr>
         <w:trPr>
@@ -438,7 +438,7 @@
         </w:trPr>
         <w:tc>
           <w:tcPr>
-            <w:tcW w:type="dxa" w:w="1876"/>
+            <w:tcW w:type="dxa" w:w="1752"/>
             <w:tcBorders>
               <w:top w:val="single" w:color="BFC6BC" w:sz="4"/>
               <w:left w:val="single" w:color="BFC6BC" w:sz="4"/>
@@ -471,7 +471,7 @@
         </w:tc>
         <w:tc>
           <w:tcPr>
-            <w:tcW w:type="dxa" w:w="682"/>
+            <w:tcW w:type="dxa" w:w="637"/>
             <w:tcBorders>
               <w:top w:val="single" w:color="BFC6BC" w:sz="4"/>
               <w:left w:val="single" w:color="BFC6BC" w:sz="4"/>
@@ -504,7 +504,7 @@
         </w:tc>
         <w:tc>
           <w:tcPr>
-            <w:tcW w:type="dxa" w:w="682"/>
+            <w:tcW w:type="dxa" w:w="637"/>
             <w:tcBorders>
               <w:top w:val="single" w:color="BFC6BC" w:sz="4"/>
               <w:left w:val="single" w:color="BFC6BC" w:sz="4"/>
@@ -537,7 +537,7 @@
         </w:tc>
         <w:tc>
           <w:tcPr>
-            <w:tcW w:type="dxa" w:w="6398"/>
+            <w:tcW w:type="dxa" w:w="6612"/>
             <w:tcBorders>
               <w:top w:val="single" w:color="BFC6BC" w:sz="4"/>
               <w:left w:val="single" w:color="BFC6BC" w:sz="4"/>
@@ -575,7 +575,7 @@
         </w:trPr>
         <w:tc>
           <w:tcPr>
-            <w:tcW w:type="dxa" w:w="1876"/>
+            <w:tcW w:type="dxa" w:w="1752"/>
             <w:tcBorders>
               <w:top w:val="single" w:color="BFC6BC" w:sz="4"/>
               <w:left w:val="single" w:color="BFC6BC" w:sz="4"/>
@@ -607,7 +607,7 @@
         </w:tc>
         <w:tc>
           <w:tcPr>
-            <w:tcW w:type="dxa" w:w="682"/>
+            <w:tcW w:type="dxa" w:w="637"/>
             <w:tcBorders>
               <w:top w:val="single" w:color="BFC6BC" w:sz="4"/>
               <w:left w:val="single" w:color="BFC6BC" w:sz="4"/>
@@ -639,7 +639,7 @@
         </w:tc>
         <w:tc>
           <w:tcPr>
-            <w:tcW w:type="dxa" w:w="682"/>
+            <w:tcW w:type="dxa" w:w="637"/>
             <w:tcBorders>
               <w:top w:val="single" w:color="BFC6BC" w:sz="4"/>
               <w:left w:val="single" w:color="BFC6BC" w:sz="4"/>
@@ -694,33 +694,33 @@
         </w:tc>
         <w:tc>
           <w:tcPr>
-            <w:tcW w:type="dxa" w:w="6398"/>
-            <w:tcBorders>
-              <w:top w:val="single" w:color="BFC6BC" w:sz="4"/>
-              <w:left w:val="single" w:color="BFC6BC" w:sz="4"/>
-              <w:bottom w:val="single" w:color="BFC6BC" w:sz="4"/>
-              <w:right w:val="single" w:color="BFC6BC" w:sz="4"/>
-            </w:tcBorders>
-            <w:tcMar>
-              <w:top w:type="dxa" w:w="60"/>
-              <w:left w:type="dxa" w:w="100"/>
-              <w:bottom w:type="dxa" w:w="60"/>
-              <w:right w:type="dxa" w:w="100"/>
-            </w:tcMar>
-          </w:tcPr>
-          <w:p>
-            <w:pPr>
-              <w:spacing w:after="0" w:line="276"/>
-            </w:pPr>
-            <w:r>
-              <w:rPr>
-                <w:rFonts w:ascii="Malgun Gothic" w:cs="Malgun Gothic" w:eastAsia="맑은 고딕" w:hAnsi="Malgun Gothic"/>
-                <w:b w:val="false"/>
-                <w:bCs w:val="false"/>
-                <w:sz w:val="18"/>
-                <w:szCs w:val="18"/>
-              </w:rPr>
-              <w:t xml:space="preserve">목재매각실적 분석으로 청구 대상 2곳(동부·북부지방산림청) 선정, 청구서 작성 중. 자료 수령 후 관리소·소반 확정(→ 5장)</w:t>
+            <w:tcW w:type="dxa" w:w="6612"/>
+            <w:tcBorders>
+              <w:top w:val="single" w:color="BFC6BC" w:sz="4"/>
+              <w:left w:val="single" w:color="BFC6BC" w:sz="4"/>
+              <w:bottom w:val="single" w:color="BFC6BC" w:sz="4"/>
+              <w:right w:val="single" w:color="BFC6BC" w:sz="4"/>
+            </w:tcBorders>
+            <w:tcMar>
+              <w:top w:type="dxa" w:w="60"/>
+              <w:left w:type="dxa" w:w="100"/>
+              <w:bottom w:type="dxa" w:w="60"/>
+              <w:right w:type="dxa" w:w="100"/>
+            </w:tcMar>
+          </w:tcPr>
+          <w:p>
+            <w:pPr>
+              <w:spacing w:after="0" w:line="276"/>
+            </w:pPr>
+            <w:r>
+              <w:rPr>
+                <w:rFonts w:ascii="Malgun Gothic" w:cs="Malgun Gothic" w:eastAsia="맑은 고딕" w:hAnsi="Malgun Gothic"/>
+                <w:b w:val="false"/>
+                <w:bCs w:val="false"/>
+                <w:sz w:val="18"/>
+                <w:szCs w:val="18"/>
+              </w:rPr>
+              <w:t xml:space="preserve">목재매각실적 분석으로 청구 대상 2곳(동부·북부지방산림청) 선정, 청구서(안) 작성 완료·교수님 검토 중. 자료 수령 후 관리소·소반 확정(→ 5장)</w:t>
             </w:r>
           </w:p>
         </w:tc>
@@ -731,7 +731,7 @@
         </w:trPr>
         <w:tc>
           <w:tcPr>
-            <w:tcW w:type="dxa" w:w="1876"/>
+            <w:tcW w:type="dxa" w:w="1752"/>
             <w:tcBorders>
               <w:top w:val="single" w:color="BFC6BC" w:sz="4"/>
               <w:left w:val="single" w:color="BFC6BC" w:sz="4"/>
@@ -763,7 +763,7 @@
         </w:tc>
         <w:tc>
           <w:tcPr>
-            <w:tcW w:type="dxa" w:w="682"/>
+            <w:tcW w:type="dxa" w:w="637"/>
             <w:tcBorders>
               <w:top w:val="single" w:color="BFC6BC" w:sz="4"/>
               <w:left w:val="single" w:color="BFC6BC" w:sz="4"/>
@@ -795,7 +795,7 @@
         </w:tc>
         <w:tc>
           <w:tcPr>
-            <w:tcW w:type="dxa" w:w="682"/>
+            <w:tcW w:type="dxa" w:w="637"/>
             <w:tcBorders>
               <w:top w:val="single" w:color="BFC6BC" w:sz="4"/>
               <w:left w:val="single" w:color="BFC6BC" w:sz="4"/>
@@ -850,7 +850,7 @@
         </w:tc>
         <w:tc>
           <w:tcPr>
-            <w:tcW w:type="dxa" w:w="6398"/>
+            <w:tcW w:type="dxa" w:w="6612"/>
             <w:tcBorders>
               <w:top w:val="single" w:color="BFC6BC" w:sz="4"/>
               <w:left w:val="single" w:color="BFC6BC" w:sz="4"/>
@@ -887,7 +887,7 @@
         </w:trPr>
         <w:tc>
           <w:tcPr>
-            <w:tcW w:type="dxa" w:w="1876"/>
+            <w:tcW w:type="dxa" w:w="1752"/>
             <w:tcBorders>
               <w:top w:val="single" w:color="BFC6BC" w:sz="4"/>
               <w:left w:val="single" w:color="BFC6BC" w:sz="4"/>
@@ -919,7 +919,7 @@
         </w:tc>
         <w:tc>
           <w:tcPr>
-            <w:tcW w:type="dxa" w:w="682"/>
+            <w:tcW w:type="dxa" w:w="637"/>
             <w:tcBorders>
               <w:top w:val="single" w:color="BFC6BC" w:sz="4"/>
               <w:left w:val="single" w:color="BFC6BC" w:sz="4"/>
@@ -951,7 +951,7 @@
         </w:tc>
         <w:tc>
           <w:tcPr>
-            <w:tcW w:type="dxa" w:w="682"/>
+            <w:tcW w:type="dxa" w:w="637"/>
             <w:tcBorders>
               <w:top w:val="single" w:color="BFC6BC" w:sz="4"/>
               <w:left w:val="single" w:color="BFC6BC" w:sz="4"/>
@@ -1006,7 +1006,7 @@
         </w:tc>
         <w:tc>
           <w:tcPr>
-            <w:tcW w:type="dxa" w:w="6398"/>
+            <w:tcW w:type="dxa" w:w="6612"/>
             <w:tcBorders>
               <w:top w:val="single" w:color="BFC6BC" w:sz="4"/>
               <w:left w:val="single" w:color="BFC6BC" w:sz="4"/>
@@ -1043,7 +1043,7 @@
         </w:trPr>
         <w:tc>
           <w:tcPr>
-            <w:tcW w:type="dxa" w:w="1876"/>
+            <w:tcW w:type="dxa" w:w="1752"/>
             <w:tcBorders>
               <w:top w:val="single" w:color="BFC6BC" w:sz="4"/>
               <w:left w:val="single" w:color="BFC6BC" w:sz="4"/>
@@ -1075,7 +1075,7 @@
         </w:tc>
         <w:tc>
           <w:tcPr>
-            <w:tcW w:type="dxa" w:w="682"/>
+            <w:tcW w:type="dxa" w:w="637"/>
             <w:tcBorders>
               <w:top w:val="single" w:color="BFC6BC" w:sz="4"/>
               <w:left w:val="single" w:color="BFC6BC" w:sz="4"/>
@@ -1107,7 +1107,7 @@
         </w:tc>
         <w:tc>
           <w:tcPr>
-            <w:tcW w:type="dxa" w:w="682"/>
+            <w:tcW w:type="dxa" w:w="637"/>
             <w:tcBorders>
               <w:top w:val="single" w:color="BFC6BC" w:sz="4"/>
               <w:left w:val="single" w:color="BFC6BC" w:sz="4"/>
@@ -1162,7 +1162,7 @@
         </w:tc>
         <w:tc>
           <w:tcPr>
-            <w:tcW w:type="dxa" w:w="6398"/>
+            <w:tcW w:type="dxa" w:w="6612"/>
             <w:tcBorders>
               <w:top w:val="single" w:color="BFC6BC" w:sz="4"/>
               <w:left w:val="single" w:color="BFC6BC" w:sz="4"/>
@@ -1199,7 +1199,7 @@
         </w:trPr>
         <w:tc>
           <w:tcPr>
-            <w:tcW w:type="dxa" w:w="1876"/>
+            <w:tcW w:type="dxa" w:w="1752"/>
             <w:tcBorders>
               <w:top w:val="single" w:color="BFC6BC" w:sz="4"/>
               <w:left w:val="single" w:color="BFC6BC" w:sz="4"/>
@@ -1231,7 +1231,7 @@
         </w:tc>
         <w:tc>
           <w:tcPr>
-            <w:tcW w:type="dxa" w:w="682"/>
+            <w:tcW w:type="dxa" w:w="637"/>
             <w:tcBorders>
               <w:top w:val="single" w:color="BFC6BC" w:sz="4"/>
               <w:left w:val="single" w:color="BFC6BC" w:sz="4"/>
@@ -1263,7 +1263,7 @@
         </w:tc>
         <w:tc>
           <w:tcPr>
-            <w:tcW w:type="dxa" w:w="682"/>
+            <w:tcW w:type="dxa" w:w="637"/>
             <w:tcBorders>
               <w:top w:val="single" w:color="BFC6BC" w:sz="4"/>
               <w:left w:val="single" w:color="BFC6BC" w:sz="4"/>
@@ -1318,7 +1318,7 @@
         </w:tc>
         <w:tc>
           <w:tcPr>
-            <w:tcW w:type="dxa" w:w="6398"/>
+            <w:tcW w:type="dxa" w:w="6612"/>
             <w:tcBorders>
               <w:top w:val="single" w:color="BFC6BC" w:sz="4"/>
               <w:left w:val="single" w:color="BFC6BC" w:sz="4"/>
@@ -8930,7 +8930,106 @@
           <w:b w:val="false"/>
           <w:bCs w:val="false"/>
         </w:rPr>
-        <w:t xml:space="preserve">5.3 정보공개 청구 방법</w:t>
+        <w:t xml:space="preserve">5.3 사례지 선정 원칙 (교수님 자문)</w:t>
+      </w:r>
+    </w:p>
+    <w:p>
+      <w:pPr>
+        <w:pBdr>
+          <w:top w:val="dashed" w:color="BFC6BC" w:sz="4" w:space="4"/>
+          <w:bottom w:val="dashed" w:color="BFC6BC" w:sz="4" w:space="4"/>
+        </w:pBdr>
+        <w:shd w:fill="F1F3EE" w:color="auto" w:val="clear"/>
+        <w:spacing w:after="120" w:before="80"/>
+        <w:jc w:val="center"/>
+      </w:pPr>
+      <w:r>
+        <w:rPr>
+          <w:rFonts w:ascii="Malgun Gothic" w:cs="Malgun Gothic" w:eastAsia="맑은 고딕" w:hAnsi="Malgun Gothic"/>
+          <w:b w:val="false"/>
+          <w:bCs w:val="false"/>
+        </w:rPr>
+        <w:t xml:space="preserve">벌채 실적 多 → 임도 개설 多 → 토사유출·산사태 多 → 산지사방사업 시행</w:t>
+      </w:r>
+    </w:p>
+    <w:p>
+      <w:pPr>
+        <w:pStyle w:val="ListParagraph"/>
+        <w:numPr>
+          <w:ilvl w:val="0"/>
+          <w:numId w:val="2"/>
+        </w:numPr>
+        <w:spacing w:after="60"/>
+      </w:pPr>
+      <w:r>
+        <w:rPr>
+          <w:rFonts w:ascii="Malgun Gothic" w:cs="Malgun Gothic" w:eastAsia="맑은 고딕" w:hAnsi="Malgun Gothic"/>
+          <w:b w:val="false"/>
+          <w:bCs w:val="false"/>
+        </w:rPr>
+        <w:t xml:space="preserve">벌채 실적을 먼저 관찰하고, 이를 토대로 사례분석지역을 정함.</w:t>
+      </w:r>
+    </w:p>
+    <w:p>
+      <w:pPr>
+        <w:pStyle w:val="ListParagraph"/>
+        <w:numPr>
+          <w:ilvl w:val="0"/>
+          <w:numId w:val="2"/>
+        </w:numPr>
+        <w:spacing w:after="60"/>
+      </w:pPr>
+      <w:r>
+        <w:rPr>
+          <w:rFonts w:ascii="Malgun Gothic" w:cs="Malgun Gothic" w:eastAsia="맑은 고딕" w:hAnsi="Malgun Gothic"/>
+          <w:b w:val="false"/>
+          <w:bCs w:val="false"/>
+        </w:rPr>
+        <w:t xml:space="preserve">국유림별로 벌채 실적이 많은 국유림(관리소)을 선택함.</w:t>
+      </w:r>
+    </w:p>
+    <w:p>
+      <w:pPr>
+        <w:pStyle w:val="ListParagraph"/>
+        <w:numPr>
+          <w:ilvl w:val="0"/>
+          <w:numId w:val="2"/>
+        </w:numPr>
+        <w:spacing w:after="60"/>
+      </w:pPr>
+      <w:r>
+        <w:rPr>
+          <w:rFonts w:ascii="Malgun Gothic" w:cs="Malgun Gothic" w:eastAsia="맑은 고딕" w:hAnsi="Malgun Gothic"/>
+          <w:b w:val="false"/>
+          <w:bCs w:val="false"/>
+        </w:rPr>
+        <w:t xml:space="preserve">요청 정보는 산림관리 실적이 기록되는 산림경영정보시스템의 항목을 기준으로 구체적으로 정리해 요구함. 사전 문의할 시간이 없어, 산림경영계획서 기재요령의 항목명으로 적고 보유 항목 기준 제공을 요청함.</w:t>
+      </w:r>
+    </w:p>
+    <w:p>
+      <w:pPr>
+        <w:pStyle w:val="Heading2"/>
+      </w:pPr>
+      <w:r>
+        <w:rPr>
+          <w:rFonts w:ascii="Malgun Gothic" w:cs="Malgun Gothic" w:eastAsia="맑은 고딕" w:hAnsi="Malgun Gothic"/>
+          <w:b w:val="false"/>
+          <w:bCs w:val="false"/>
+        </w:rPr>
+        <w:t xml:space="preserve">5.4 정보공개 청구 내용 (1회 일괄 청구)</w:t>
+      </w:r>
+    </w:p>
+    <w:p>
+      <w:pPr>
+        <w:spacing w:after="120"/>
+      </w:pPr>
+      <w:r>
+        <w:rPr>
+          <w:rFonts w:ascii="Malgun Gothic" w:cs="Malgun Gothic" w:eastAsia="맑은 고딕" w:hAnsi="Malgun Gothic"/>
+          <w:b w:val="false"/>
+          <w:bCs w:val="false"/>
+        </w:rPr>
+        <w:t xml:space="preserve">10월 중순 동부·북부지방산림청에 같은 내용으로 각각 한 번 청구함(정보공개포털, 10일 이내 결정·최대 10일 연장). 보유하지 않은 항목은 부존재 처리 후 나머지를 제공해 달라고 명시하고, 대상 기간은 보유 전체, 형식은 엑셀(공간자료 SHP)로 요청함. 매수자 상호·계약 금액·개인정보·소득사업 자료는 요청하지 않음. 청구서 원문은 별도 「정보공개 청구서(안)」에 줄글로 정리함.</w:t>
       </w:r>
     </w:p>
     <w:tbl>
@@ -8946,8 +9045,9 @@
         </w:tblBorders>
       </w:tblPr>
       <w:tblGrid>
-        <w:gridCol w:w="787"/>
-        <w:gridCol w:w="8851"/>
+        <w:gridCol w:w="1081"/>
+        <w:gridCol w:w="6035"/>
+        <w:gridCol w:w="2522"/>
       </w:tblGrid>
       <w:tr>
         <w:trPr>
@@ -8955,7 +9055,7 @@
         </w:trPr>
         <w:tc>
           <w:tcPr>
-            <w:tcW w:type="dxa" w:w="787"/>
+            <w:tcW w:type="dxa" w:w="1081"/>
             <w:tcBorders>
               <w:top w:val="single" w:color="BFC6BC" w:sz="4"/>
               <w:left w:val="single" w:color="BFC6BC" w:sz="4"/>
@@ -8982,13 +9082,13 @@
                 <w:sz w:val="18"/>
                 <w:szCs w:val="18"/>
               </w:rPr>
-              <w:t xml:space="preserve">구분</w:t>
-            </w:r>
-          </w:p>
-        </w:tc>
-        <w:tc>
-          <w:tcPr>
-            <w:tcW w:type="dxa" w:w="8851"/>
+              <w:t xml:space="preserve">청구 항목</w:t>
+            </w:r>
+          </w:p>
+        </w:tc>
+        <w:tc>
+          <w:tcPr>
+            <w:tcW w:type="dxa" w:w="6035"/>
             <w:tcBorders>
               <w:top w:val="single" w:color="BFC6BC" w:sz="4"/>
               <w:left w:val="single" w:color="BFC6BC" w:sz="4"/>
@@ -9015,7 +9115,40 @@
                 <w:sz w:val="18"/>
                 <w:szCs w:val="18"/>
               </w:rPr>
-              <w:t xml:space="preserve">내용</w:t>
+              <w:t xml:space="preserve">세부 내용(기재요령 항목명)</w:t>
+            </w:r>
+          </w:p>
+        </w:tc>
+        <w:tc>
+          <w:tcPr>
+            <w:tcW w:type="dxa" w:w="2522"/>
+            <w:tcBorders>
+              <w:top w:val="single" w:color="BFC6BC" w:sz="4"/>
+              <w:left w:val="single" w:color="BFC6BC" w:sz="4"/>
+              <w:bottom w:val="single" w:color="BFC6BC" w:sz="4"/>
+              <w:right w:val="single" w:color="BFC6BC" w:sz="4"/>
+            </w:tcBorders>
+            <w:shd w:fill="E4EDE6" w:color="auto" w:val="clear"/>
+            <w:tcMar>
+              <w:top w:type="dxa" w:w="60"/>
+              <w:left w:type="dxa" w:w="100"/>
+              <w:bottom w:type="dxa" w:w="60"/>
+              <w:right w:type="dxa" w:w="100"/>
+            </w:tcMar>
+          </w:tcPr>
+          <w:p>
+            <w:pPr>
+              <w:spacing w:after="0" w:line="276"/>
+            </w:pPr>
+            <w:r>
+              <w:rPr>
+                <w:rFonts w:ascii="Malgun Gothic" w:cs="Malgun Gothic" w:eastAsia="맑은 고딕" w:hAnsi="Malgun Gothic"/>
+                <w:b/>
+                <w:bCs/>
+                <w:sz w:val="18"/>
+                <w:szCs w:val="18"/>
+              </w:rPr>
+              <w:t xml:space="preserve">활용</w:t>
             </w:r>
           </w:p>
         </w:tc>
@@ -9026,65 +9159,97 @@
         </w:trPr>
         <w:tc>
           <w:tcPr>
-            <w:tcW w:type="dxa" w:w="787"/>
-            <w:tcBorders>
-              <w:top w:val="single" w:color="BFC6BC" w:sz="4"/>
-              <w:left w:val="single" w:color="BFC6BC" w:sz="4"/>
-              <w:bottom w:val="single" w:color="BFC6BC" w:sz="4"/>
-              <w:right w:val="single" w:color="BFC6BC" w:sz="4"/>
-            </w:tcBorders>
-            <w:tcMar>
-              <w:top w:type="dxa" w:w="60"/>
-              <w:left w:type="dxa" w:w="100"/>
-              <w:bottom w:type="dxa" w:w="60"/>
-              <w:right w:type="dxa" w:w="100"/>
-            </w:tcMar>
-          </w:tcPr>
-          <w:p>
-            <w:pPr>
-              <w:spacing w:after="0" w:line="276"/>
-            </w:pPr>
-            <w:r>
-              <w:rPr>
-                <w:rFonts w:ascii="Malgun Gothic" w:cs="Malgun Gothic" w:eastAsia="맑은 고딕" w:hAnsi="Malgun Gothic"/>
-                <w:b w:val="false"/>
-                <w:bCs w:val="false"/>
-                <w:sz w:val="18"/>
-                <w:szCs w:val="18"/>
-              </w:rPr>
-              <w:t xml:space="preserve">청구 기관</w:t>
-            </w:r>
-          </w:p>
-        </w:tc>
-        <w:tc>
-          <w:tcPr>
-            <w:tcW w:type="dxa" w:w="8851"/>
-            <w:tcBorders>
-              <w:top w:val="single" w:color="BFC6BC" w:sz="4"/>
-              <w:left w:val="single" w:color="BFC6BC" w:sz="4"/>
-              <w:bottom w:val="single" w:color="BFC6BC" w:sz="4"/>
-              <w:right w:val="single" w:color="BFC6BC" w:sz="4"/>
-            </w:tcBorders>
-            <w:tcMar>
-              <w:top w:type="dxa" w:w="60"/>
-              <w:left w:type="dxa" w:w="100"/>
-              <w:bottom w:type="dxa" w:w="60"/>
-              <w:right w:type="dxa" w:w="100"/>
-            </w:tcMar>
-          </w:tcPr>
-          <w:p>
-            <w:pPr>
-              <w:spacing w:after="0" w:line="276"/>
-            </w:pPr>
-            <w:r>
-              <w:rPr>
-                <w:rFonts w:ascii="Malgun Gothic" w:cs="Malgun Gothic" w:eastAsia="맑은 고딕" w:hAnsi="Malgun Gothic"/>
-                <w:b w:val="false"/>
-                <w:bCs w:val="false"/>
-                <w:sz w:val="18"/>
-                <w:szCs w:val="18"/>
-              </w:rPr>
-              <w:t xml:space="preserve">동부지방산림청, 북부지방산림청(기관별로 각각 청구)</w:t>
+            <w:tcW w:type="dxa" w:w="1081"/>
+            <w:tcBorders>
+              <w:top w:val="single" w:color="BFC6BC" w:sz="4"/>
+              <w:left w:val="single" w:color="BFC6BC" w:sz="4"/>
+              <w:bottom w:val="single" w:color="BFC6BC" w:sz="4"/>
+              <w:right w:val="single" w:color="BFC6BC" w:sz="4"/>
+            </w:tcBorders>
+            <w:tcMar>
+              <w:top w:type="dxa" w:w="60"/>
+              <w:left w:type="dxa" w:w="100"/>
+              <w:bottom w:type="dxa" w:w="60"/>
+              <w:right w:type="dxa" w:w="100"/>
+            </w:tcMar>
+          </w:tcPr>
+          <w:p>
+            <w:pPr>
+              <w:spacing w:after="0" w:line="276"/>
+            </w:pPr>
+            <w:r>
+              <w:rPr>
+                <w:rFonts w:ascii="Malgun Gothic" w:cs="Malgun Gothic" w:eastAsia="맑은 고딕" w:hAnsi="Malgun Gothic"/>
+                <w:b w:val="false"/>
+                <w:bCs w:val="false"/>
+                <w:sz w:val="18"/>
+                <w:szCs w:val="18"/>
+              </w:rPr>
+              <w:t xml:space="preserve">1. 벌채 실적</w:t>
+            </w:r>
+          </w:p>
+        </w:tc>
+        <w:tc>
+          <w:tcPr>
+            <w:tcW w:type="dxa" w:w="6035"/>
+            <w:tcBorders>
+              <w:top w:val="single" w:color="BFC6BC" w:sz="4"/>
+              <w:left w:val="single" w:color="BFC6BC" w:sz="4"/>
+              <w:bottom w:val="single" w:color="BFC6BC" w:sz="4"/>
+              <w:right w:val="single" w:color="BFC6BC" w:sz="4"/>
+            </w:tcBorders>
+            <w:tcMar>
+              <w:top w:type="dxa" w:w="60"/>
+              <w:left w:type="dxa" w:w="100"/>
+              <w:bottom w:type="dxa" w:w="60"/>
+              <w:right w:type="dxa" w:w="100"/>
+            </w:tcMar>
+          </w:tcPr>
+          <w:p>
+            <w:pPr>
+              <w:spacing w:after="0" w:line="276"/>
+            </w:pPr>
+            <w:r>
+              <w:rPr>
+                <w:rFonts w:ascii="Malgun Gothic" w:cs="Malgun Gothic" w:eastAsia="맑은 고딕" w:hAnsi="Malgun Gothic"/>
+                <w:b w:val="false"/>
+                <w:bCs w:val="false"/>
+                <w:sz w:val="18"/>
+                <w:szCs w:val="18"/>
+              </w:rPr>
+              <w:t xml:space="preserve">관리소별·연도별 계약건수, 벌채면적, 입목재적</w:t>
+            </w:r>
+          </w:p>
+        </w:tc>
+        <w:tc>
+          <w:tcPr>
+            <w:tcW w:type="dxa" w:w="2522"/>
+            <w:tcBorders>
+              <w:top w:val="single" w:color="BFC6BC" w:sz="4"/>
+              <w:left w:val="single" w:color="BFC6BC" w:sz="4"/>
+              <w:bottom w:val="single" w:color="BFC6BC" w:sz="4"/>
+              <w:right w:val="single" w:color="BFC6BC" w:sz="4"/>
+            </w:tcBorders>
+            <w:tcMar>
+              <w:top w:type="dxa" w:w="60"/>
+              <w:left w:type="dxa" w:w="100"/>
+              <w:bottom w:type="dxa" w:w="60"/>
+              <w:right w:type="dxa" w:w="100"/>
+            </w:tcMar>
+          </w:tcPr>
+          <w:p>
+            <w:pPr>
+              <w:spacing w:after="0" w:line="276"/>
+            </w:pPr>
+            <w:r>
+              <w:rPr>
+                <w:rFonts w:ascii="Malgun Gothic" w:cs="Malgun Gothic" w:eastAsia="맑은 고딕" w:hAnsi="Malgun Gothic"/>
+                <w:b w:val="false"/>
+                <w:bCs w:val="false"/>
+                <w:sz w:val="18"/>
+                <w:szCs w:val="18"/>
+              </w:rPr>
+              <w:t xml:space="preserve">관리소 선정</w:t>
             </w:r>
           </w:p>
         </w:tc>
@@ -9095,65 +9260,97 @@
         </w:trPr>
         <w:tc>
           <w:tcPr>
-            <w:tcW w:type="dxa" w:w="787"/>
-            <w:tcBorders>
-              <w:top w:val="single" w:color="BFC6BC" w:sz="4"/>
-              <w:left w:val="single" w:color="BFC6BC" w:sz="4"/>
-              <w:bottom w:val="single" w:color="BFC6BC" w:sz="4"/>
-              <w:right w:val="single" w:color="BFC6BC" w:sz="4"/>
-            </w:tcBorders>
-            <w:tcMar>
-              <w:top w:type="dxa" w:w="60"/>
-              <w:left w:type="dxa" w:w="100"/>
-              <w:bottom w:type="dxa" w:w="60"/>
-              <w:right w:type="dxa" w:w="100"/>
-            </w:tcMar>
-          </w:tcPr>
-          <w:p>
-            <w:pPr>
-              <w:spacing w:after="0" w:line="276"/>
-            </w:pPr>
-            <w:r>
-              <w:rPr>
-                <w:rFonts w:ascii="Malgun Gothic" w:cs="Malgun Gothic" w:eastAsia="맑은 고딕" w:hAnsi="Malgun Gothic"/>
-                <w:b w:val="false"/>
-                <w:bCs w:val="false"/>
-                <w:sz w:val="18"/>
-                <w:szCs w:val="18"/>
-              </w:rPr>
-              <w:t xml:space="preserve">청구 경로</w:t>
-            </w:r>
-          </w:p>
-        </w:tc>
-        <w:tc>
-          <w:tcPr>
-            <w:tcW w:type="dxa" w:w="8851"/>
-            <w:tcBorders>
-              <w:top w:val="single" w:color="BFC6BC" w:sz="4"/>
-              <w:left w:val="single" w:color="BFC6BC" w:sz="4"/>
-              <w:bottom w:val="single" w:color="BFC6BC" w:sz="4"/>
-              <w:right w:val="single" w:color="BFC6BC" w:sz="4"/>
-            </w:tcBorders>
-            <w:tcMar>
-              <w:top w:type="dxa" w:w="60"/>
-              <w:left w:type="dxa" w:w="100"/>
-              <w:bottom w:type="dxa" w:w="60"/>
-              <w:right w:type="dxa" w:w="100"/>
-            </w:tcMar>
-          </w:tcPr>
-          <w:p>
-            <w:pPr>
-              <w:spacing w:after="0" w:line="276"/>
-            </w:pPr>
-            <w:r>
-              <w:rPr>
-                <w:rFonts w:ascii="Malgun Gothic" w:cs="Malgun Gothic" w:eastAsia="맑은 고딕" w:hAnsi="Malgun Gothic"/>
-                <w:b w:val="false"/>
-                <w:bCs w:val="false"/>
-                <w:sz w:val="18"/>
-                <w:szCs w:val="18"/>
-              </w:rPr>
-              <w:t xml:space="preserve">정보공개포털(open.go.kr) 온라인 청구. 청구 전 각 지방청 담당 부서에 전화해 자료 보유 형태(벌채이력 DB, 경영계획서 파일)와 담당자를 확인함</w:t>
+            <w:tcW w:type="dxa" w:w="1081"/>
+            <w:tcBorders>
+              <w:top w:val="single" w:color="BFC6BC" w:sz="4"/>
+              <w:left w:val="single" w:color="BFC6BC" w:sz="4"/>
+              <w:bottom w:val="single" w:color="BFC6BC" w:sz="4"/>
+              <w:right w:val="single" w:color="BFC6BC" w:sz="4"/>
+            </w:tcBorders>
+            <w:tcMar>
+              <w:top w:type="dxa" w:w="60"/>
+              <w:left w:type="dxa" w:w="100"/>
+              <w:bottom w:type="dxa" w:w="60"/>
+              <w:right w:type="dxa" w:w="100"/>
+            </w:tcMar>
+          </w:tcPr>
+          <w:p>
+            <w:pPr>
+              <w:spacing w:after="0" w:line="276"/>
+            </w:pPr>
+            <w:r>
+              <w:rPr>
+                <w:rFonts w:ascii="Malgun Gothic" w:cs="Malgun Gothic" w:eastAsia="맑은 고딕" w:hAnsi="Malgun Gothic"/>
+                <w:b w:val="false"/>
+                <w:bCs w:val="false"/>
+                <w:sz w:val="18"/>
+                <w:szCs w:val="18"/>
+              </w:rPr>
+              <w:t xml:space="preserve">2. 임목생산 실적</w:t>
+            </w:r>
+          </w:p>
+        </w:tc>
+        <w:tc>
+          <w:tcPr>
+            <w:tcW w:type="dxa" w:w="6035"/>
+            <w:tcBorders>
+              <w:top w:val="single" w:color="BFC6BC" w:sz="4"/>
+              <w:left w:val="single" w:color="BFC6BC" w:sz="4"/>
+              <w:bottom w:val="single" w:color="BFC6BC" w:sz="4"/>
+              <w:right w:val="single" w:color="BFC6BC" w:sz="4"/>
+            </w:tcBorders>
+            <w:tcMar>
+              <w:top w:type="dxa" w:w="60"/>
+              <w:left w:type="dxa" w:w="100"/>
+              <w:bottom w:type="dxa" w:w="60"/>
+              <w:right w:type="dxa" w:w="100"/>
+            </w:tcMar>
+          </w:tcPr>
+          <w:p>
+            <w:pPr>
+              <w:spacing w:after="0" w:line="276"/>
+            </w:pPr>
+            <w:r>
+              <w:rPr>
+                <w:rFonts w:ascii="Malgun Gothic" w:cs="Malgun Gothic" w:eastAsia="맑은 고딕" w:hAnsi="Malgun Gothic"/>
+                <w:b w:val="false"/>
+                <w:bCs w:val="false"/>
+                <w:sz w:val="18"/>
+                <w:szCs w:val="18"/>
+              </w:rPr>
+              <w:t xml:space="preserve">연도, 관리소, 임반·소반 번호, 사업종(간벌·주벌), 작업종(모두베기 등), 면적, 수종, 재적, 집재 방법(기록 시)</w:t>
+            </w:r>
+          </w:p>
+        </w:tc>
+        <w:tc>
+          <w:tcPr>
+            <w:tcW w:type="dxa" w:w="2522"/>
+            <w:tcBorders>
+              <w:top w:val="single" w:color="BFC6BC" w:sz="4"/>
+              <w:left w:val="single" w:color="BFC6BC" w:sz="4"/>
+              <w:bottom w:val="single" w:color="BFC6BC" w:sz="4"/>
+              <w:right w:val="single" w:color="BFC6BC" w:sz="4"/>
+            </w:tcBorders>
+            <w:tcMar>
+              <w:top w:type="dxa" w:w="60"/>
+              <w:left w:type="dxa" w:w="100"/>
+              <w:bottom w:type="dxa" w:w="60"/>
+              <w:right w:type="dxa" w:w="100"/>
+            </w:tcMar>
+          </w:tcPr>
+          <w:p>
+            <w:pPr>
+              <w:spacing w:after="0" w:line="276"/>
+            </w:pPr>
+            <w:r>
+              <w:rPr>
+                <w:rFonts w:ascii="Malgun Gothic" w:cs="Malgun Gothic" w:eastAsia="맑은 고딕" w:hAnsi="Malgun Gothic"/>
+                <w:b w:val="false"/>
+                <w:bCs w:val="false"/>
+                <w:sz w:val="18"/>
+                <w:szCs w:val="18"/>
+              </w:rPr>
+              <w:t xml:space="preserve">경과연수별 소반 선정, WEPP 시나리오</w:t>
             </w:r>
           </w:p>
         </w:tc>
@@ -9164,65 +9361,97 @@
         </w:trPr>
         <w:tc>
           <w:tcPr>
-            <w:tcW w:type="dxa" w:w="787"/>
-            <w:tcBorders>
-              <w:top w:val="single" w:color="BFC6BC" w:sz="4"/>
-              <w:left w:val="single" w:color="BFC6BC" w:sz="4"/>
-              <w:bottom w:val="single" w:color="BFC6BC" w:sz="4"/>
-              <w:right w:val="single" w:color="BFC6BC" w:sz="4"/>
-            </w:tcBorders>
-            <w:tcMar>
-              <w:top w:type="dxa" w:w="60"/>
-              <w:left w:type="dxa" w:w="100"/>
-              <w:bottom w:type="dxa" w:w="60"/>
-              <w:right w:type="dxa" w:w="100"/>
-            </w:tcMar>
-          </w:tcPr>
-          <w:p>
-            <w:pPr>
-              <w:spacing w:after="0" w:line="276"/>
-            </w:pPr>
-            <w:r>
-              <w:rPr>
-                <w:rFonts w:ascii="Malgun Gothic" w:cs="Malgun Gothic" w:eastAsia="맑은 고딕" w:hAnsi="Malgun Gothic"/>
-                <w:b w:val="false"/>
-                <w:bCs w:val="false"/>
-                <w:sz w:val="18"/>
-                <w:szCs w:val="18"/>
-              </w:rPr>
-              <w:t xml:space="preserve">공개 방법</w:t>
-            </w:r>
-          </w:p>
-        </w:tc>
-        <w:tc>
-          <w:tcPr>
-            <w:tcW w:type="dxa" w:w="8851"/>
-            <w:tcBorders>
-              <w:top w:val="single" w:color="BFC6BC" w:sz="4"/>
-              <w:left w:val="single" w:color="BFC6BC" w:sz="4"/>
-              <w:bottom w:val="single" w:color="BFC6BC" w:sz="4"/>
-              <w:right w:val="single" w:color="BFC6BC" w:sz="4"/>
-            </w:tcBorders>
-            <w:tcMar>
-              <w:top w:type="dxa" w:w="60"/>
-              <w:left w:type="dxa" w:w="100"/>
-              <w:bottom w:type="dxa" w:w="60"/>
-              <w:right w:type="dxa" w:w="100"/>
-            </w:tcMar>
-          </w:tcPr>
-          <w:p>
-            <w:pPr>
-              <w:spacing w:after="0" w:line="276"/>
-            </w:pPr>
-            <w:r>
-              <w:rPr>
-                <w:rFonts w:ascii="Malgun Gothic" w:cs="Malgun Gothic" w:eastAsia="맑은 고딕" w:hAnsi="Malgun Gothic"/>
-                <w:b w:val="false"/>
-                <w:bCs w:val="false"/>
-                <w:sz w:val="18"/>
-                <w:szCs w:val="18"/>
-              </w:rPr>
-              <w:t xml:space="preserve">전자파일(엑셀, 공간정보는 SHP)로 정보통신망 송부 요청</w:t>
+            <w:tcW w:type="dxa" w:w="1081"/>
+            <w:tcBorders>
+              <w:top w:val="single" w:color="BFC6BC" w:sz="4"/>
+              <w:left w:val="single" w:color="BFC6BC" w:sz="4"/>
+              <w:bottom w:val="single" w:color="BFC6BC" w:sz="4"/>
+              <w:right w:val="single" w:color="BFC6BC" w:sz="4"/>
+            </w:tcBorders>
+            <w:tcMar>
+              <w:top w:type="dxa" w:w="60"/>
+              <w:left w:type="dxa" w:w="100"/>
+              <w:bottom w:type="dxa" w:w="60"/>
+              <w:right w:type="dxa" w:w="100"/>
+            </w:tcMar>
+          </w:tcPr>
+          <w:p>
+            <w:pPr>
+              <w:spacing w:after="0" w:line="276"/>
+            </w:pPr>
+            <w:r>
+              <w:rPr>
+                <w:rFonts w:ascii="Malgun Gothic" w:cs="Malgun Gothic" w:eastAsia="맑은 고딕" w:hAnsi="Malgun Gothic"/>
+                <w:b w:val="false"/>
+                <w:bCs w:val="false"/>
+                <w:sz w:val="18"/>
+                <w:szCs w:val="18"/>
+              </w:rPr>
+              <w:t xml:space="preserve">3. 산림경영계획 자료</w:t>
+            </w:r>
+          </w:p>
+        </w:tc>
+        <w:tc>
+          <w:tcPr>
+            <w:tcW w:type="dxa" w:w="6035"/>
+            <w:tcBorders>
+              <w:top w:val="single" w:color="BFC6BC" w:sz="4"/>
+              <w:left w:val="single" w:color="BFC6BC" w:sz="4"/>
+              <w:bottom w:val="single" w:color="BFC6BC" w:sz="4"/>
+              <w:right w:val="single" w:color="BFC6BC" w:sz="4"/>
+            </w:tcBorders>
+            <w:tcMar>
+              <w:top w:type="dxa" w:w="60"/>
+              <w:left w:type="dxa" w:w="100"/>
+              <w:bottom w:type="dxa" w:w="60"/>
+              <w:right w:type="dxa" w:w="100"/>
+            </w:tcMar>
+          </w:tcPr>
+          <w:p>
+            <w:pPr>
+              <w:spacing w:after="0" w:line="276"/>
+            </w:pPr>
+            <w:r>
+              <w:rPr>
+                <w:rFonts w:ascii="Malgun Gothic" w:cs="Malgun Gothic" w:eastAsia="맑은 고딕" w:hAnsi="Malgun Gothic"/>
+                <w:b w:val="false"/>
+                <w:bCs w:val="false"/>
+                <w:sz w:val="18"/>
+                <w:szCs w:val="18"/>
+              </w:rPr>
+              <w:t xml:space="preserve">주벌 실적 소반의 면적, 산지구분, 경사도 5등급, 수종, 임령, 수고, 경급, 총축적, 경영목표, 조림·숲가꾸기 실적</w:t>
+            </w:r>
+          </w:p>
+        </w:tc>
+        <w:tc>
+          <w:tcPr>
+            <w:tcW w:type="dxa" w:w="2522"/>
+            <w:tcBorders>
+              <w:top w:val="single" w:color="BFC6BC" w:sz="4"/>
+              <w:left w:val="single" w:color="BFC6BC" w:sz="4"/>
+              <w:bottom w:val="single" w:color="BFC6BC" w:sz="4"/>
+              <w:right w:val="single" w:color="BFC6BC" w:sz="4"/>
+            </w:tcBorders>
+            <w:tcMar>
+              <w:top w:type="dxa" w:w="60"/>
+              <w:left w:type="dxa" w:w="100"/>
+              <w:bottom w:type="dxa" w:w="60"/>
+              <w:right w:type="dxa" w:w="100"/>
+            </w:tcMar>
+          </w:tcPr>
+          <w:p>
+            <w:pPr>
+              <w:spacing w:after="0" w:line="276"/>
+            </w:pPr>
+            <w:r>
+              <w:rPr>
+                <w:rFonts w:ascii="Malgun Gothic" w:cs="Malgun Gothic" w:eastAsia="맑은 고딕" w:hAnsi="Malgun Gothic"/>
+                <w:b w:val="false"/>
+                <w:bCs w:val="false"/>
+                <w:sz w:val="18"/>
+                <w:szCs w:val="18"/>
+              </w:rPr>
+              <w:t xml:space="preserve">사례지 설명, WEPP 입력, 벌채 전 임상 변수</w:t>
             </w:r>
           </w:p>
         </w:tc>
@@ -9233,65 +9462,97 @@
         </w:trPr>
         <w:tc>
           <w:tcPr>
-            <w:tcW w:type="dxa" w:w="787"/>
-            <w:tcBorders>
-              <w:top w:val="single" w:color="BFC6BC" w:sz="4"/>
-              <w:left w:val="single" w:color="BFC6BC" w:sz="4"/>
-              <w:bottom w:val="single" w:color="BFC6BC" w:sz="4"/>
-              <w:right w:val="single" w:color="BFC6BC" w:sz="4"/>
-            </w:tcBorders>
-            <w:tcMar>
-              <w:top w:type="dxa" w:w="60"/>
-              <w:left w:type="dxa" w:w="100"/>
-              <w:bottom w:type="dxa" w:w="60"/>
-              <w:right w:type="dxa" w:w="100"/>
-            </w:tcMar>
-          </w:tcPr>
-          <w:p>
-            <w:pPr>
-              <w:spacing w:after="0" w:line="276"/>
-            </w:pPr>
-            <w:r>
-              <w:rPr>
-                <w:rFonts w:ascii="Malgun Gothic" w:cs="Malgun Gothic" w:eastAsia="맑은 고딕" w:hAnsi="Malgun Gothic"/>
-                <w:b w:val="false"/>
-                <w:bCs w:val="false"/>
-                <w:sz w:val="18"/>
-                <w:szCs w:val="18"/>
-              </w:rPr>
-              <w:t xml:space="preserve">청구 범위</w:t>
-            </w:r>
-          </w:p>
-        </w:tc>
-        <w:tc>
-          <w:tcPr>
-            <w:tcW w:type="dxa" w:w="8851"/>
-            <w:tcBorders>
-              <w:top w:val="single" w:color="BFC6BC" w:sz="4"/>
-              <w:left w:val="single" w:color="BFC6BC" w:sz="4"/>
-              <w:bottom w:val="single" w:color="BFC6BC" w:sz="4"/>
-              <w:right w:val="single" w:color="BFC6BC" w:sz="4"/>
-            </w:tcBorders>
-            <w:tcMar>
-              <w:top w:type="dxa" w:w="60"/>
-              <w:left w:type="dxa" w:w="100"/>
-              <w:bottom w:type="dxa" w:w="60"/>
-              <w:right w:type="dxa" w:w="100"/>
-            </w:tcMar>
-          </w:tcPr>
-          <w:p>
-            <w:pPr>
-              <w:spacing w:after="0" w:line="276"/>
-            </w:pPr>
-            <w:r>
-              <w:rPr>
-                <w:rFonts w:ascii="Malgun Gothic" w:cs="Malgun Gothic" w:eastAsia="맑은 고딕" w:hAnsi="Malgun Gothic"/>
-                <w:b w:val="false"/>
-                <w:bCs w:val="false"/>
-                <w:sz w:val="18"/>
-                <w:szCs w:val="18"/>
-              </w:rPr>
-              <w:t xml:space="preserve">목재매각·벌채 이력은 보유 기간 전체(가능하면 1980년대부터). 경과연수 40년 비교구를 찾으려면 오래된 이력이 필요함</w:t>
+            <w:tcW w:type="dxa" w:w="1081"/>
+            <w:tcBorders>
+              <w:top w:val="single" w:color="BFC6BC" w:sz="4"/>
+              <w:left w:val="single" w:color="BFC6BC" w:sz="4"/>
+              <w:bottom w:val="single" w:color="BFC6BC" w:sz="4"/>
+              <w:right w:val="single" w:color="BFC6BC" w:sz="4"/>
+            </w:tcBorders>
+            <w:tcMar>
+              <w:top w:type="dxa" w:w="60"/>
+              <w:left w:type="dxa" w:w="100"/>
+              <w:bottom w:type="dxa" w:w="60"/>
+              <w:right w:type="dxa" w:w="100"/>
+            </w:tcMar>
+          </w:tcPr>
+          <w:p>
+            <w:pPr>
+              <w:spacing w:after="0" w:line="276"/>
+            </w:pPr>
+            <w:r>
+              <w:rPr>
+                <w:rFonts w:ascii="Malgun Gothic" w:cs="Malgun Gothic" w:eastAsia="맑은 고딕" w:hAnsi="Malgun Gothic"/>
+                <w:b w:val="false"/>
+                <w:bCs w:val="false"/>
+                <w:sz w:val="18"/>
+                <w:szCs w:val="18"/>
+              </w:rPr>
+              <w:t xml:space="preserve">4. 시설 자료</w:t>
+            </w:r>
+          </w:p>
+        </w:tc>
+        <w:tc>
+          <w:tcPr>
+            <w:tcW w:type="dxa" w:w="6035"/>
+            <w:tcBorders>
+              <w:top w:val="single" w:color="BFC6BC" w:sz="4"/>
+              <w:left w:val="single" w:color="BFC6BC" w:sz="4"/>
+              <w:bottom w:val="single" w:color="BFC6BC" w:sz="4"/>
+              <w:right w:val="single" w:color="BFC6BC" w:sz="4"/>
+            </w:tcBorders>
+            <w:tcMar>
+              <w:top w:type="dxa" w:w="60"/>
+              <w:left w:type="dxa" w:w="100"/>
+              <w:bottom w:type="dxa" w:w="60"/>
+              <w:right w:type="dxa" w:w="100"/>
+            </w:tcMar>
+          </w:tcPr>
+          <w:p>
+            <w:pPr>
+              <w:spacing w:after="0" w:line="276"/>
+            </w:pPr>
+            <w:r>
+              <w:rPr>
+                <w:rFonts w:ascii="Malgun Gothic" w:cs="Malgun Gothic" w:eastAsia="맑은 고딕" w:hAnsi="Malgun Gothic"/>
+                <w:b w:val="false"/>
+                <w:bCs w:val="false"/>
+                <w:sz w:val="18"/>
+                <w:szCs w:val="18"/>
+              </w:rPr>
+              <w:t xml:space="preserve">임도·운재로·작업로의 시설 연도, 개소수, 사업량(km), 임도 노선 SHP</w:t>
+            </w:r>
+          </w:p>
+        </w:tc>
+        <w:tc>
+          <w:tcPr>
+            <w:tcW w:type="dxa" w:w="2522"/>
+            <w:tcBorders>
+              <w:top w:val="single" w:color="BFC6BC" w:sz="4"/>
+              <w:left w:val="single" w:color="BFC6BC" w:sz="4"/>
+              <w:bottom w:val="single" w:color="BFC6BC" w:sz="4"/>
+              <w:right w:val="single" w:color="BFC6BC" w:sz="4"/>
+            </w:tcBorders>
+            <w:tcMar>
+              <w:top w:type="dxa" w:w="60"/>
+              <w:left w:type="dxa" w:w="100"/>
+              <w:bottom w:type="dxa" w:w="60"/>
+              <w:right w:type="dxa" w:w="100"/>
+            </w:tcMar>
+          </w:tcPr>
+          <w:p>
+            <w:pPr>
+              <w:spacing w:after="0" w:line="276"/>
+            </w:pPr>
+            <w:r>
+              <w:rPr>
+                <w:rFonts w:ascii="Malgun Gothic" w:cs="Malgun Gothic" w:eastAsia="맑은 고딕" w:hAnsi="Malgun Gothic"/>
+                <w:b w:val="false"/>
+                <w:bCs w:val="false"/>
+                <w:sz w:val="18"/>
+                <w:szCs w:val="18"/>
+              </w:rPr>
+              <w:t xml:space="preserve">WEPP:Road 입력, 임도 거리 분석</w:t>
             </w:r>
           </w:p>
         </w:tc>
@@ -9302,1019 +9563,97 @@
         </w:trPr>
         <w:tc>
           <w:tcPr>
-            <w:tcW w:type="dxa" w:w="787"/>
-            <w:tcBorders>
-              <w:top w:val="single" w:color="BFC6BC" w:sz="4"/>
-              <w:left w:val="single" w:color="BFC6BC" w:sz="4"/>
-              <w:bottom w:val="single" w:color="BFC6BC" w:sz="4"/>
-              <w:right w:val="single" w:color="BFC6BC" w:sz="4"/>
-            </w:tcBorders>
-            <w:tcMar>
-              <w:top w:type="dxa" w:w="60"/>
-              <w:left w:type="dxa" w:w="100"/>
-              <w:bottom w:type="dxa" w:w="60"/>
-              <w:right w:type="dxa" w:w="100"/>
-            </w:tcMar>
-          </w:tcPr>
-          <w:p>
-            <w:pPr>
-              <w:spacing w:after="0" w:line="276"/>
-            </w:pPr>
-            <w:r>
-              <w:rPr>
-                <w:rFonts w:ascii="Malgun Gothic" w:cs="Malgun Gothic" w:eastAsia="맑은 고딕" w:hAnsi="Malgun Gothic"/>
-                <w:b w:val="false"/>
-                <w:bCs w:val="false"/>
-                <w:sz w:val="18"/>
-                <w:szCs w:val="18"/>
-              </w:rPr>
-              <w:t xml:space="preserve">처리 기간</w:t>
-            </w:r>
-          </w:p>
-        </w:tc>
-        <w:tc>
-          <w:tcPr>
-            <w:tcW w:type="dxa" w:w="8851"/>
-            <w:tcBorders>
-              <w:top w:val="single" w:color="BFC6BC" w:sz="4"/>
-              <w:left w:val="single" w:color="BFC6BC" w:sz="4"/>
-              <w:bottom w:val="single" w:color="BFC6BC" w:sz="4"/>
-              <w:right w:val="single" w:color="BFC6BC" w:sz="4"/>
-            </w:tcBorders>
-            <w:tcMar>
-              <w:top w:type="dxa" w:w="60"/>
-              <w:left w:type="dxa" w:w="100"/>
-              <w:bottom w:type="dxa" w:w="60"/>
-              <w:right w:type="dxa" w:w="100"/>
-            </w:tcMar>
-          </w:tcPr>
-          <w:p>
-            <w:pPr>
-              <w:spacing w:after="0" w:line="276"/>
-            </w:pPr>
-            <w:r>
-              <w:rPr>
-                <w:rFonts w:ascii="Malgun Gothic" w:cs="Malgun Gothic" w:eastAsia="맑은 고딕" w:hAnsi="Malgun Gothic"/>
-                <w:b w:val="false"/>
-                <w:bCs w:val="false"/>
-                <w:sz w:val="18"/>
-                <w:szCs w:val="18"/>
-              </w:rPr>
-              <w:t xml:space="preserve">청구일로부터 10일 이내 공개 여부 결정, 부득이한 경우 10일 연장 가능(「공공기관의 정보공개에 관한 법률」 제11조)</w:t>
-            </w:r>
-          </w:p>
-        </w:tc>
-      </w:tr>
-      <w:tr>
-        <w:trPr>
-          <w:tblHeader w:val="false"/>
-        </w:trPr>
-        <w:tc>
-          <w:tcPr>
-            <w:tcW w:type="dxa" w:w="787"/>
-            <w:tcBorders>
-              <w:top w:val="single" w:color="BFC6BC" w:sz="4"/>
-              <w:left w:val="single" w:color="BFC6BC" w:sz="4"/>
-              <w:bottom w:val="single" w:color="BFC6BC" w:sz="4"/>
-              <w:right w:val="single" w:color="BFC6BC" w:sz="4"/>
-            </w:tcBorders>
-            <w:tcMar>
-              <w:top w:type="dxa" w:w="60"/>
-              <w:left w:type="dxa" w:w="100"/>
-              <w:bottom w:type="dxa" w:w="60"/>
-              <w:right w:type="dxa" w:w="100"/>
-            </w:tcMar>
-          </w:tcPr>
-          <w:p>
-            <w:pPr>
-              <w:spacing w:after="0" w:line="276"/>
-            </w:pPr>
-            <w:r>
-              <w:rPr>
-                <w:rFonts w:ascii="Malgun Gothic" w:cs="Malgun Gothic" w:eastAsia="맑은 고딕" w:hAnsi="Malgun Gothic"/>
-                <w:b w:val="false"/>
-                <w:bCs w:val="false"/>
-                <w:sz w:val="18"/>
-                <w:szCs w:val="18"/>
-              </w:rPr>
-              <w:t xml:space="preserve">부분공개 대비</w:t>
-            </w:r>
-          </w:p>
-        </w:tc>
-        <w:tc>
-          <w:tcPr>
-            <w:tcW w:type="dxa" w:w="8851"/>
-            <w:tcBorders>
-              <w:top w:val="single" w:color="BFC6BC" w:sz="4"/>
-              <w:left w:val="single" w:color="BFC6BC" w:sz="4"/>
-              <w:bottom w:val="single" w:color="BFC6BC" w:sz="4"/>
-              <w:right w:val="single" w:color="BFC6BC" w:sz="4"/>
-            </w:tcBorders>
-            <w:tcMar>
-              <w:top w:type="dxa" w:w="60"/>
-              <w:left w:type="dxa" w:w="100"/>
-              <w:bottom w:type="dxa" w:w="60"/>
-              <w:right w:type="dxa" w:w="100"/>
-            </w:tcMar>
-          </w:tcPr>
-          <w:p>
-            <w:pPr>
-              <w:spacing w:after="0" w:line="276"/>
-            </w:pPr>
-            <w:r>
-              <w:rPr>
-                <w:rFonts w:ascii="Malgun Gothic" w:cs="Malgun Gothic" w:eastAsia="맑은 고딕" w:hAnsi="Malgun Gothic"/>
-                <w:b w:val="false"/>
-                <w:bCs w:val="false"/>
-                <w:sz w:val="18"/>
-                <w:szCs w:val="18"/>
-              </w:rPr>
-              <w:t xml:space="preserve">매수자 상호·개인정보 등은 비공개 대상이 될 수 있음(같은 법 제9조 제1항 제6·7호). 연구에 필요 없으므로 </w:t>
-            </w:r>
-            <w:r>
-              <w:rPr>
-                <w:rFonts w:ascii="Malgun Gothic" w:cs="Malgun Gothic" w:eastAsia="맑은 고딕" w:hAnsi="Malgun Gothic"/>
-                <w:b/>
-                <w:bCs/>
-                <w:sz w:val="18"/>
-                <w:szCs w:val="18"/>
-              </w:rPr>
-              <w:t xml:space="preserve">매수자 정보는 제외하고 청구</w:t>
-            </w:r>
-            <w:r>
-              <w:rPr>
-                <w:rFonts w:ascii="Malgun Gothic" w:cs="Malgun Gothic" w:eastAsia="맑은 고딕" w:hAnsi="Malgun Gothic"/>
-                <w:b w:val="false"/>
-                <w:bCs w:val="false"/>
-                <w:sz w:val="18"/>
-                <w:szCs w:val="18"/>
-              </w:rPr>
-              <w:t xml:space="preserve">한다고 명시해 처리를 빠르게 함</w:t>
-            </w:r>
-          </w:p>
-        </w:tc>
-      </w:tr>
-      <w:tr>
-        <w:trPr>
-          <w:tblHeader w:val="false"/>
-        </w:trPr>
-        <w:tc>
-          <w:tcPr>
-            <w:tcW w:type="dxa" w:w="787"/>
-            <w:tcBorders>
-              <w:top w:val="single" w:color="BFC6BC" w:sz="4"/>
-              <w:left w:val="single" w:color="BFC6BC" w:sz="4"/>
-              <w:bottom w:val="single" w:color="BFC6BC" w:sz="4"/>
-              <w:right w:val="single" w:color="BFC6BC" w:sz="4"/>
-            </w:tcBorders>
-            <w:tcMar>
-              <w:top w:type="dxa" w:w="60"/>
-              <w:left w:type="dxa" w:w="100"/>
-              <w:bottom w:type="dxa" w:w="60"/>
-              <w:right w:type="dxa" w:w="100"/>
-            </w:tcMar>
-          </w:tcPr>
-          <w:p>
-            <w:pPr>
-              <w:spacing w:after="0" w:line="276"/>
-            </w:pPr>
-            <w:r>
-              <w:rPr>
-                <w:rFonts w:ascii="Malgun Gothic" w:cs="Malgun Gothic" w:eastAsia="맑은 고딕" w:hAnsi="Malgun Gothic"/>
-                <w:b w:val="false"/>
-                <w:bCs w:val="false"/>
-                <w:sz w:val="18"/>
-                <w:szCs w:val="18"/>
-              </w:rPr>
-              <w:t xml:space="preserve">청구 목적 기재</w:t>
-            </w:r>
-          </w:p>
-        </w:tc>
-        <w:tc>
-          <w:tcPr>
-            <w:tcW w:type="dxa" w:w="8851"/>
-            <w:tcBorders>
-              <w:top w:val="single" w:color="BFC6BC" w:sz="4"/>
-              <w:left w:val="single" w:color="BFC6BC" w:sz="4"/>
-              <w:bottom w:val="single" w:color="BFC6BC" w:sz="4"/>
-              <w:right w:val="single" w:color="BFC6BC" w:sz="4"/>
-            </w:tcBorders>
-            <w:tcMar>
-              <w:top w:type="dxa" w:w="60"/>
-              <w:left w:type="dxa" w:w="100"/>
-              <w:bottom w:type="dxa" w:w="60"/>
-              <w:right w:type="dxa" w:w="100"/>
-            </w:tcMar>
-          </w:tcPr>
-          <w:p>
-            <w:pPr>
-              <w:spacing w:after="0" w:line="276"/>
-            </w:pPr>
-            <w:r>
-              <w:rPr>
-                <w:rFonts w:ascii="Malgun Gothic" w:cs="Malgun Gothic" w:eastAsia="맑은 고딕" w:hAnsi="Malgun Gothic"/>
-                <w:b w:val="false"/>
-                <w:bCs w:val="false"/>
-                <w:sz w:val="18"/>
-                <w:szCs w:val="18"/>
-              </w:rPr>
-              <w:t xml:space="preserve">"기후변화 대응 산림정책 전환 연구의 사례지 선정 및 벌채 후 경과연수별 토사유출·생물다양성 분석"</w:t>
-            </w:r>
-          </w:p>
-        </w:tc>
-      </w:tr>
-    </w:tbl>
-    <w:p>
-      <w:pPr>
-        <w:spacing w:after="60"/>
-      </w:pPr>
-    </w:p>
-    <w:p>
-      <w:pPr>
-        <w:pStyle w:val="Heading3"/>
-      </w:pPr>
-      <w:r>
-        <w:rPr>
-          <w:rFonts w:ascii="Malgun Gothic" w:cs="Malgun Gothic" w:eastAsia="맑은 고딕" w:hAnsi="Malgun Gothic"/>
-          <w:b w:val="false"/>
-          <w:bCs w:val="false"/>
-        </w:rPr>
-        <w:t xml:space="preserve">청구 방식</w:t>
-      </w:r>
-    </w:p>
-    <w:p>
-      <w:pPr>
-        <w:spacing w:after="120"/>
-      </w:pPr>
-      <w:r>
-        <w:rPr>
-          <w:rFonts w:ascii="Malgun Gothic" w:cs="Malgun Gothic" w:eastAsia="맑은 고딕" w:hAnsi="Malgun Gothic"/>
-          <w:b w:val="false"/>
-          <w:bCs w:val="false"/>
-        </w:rPr>
-        <w:t xml:space="preserve">두 지방청에 각각 </w:t>
-      </w:r>
-      <w:r>
-        <w:rPr>
-          <w:rFonts w:ascii="Malgun Gothic" w:cs="Malgun Gothic" w:eastAsia="맑은 고딕" w:hAnsi="Malgun Gothic"/>
-          <w:b/>
-          <w:bCs/>
-        </w:rPr>
-        <w:t xml:space="preserve">1회 일괄 청구</w:t>
-      </w:r>
-      <w:r>
-        <w:rPr>
-          <w:rFonts w:ascii="Malgun Gothic" w:cs="Malgun Gothic" w:eastAsia="맑은 고딕" w:hAnsi="Malgun Gothic"/>
-          <w:b w:val="false"/>
-          <w:bCs w:val="false"/>
-        </w:rPr>
-        <w:t xml:space="preserve">(10월 중순)함. 소반별 상세 자료는 주벌 실적이 있는 소반으로 한정하고, 시스템에 없는 항목은 부존재 처리 후 나머지를 제공해 달라고 명시함. 세부 요청 사양은 별도 「정보공개 청구 계획(안)」에 산림경영계획서 기재요령 항목명으로 정리함.</w:t>
-      </w:r>
-    </w:p>
-    <w:p>
-      <w:pPr>
-        <w:pStyle w:val="Heading3"/>
-      </w:pPr>
-      <w:r>
-        <w:rPr>
-          <w:rFonts w:ascii="Malgun Gothic" w:cs="Malgun Gothic" w:eastAsia="맑은 고딕" w:hAnsi="Malgun Gothic"/>
-          <w:b w:val="false"/>
-          <w:bCs w:val="false"/>
-        </w:rPr>
-        <w:t xml:space="preserve">청구 내용 문안(안)</w:t>
-      </w:r>
-    </w:p>
-    <w:p>
-      <w:pPr>
-        <w:shd w:fill="F1F3EE" w:color="auto" w:val="clear"/>
-        <w:spacing w:after="0" w:before="0"/>
-        <w:ind w:left="170" w:right="170"/>
-        <w:jc w:val="left"/>
-      </w:pPr>
-      <w:r>
-        <w:rPr>
-          <w:rFonts w:ascii="Malgun Gothic" w:cs="Malgun Gothic" w:eastAsia="맑은 고딕" w:hAnsi="Malgun Gothic"/>
-          <w:b w:val="false"/>
-          <w:bCs w:val="false"/>
-        </w:rPr>
-        <w:t xml:space="preserve">1. 귀 기관 산하 국유림관리소별 연도별 목재매각(수확벌채) 실적: 관리소, 연도, 임반·소반, 벌채 종류, 벌채 면적, 수종, 입목재적·생산재적 (보유 기간 전체, 엑셀)</w:t>
-      </w:r>
-    </w:p>
-    <w:p>
-      <w:pPr>
-        <w:shd w:fill="F1F3EE" w:color="auto" w:val="clear"/>
-        <w:spacing w:after="0" w:before="0"/>
-        <w:ind w:left="170" w:right="170"/>
-        <w:jc w:val="left"/>
-      </w:pPr>
-      <w:r>
-        <w:rPr>
-          <w:rFonts w:ascii="Malgun Gothic" w:cs="Malgun Gothic" w:eastAsia="맑은 고딕" w:hAnsi="Malgun Gothic"/>
-          <w:b w:val="false"/>
-          <w:bCs w:val="false"/>
-        </w:rPr>
-        <w:t xml:space="preserve">2. 위 벌채지의 집재 방법(사용 장비·집재 방식)과 집재로·작업로 개설 여부 및 연장</w:t>
-      </w:r>
-    </w:p>
-    <w:p>
-      <w:pPr>
-        <w:shd w:fill="F1F3EE" w:color="auto" w:val="clear"/>
-        <w:spacing w:after="0" w:before="0"/>
-        <w:ind w:left="170" w:right="170"/>
-        <w:jc w:val="left"/>
-      </w:pPr>
-      <w:r>
-        <w:rPr>
-          <w:rFonts w:ascii="Malgun Gothic" w:cs="Malgun Gothic" w:eastAsia="맑은 고딕" w:hAnsi="Malgun Gothic"/>
-          <w:b w:val="false"/>
-          <w:bCs w:val="false"/>
-        </w:rPr>
-        <w:t xml:space="preserve">3. 주벌 실적이 있는 소반의 산림경영계획 자료: 입지(경사·방위·토양), 임상, 영급, 우점 수종, 조림·숲가꾸기 이력</w:t>
-      </w:r>
-    </w:p>
-    <w:p>
-      <w:pPr>
-        <w:shd w:fill="F1F3EE" w:color="auto" w:val="clear"/>
-        <w:spacing w:after="0" w:before="0"/>
-        <w:ind w:left="170" w:right="170"/>
-        <w:jc w:val="left"/>
-      </w:pPr>
-      <w:r>
-        <w:rPr>
-          <w:rFonts w:ascii="Malgun Gothic" w:cs="Malgun Gothic" w:eastAsia="맑은 고딕" w:hAnsi="Malgun Gothic"/>
-          <w:b w:val="false"/>
-          <w:bCs w:val="false"/>
-        </w:rPr>
-        <w:t xml:space="preserve">4. 산하 관리소 관할 임도 노선(SHP) 및 개설 연도·연장·폭</w:t>
-      </w:r>
-    </w:p>
-    <w:p>
-      <w:pPr>
-        <w:shd w:fill="F1F3EE" w:color="auto" w:val="clear"/>
-        <w:spacing w:after="0" w:before="0"/>
-        <w:ind w:left="170" w:right="170"/>
-        <w:jc w:val="left"/>
-      </w:pPr>
-      <w:r>
-        <w:rPr>
-          <w:rFonts w:ascii="Malgun Gothic" w:cs="Malgun Gothic" w:eastAsia="맑은 고딕" w:hAnsi="Malgun Gothic"/>
-          <w:b w:val="false"/>
-          <w:bCs w:val="false"/>
-        </w:rPr>
-        <w:t xml:space="preserve">5. 산하 관리소 관할 산사태 발생·산지사방사업 시행 이력, 산불·병해충 피해 이력</w:t>
-      </w:r>
-    </w:p>
-    <w:p>
-      <w:pPr>
-        <w:shd w:fill="F1F3EE" w:color="auto" w:val="clear"/>
-        <w:spacing w:after="0" w:before="0"/>
-        <w:ind w:left="170" w:right="170"/>
-        <w:jc w:val="left"/>
-      </w:pPr>
-      <w:r>
-        <w:rPr>
-          <w:rFonts w:ascii="Malgun Gothic" w:cs="Malgun Gothic" w:eastAsia="맑은 고딕" w:hAnsi="Malgun Gothic"/>
-          <w:b w:val="false"/>
-          <w:bCs w:val="false"/>
-        </w:rPr>
-        <w:t xml:space="preserve">※ 매수자 상호, 계약 금액, 개인정보는 청구 대상에서 제외함.</w:t>
-      </w:r>
-    </w:p>
-    <w:p>
-      <w:pPr>
-        <w:pStyle w:val="Heading2"/>
-      </w:pPr>
-      <w:r>
-        <w:rPr>
-          <w:rFonts w:ascii="Malgun Gothic" w:cs="Malgun Gothic" w:eastAsia="맑은 고딕" w:hAnsi="Malgun Gothic"/>
-          <w:b w:val="false"/>
-          <w:bCs w:val="false"/>
-        </w:rPr>
-        <w:t xml:space="preserve">5.4 청구 항목별 활용</w:t>
-      </w:r>
-    </w:p>
-    <w:tbl>
-      <w:tblPr>
-        <w:tblW w:type="dxa" w:w="9638"/>
-        <w:tblBorders>
-          <w:top w:val="single" w:color="auto" w:sz="4"/>
-          <w:left w:val="single" w:color="auto" w:sz="4"/>
-          <w:bottom w:val="single" w:color="auto" w:sz="4"/>
-          <w:right w:val="single" w:color="auto" w:sz="4"/>
-          <w:insideH w:val="single" w:color="auto" w:sz="4"/>
-          <w:insideV w:val="single" w:color="auto" w:sz="4"/>
-        </w:tblBorders>
-      </w:tblPr>
-      <w:tblGrid>
-        <w:gridCol w:w="1134"/>
-        <w:gridCol w:w="5102"/>
-        <w:gridCol w:w="3402"/>
-      </w:tblGrid>
-      <w:tr>
-        <w:trPr>
-          <w:tblHeader/>
-        </w:trPr>
-        <w:tc>
-          <w:tcPr>
-            <w:tcW w:type="dxa" w:w="1134"/>
-            <w:tcBorders>
-              <w:top w:val="single" w:color="BFC6BC" w:sz="4"/>
-              <w:left w:val="single" w:color="BFC6BC" w:sz="4"/>
-              <w:bottom w:val="single" w:color="BFC6BC" w:sz="4"/>
-              <w:right w:val="single" w:color="BFC6BC" w:sz="4"/>
-            </w:tcBorders>
-            <w:shd w:fill="E4EDE6" w:color="auto" w:val="clear"/>
-            <w:tcMar>
-              <w:top w:type="dxa" w:w="60"/>
-              <w:left w:type="dxa" w:w="100"/>
-              <w:bottom w:type="dxa" w:w="60"/>
-              <w:right w:type="dxa" w:w="100"/>
-            </w:tcMar>
-          </w:tcPr>
-          <w:p>
-            <w:pPr>
-              <w:spacing w:after="0" w:line="276"/>
-            </w:pPr>
-            <w:r>
-              <w:rPr>
-                <w:rFonts w:ascii="Malgun Gothic" w:cs="Malgun Gothic" w:eastAsia="맑은 고딕" w:hAnsi="Malgun Gothic"/>
-                <w:b/>
-                <w:bCs/>
-                <w:sz w:val="18"/>
-                <w:szCs w:val="18"/>
-              </w:rPr>
-              <w:t xml:space="preserve">항목</w:t>
-            </w:r>
-          </w:p>
-        </w:tc>
-        <w:tc>
-          <w:tcPr>
-            <w:tcW w:type="dxa" w:w="5102"/>
-            <w:tcBorders>
-              <w:top w:val="single" w:color="BFC6BC" w:sz="4"/>
-              <w:left w:val="single" w:color="BFC6BC" w:sz="4"/>
-              <w:bottom w:val="single" w:color="BFC6BC" w:sz="4"/>
-              <w:right w:val="single" w:color="BFC6BC" w:sz="4"/>
-            </w:tcBorders>
-            <w:shd w:fill="E4EDE6" w:color="auto" w:val="clear"/>
-            <w:tcMar>
-              <w:top w:type="dxa" w:w="60"/>
-              <w:left w:type="dxa" w:w="100"/>
-              <w:bottom w:type="dxa" w:w="60"/>
-              <w:right w:type="dxa" w:w="100"/>
-            </w:tcMar>
-          </w:tcPr>
-          <w:p>
-            <w:pPr>
-              <w:spacing w:after="0" w:line="276"/>
-            </w:pPr>
-            <w:r>
-              <w:rPr>
-                <w:rFonts w:ascii="Malgun Gothic" w:cs="Malgun Gothic" w:eastAsia="맑은 고딕" w:hAnsi="Malgun Gothic"/>
-                <w:b/>
-                <w:bCs/>
-                <w:sz w:val="18"/>
-                <w:szCs w:val="18"/>
-              </w:rPr>
-              <w:t xml:space="preserve">세부 내용</w:t>
-            </w:r>
-          </w:p>
-        </w:tc>
-        <w:tc>
-          <w:tcPr>
-            <w:tcW w:type="dxa" w:w="3402"/>
-            <w:tcBorders>
-              <w:top w:val="single" w:color="BFC6BC" w:sz="4"/>
-              <w:left w:val="single" w:color="BFC6BC" w:sz="4"/>
-              <w:bottom w:val="single" w:color="BFC6BC" w:sz="4"/>
-              <w:right w:val="single" w:color="BFC6BC" w:sz="4"/>
-            </w:tcBorders>
-            <w:shd w:fill="E4EDE6" w:color="auto" w:val="clear"/>
-            <w:tcMar>
-              <w:top w:type="dxa" w:w="60"/>
-              <w:left w:type="dxa" w:w="100"/>
-              <w:bottom w:type="dxa" w:w="60"/>
-              <w:right w:type="dxa" w:w="100"/>
-            </w:tcMar>
-          </w:tcPr>
-          <w:p>
-            <w:pPr>
-              <w:spacing w:after="0" w:line="276"/>
-            </w:pPr>
-            <w:r>
-              <w:rPr>
-                <w:rFonts w:ascii="Malgun Gothic" w:cs="Malgun Gothic" w:eastAsia="맑은 고딕" w:hAnsi="Malgun Gothic"/>
-                <w:b/>
-                <w:bCs/>
-                <w:sz w:val="18"/>
-                <w:szCs w:val="18"/>
-              </w:rPr>
-              <w:t xml:space="preserve">활용</w:t>
-            </w:r>
-          </w:p>
-        </w:tc>
-      </w:tr>
-      <w:tr>
-        <w:trPr>
-          <w:tblHeader w:val="false"/>
-        </w:trPr>
-        <w:tc>
-          <w:tcPr>
-            <w:tcW w:type="dxa" w:w="1134"/>
-            <w:tcBorders>
-              <w:top w:val="single" w:color="BFC6BC" w:sz="4"/>
-              <w:left w:val="single" w:color="BFC6BC" w:sz="4"/>
-              <w:bottom w:val="single" w:color="BFC6BC" w:sz="4"/>
-              <w:right w:val="single" w:color="BFC6BC" w:sz="4"/>
-            </w:tcBorders>
-            <w:tcMar>
-              <w:top w:type="dxa" w:w="60"/>
-              <w:left w:type="dxa" w:w="100"/>
-              <w:bottom w:type="dxa" w:w="60"/>
-              <w:right w:type="dxa" w:w="100"/>
-            </w:tcMar>
-          </w:tcPr>
-          <w:p>
-            <w:pPr>
-              <w:spacing w:after="0" w:line="276"/>
-            </w:pPr>
-            <w:r>
-              <w:rPr>
-                <w:rFonts w:ascii="Malgun Gothic" w:cs="Malgun Gothic" w:eastAsia="맑은 고딕" w:hAnsi="Malgun Gothic"/>
-                <w:b w:val="false"/>
-                <w:bCs w:val="false"/>
-                <w:sz w:val="18"/>
-                <w:szCs w:val="18"/>
-              </w:rPr>
-              <w:t xml:space="preserve">벌채 이력</w:t>
-            </w:r>
-          </w:p>
-        </w:tc>
-        <w:tc>
-          <w:tcPr>
-            <w:tcW w:type="dxa" w:w="5102"/>
-            <w:tcBorders>
-              <w:top w:val="single" w:color="BFC6BC" w:sz="4"/>
-              <w:left w:val="single" w:color="BFC6BC" w:sz="4"/>
-              <w:bottom w:val="single" w:color="BFC6BC" w:sz="4"/>
-              <w:right w:val="single" w:color="BFC6BC" w:sz="4"/>
-            </w:tcBorders>
-            <w:tcMar>
-              <w:top w:type="dxa" w:w="60"/>
-              <w:left w:type="dxa" w:w="100"/>
-              <w:bottom w:type="dxa" w:w="60"/>
-              <w:right w:type="dxa" w:w="100"/>
-            </w:tcMar>
-          </w:tcPr>
-          <w:p>
-            <w:pPr>
-              <w:spacing w:after="0" w:line="276"/>
-            </w:pPr>
-            <w:r>
-              <w:rPr>
-                <w:rFonts w:ascii="Malgun Gothic" w:cs="Malgun Gothic" w:eastAsia="맑은 고딕" w:hAnsi="Malgun Gothic"/>
-                <w:b w:val="false"/>
-                <w:bCs w:val="false"/>
-                <w:sz w:val="18"/>
-                <w:szCs w:val="18"/>
-              </w:rPr>
-              <w:t xml:space="preserve">임반·소반별 벌채 연도, 면적, 벌채 종류, 수종</w:t>
-            </w:r>
-          </w:p>
-        </w:tc>
-        <w:tc>
-          <w:tcPr>
-            <w:tcW w:type="dxa" w:w="3402"/>
-            <w:tcBorders>
-              <w:top w:val="single" w:color="BFC6BC" w:sz="4"/>
-              <w:left w:val="single" w:color="BFC6BC" w:sz="4"/>
-              <w:bottom w:val="single" w:color="BFC6BC" w:sz="4"/>
-              <w:right w:val="single" w:color="BFC6BC" w:sz="4"/>
-            </w:tcBorders>
-            <w:tcMar>
-              <w:top w:type="dxa" w:w="60"/>
-              <w:left w:type="dxa" w:w="100"/>
-              <w:bottom w:type="dxa" w:w="60"/>
-              <w:right w:type="dxa" w:w="100"/>
-            </w:tcMar>
-          </w:tcPr>
-          <w:p>
-            <w:pPr>
-              <w:spacing w:after="0" w:line="276"/>
-            </w:pPr>
-            <w:r>
-              <w:rPr>
-                <w:rFonts w:ascii="Malgun Gothic" w:cs="Malgun Gothic" w:eastAsia="맑은 고딕" w:hAnsi="Malgun Gothic"/>
-                <w:b w:val="false"/>
-                <w:bCs w:val="false"/>
-                <w:sz w:val="18"/>
-                <w:szCs w:val="18"/>
-              </w:rPr>
-              <w:t xml:space="preserve">경과연수별 표본 선정</w:t>
-            </w:r>
-          </w:p>
-        </w:tc>
-      </w:tr>
-      <w:tr>
-        <w:trPr>
-          <w:tblHeader w:val="false"/>
-        </w:trPr>
-        <w:tc>
-          <w:tcPr>
-            <w:tcW w:type="dxa" w:w="1134"/>
-            <w:tcBorders>
-              <w:top w:val="single" w:color="BFC6BC" w:sz="4"/>
-              <w:left w:val="single" w:color="BFC6BC" w:sz="4"/>
-              <w:bottom w:val="single" w:color="BFC6BC" w:sz="4"/>
-              <w:right w:val="single" w:color="BFC6BC" w:sz="4"/>
-            </w:tcBorders>
-            <w:tcMar>
-              <w:top w:type="dxa" w:w="60"/>
-              <w:left w:type="dxa" w:w="100"/>
-              <w:bottom w:type="dxa" w:w="60"/>
-              <w:right w:type="dxa" w:w="100"/>
-            </w:tcMar>
-          </w:tcPr>
-          <w:p>
-            <w:pPr>
-              <w:spacing w:after="0" w:line="276"/>
-            </w:pPr>
-            <w:r>
-              <w:rPr>
-                <w:rFonts w:ascii="Malgun Gothic" w:cs="Malgun Gothic" w:eastAsia="맑은 고딕" w:hAnsi="Malgun Gothic"/>
-                <w:b w:val="false"/>
-                <w:bCs w:val="false"/>
-                <w:sz w:val="18"/>
-                <w:szCs w:val="18"/>
-              </w:rPr>
-              <w:t xml:space="preserve">집재 방법</w:t>
-            </w:r>
-          </w:p>
-        </w:tc>
-        <w:tc>
-          <w:tcPr>
-            <w:tcW w:type="dxa" w:w="5102"/>
-            <w:tcBorders>
-              <w:top w:val="single" w:color="BFC6BC" w:sz="4"/>
-              <w:left w:val="single" w:color="BFC6BC" w:sz="4"/>
-              <w:bottom w:val="single" w:color="BFC6BC" w:sz="4"/>
-              <w:right w:val="single" w:color="BFC6BC" w:sz="4"/>
-            </w:tcBorders>
-            <w:tcMar>
-              <w:top w:type="dxa" w:w="60"/>
-              <w:left w:type="dxa" w:w="100"/>
-              <w:bottom w:type="dxa" w:w="60"/>
-              <w:right w:type="dxa" w:w="100"/>
-            </w:tcMar>
-          </w:tcPr>
-          <w:p>
-            <w:pPr>
-              <w:spacing w:after="0" w:line="276"/>
-            </w:pPr>
-            <w:r>
-              <w:rPr>
-                <w:rFonts w:ascii="Malgun Gothic" w:cs="Malgun Gothic" w:eastAsia="맑은 고딕" w:hAnsi="Malgun Gothic"/>
-                <w:b w:val="false"/>
-                <w:bCs w:val="false"/>
-                <w:sz w:val="18"/>
-                <w:szCs w:val="18"/>
-              </w:rPr>
-              <w:t xml:space="preserve">집재 장비·방식(우드그랩 여부), 집재로 개설 여부</w:t>
-            </w:r>
-          </w:p>
-        </w:tc>
-        <w:tc>
-          <w:tcPr>
-            <w:tcW w:type="dxa" w:w="3402"/>
-            <w:tcBorders>
-              <w:top w:val="single" w:color="BFC6BC" w:sz="4"/>
-              <w:left w:val="single" w:color="BFC6BC" w:sz="4"/>
-              <w:bottom w:val="single" w:color="BFC6BC" w:sz="4"/>
-              <w:right w:val="single" w:color="BFC6BC" w:sz="4"/>
-            </w:tcBorders>
-            <w:tcMar>
-              <w:top w:type="dxa" w:w="60"/>
-              <w:left w:type="dxa" w:w="100"/>
-              <w:bottom w:type="dxa" w:w="60"/>
-              <w:right w:type="dxa" w:w="100"/>
-            </w:tcMar>
-          </w:tcPr>
-          <w:p>
-            <w:pPr>
-              <w:spacing w:after="0" w:line="276"/>
-            </w:pPr>
-            <w:r>
-              <w:rPr>
-                <w:rFonts w:ascii="Malgun Gothic" w:cs="Malgun Gothic" w:eastAsia="맑은 고딕" w:hAnsi="Malgun Gothic"/>
-                <w:b w:val="false"/>
-                <w:bCs w:val="false"/>
-                <w:sz w:val="18"/>
-                <w:szCs w:val="18"/>
-              </w:rPr>
-              <w:t xml:space="preserve">자문 반영, WEPP 입력·문헌값 선택</w:t>
-            </w:r>
-          </w:p>
-        </w:tc>
-      </w:tr>
-      <w:tr>
-        <w:trPr>
-          <w:tblHeader w:val="false"/>
-        </w:trPr>
-        <w:tc>
-          <w:tcPr>
-            <w:tcW w:type="dxa" w:w="1134"/>
-            <w:tcBorders>
-              <w:top w:val="single" w:color="BFC6BC" w:sz="4"/>
-              <w:left w:val="single" w:color="BFC6BC" w:sz="4"/>
-              <w:bottom w:val="single" w:color="BFC6BC" w:sz="4"/>
-              <w:right w:val="single" w:color="BFC6BC" w:sz="4"/>
-            </w:tcBorders>
-            <w:tcMar>
-              <w:top w:type="dxa" w:w="60"/>
-              <w:left w:type="dxa" w:w="100"/>
-              <w:bottom w:type="dxa" w:w="60"/>
-              <w:right w:type="dxa" w:w="100"/>
-            </w:tcMar>
-          </w:tcPr>
-          <w:p>
-            <w:pPr>
-              <w:spacing w:after="0" w:line="276"/>
-            </w:pPr>
-            <w:r>
-              <w:rPr>
-                <w:rFonts w:ascii="Malgun Gothic" w:cs="Malgun Gothic" w:eastAsia="맑은 고딕" w:hAnsi="Malgun Gothic"/>
-                <w:b w:val="false"/>
-                <w:bCs w:val="false"/>
-                <w:sz w:val="18"/>
-                <w:szCs w:val="18"/>
-              </w:rPr>
-              <w:t xml:space="preserve">임도</w:t>
-            </w:r>
-          </w:p>
-        </w:tc>
-        <w:tc>
-          <w:tcPr>
-            <w:tcW w:type="dxa" w:w="5102"/>
-            <w:tcBorders>
-              <w:top w:val="single" w:color="BFC6BC" w:sz="4"/>
-              <w:left w:val="single" w:color="BFC6BC" w:sz="4"/>
-              <w:bottom w:val="single" w:color="BFC6BC" w:sz="4"/>
-              <w:right w:val="single" w:color="BFC6BC" w:sz="4"/>
-            </w:tcBorders>
-            <w:tcMar>
-              <w:top w:type="dxa" w:w="60"/>
-              <w:left w:type="dxa" w:w="100"/>
-              <w:bottom w:type="dxa" w:w="60"/>
-              <w:right w:type="dxa" w:w="100"/>
-            </w:tcMar>
-          </w:tcPr>
-          <w:p>
-            <w:pPr>
-              <w:spacing w:after="0" w:line="276"/>
-            </w:pPr>
-            <w:r>
-              <w:rPr>
-                <w:rFonts w:ascii="Malgun Gothic" w:cs="Malgun Gothic" w:eastAsia="맑은 고딕" w:hAnsi="Malgun Gothic"/>
-                <w:b w:val="false"/>
-                <w:bCs w:val="false"/>
-                <w:sz w:val="18"/>
-                <w:szCs w:val="18"/>
-              </w:rPr>
-              <w:t xml:space="preserve">임도 노선, 개설 연도, 연장·폭</w:t>
-            </w:r>
-          </w:p>
-        </w:tc>
-        <w:tc>
-          <w:tcPr>
-            <w:tcW w:type="dxa" w:w="3402"/>
-            <w:tcBorders>
-              <w:top w:val="single" w:color="BFC6BC" w:sz="4"/>
-              <w:left w:val="single" w:color="BFC6BC" w:sz="4"/>
-              <w:bottom w:val="single" w:color="BFC6BC" w:sz="4"/>
-              <w:right w:val="single" w:color="BFC6BC" w:sz="4"/>
-            </w:tcBorders>
-            <w:tcMar>
-              <w:top w:type="dxa" w:w="60"/>
-              <w:left w:type="dxa" w:w="100"/>
-              <w:bottom w:type="dxa" w:w="60"/>
-              <w:right w:type="dxa" w:w="100"/>
-            </w:tcMar>
-          </w:tcPr>
-          <w:p>
-            <w:pPr>
-              <w:spacing w:after="0" w:line="276"/>
-            </w:pPr>
-            <w:r>
-              <w:rPr>
-                <w:rFonts w:ascii="Malgun Gothic" w:cs="Malgun Gothic" w:eastAsia="맑은 고딕" w:hAnsi="Malgun Gothic"/>
-                <w:b w:val="false"/>
-                <w:bCs w:val="false"/>
-                <w:sz w:val="18"/>
-                <w:szCs w:val="18"/>
-              </w:rPr>
-              <w:t xml:space="preserve">WEPP:Road 입력, 생물다양성 공간분석</w:t>
-            </w:r>
-          </w:p>
-        </w:tc>
-      </w:tr>
-      <w:tr>
-        <w:trPr>
-          <w:tblHeader w:val="false"/>
-        </w:trPr>
-        <w:tc>
-          <w:tcPr>
-            <w:tcW w:type="dxa" w:w="1134"/>
-            <w:tcBorders>
-              <w:top w:val="single" w:color="BFC6BC" w:sz="4"/>
-              <w:left w:val="single" w:color="BFC6BC" w:sz="4"/>
-              <w:bottom w:val="single" w:color="BFC6BC" w:sz="4"/>
-              <w:right w:val="single" w:color="BFC6BC" w:sz="4"/>
-            </w:tcBorders>
-            <w:tcMar>
-              <w:top w:type="dxa" w:w="60"/>
-              <w:left w:type="dxa" w:w="100"/>
-              <w:bottom w:type="dxa" w:w="60"/>
-              <w:right w:type="dxa" w:w="100"/>
-            </w:tcMar>
-          </w:tcPr>
-          <w:p>
-            <w:pPr>
-              <w:spacing w:after="0" w:line="276"/>
-            </w:pPr>
-            <w:r>
-              <w:rPr>
-                <w:rFonts w:ascii="Malgun Gothic" w:cs="Malgun Gothic" w:eastAsia="맑은 고딕" w:hAnsi="Malgun Gothic"/>
-                <w:b w:val="false"/>
-                <w:bCs w:val="false"/>
-                <w:sz w:val="18"/>
-                <w:szCs w:val="18"/>
-              </w:rPr>
-              <w:t xml:space="preserve">산림경영계획서</w:t>
-            </w:r>
-          </w:p>
-        </w:tc>
-        <w:tc>
-          <w:tcPr>
-            <w:tcW w:type="dxa" w:w="5102"/>
-            <w:tcBorders>
-              <w:top w:val="single" w:color="BFC6BC" w:sz="4"/>
-              <w:left w:val="single" w:color="BFC6BC" w:sz="4"/>
-              <w:bottom w:val="single" w:color="BFC6BC" w:sz="4"/>
-              <w:right w:val="single" w:color="BFC6BC" w:sz="4"/>
-            </w:tcBorders>
-            <w:tcMar>
-              <w:top w:type="dxa" w:w="60"/>
-              <w:left w:type="dxa" w:w="100"/>
-              <w:bottom w:type="dxa" w:w="60"/>
-              <w:right w:type="dxa" w:w="100"/>
-            </w:tcMar>
-          </w:tcPr>
-          <w:p>
-            <w:pPr>
-              <w:spacing w:after="0" w:line="276"/>
-            </w:pPr>
-            <w:r>
-              <w:rPr>
-                <w:rFonts w:ascii="Malgun Gothic" w:cs="Malgun Gothic" w:eastAsia="맑은 고딕" w:hAnsi="Malgun Gothic"/>
-                <w:b w:val="false"/>
-                <w:bCs w:val="false"/>
-                <w:sz w:val="18"/>
-                <w:szCs w:val="18"/>
-              </w:rPr>
-              <w:t xml:space="preserve">소반별 입지(경사·방위·토양), 임상, 영급, 조림·숲가꾸기 이력</w:t>
-            </w:r>
-          </w:p>
-        </w:tc>
-        <w:tc>
-          <w:tcPr>
-            <w:tcW w:type="dxa" w:w="3402"/>
-            <w:tcBorders>
-              <w:top w:val="single" w:color="BFC6BC" w:sz="4"/>
-              <w:left w:val="single" w:color="BFC6BC" w:sz="4"/>
-              <w:bottom w:val="single" w:color="BFC6BC" w:sz="4"/>
-              <w:right w:val="single" w:color="BFC6BC" w:sz="4"/>
-            </w:tcBorders>
-            <w:tcMar>
-              <w:top w:type="dxa" w:w="60"/>
-              <w:left w:type="dxa" w:w="100"/>
-              <w:bottom w:type="dxa" w:w="60"/>
-              <w:right w:type="dxa" w:w="100"/>
-            </w:tcMar>
-          </w:tcPr>
-          <w:p>
-            <w:pPr>
-              <w:spacing w:after="0" w:line="276"/>
-            </w:pPr>
-            <w:r>
-              <w:rPr>
-                <w:rFonts w:ascii="Malgun Gothic" w:cs="Malgun Gothic" w:eastAsia="맑은 고딕" w:hAnsi="Malgun Gothic"/>
-                <w:b w:val="false"/>
-                <w:bCs w:val="false"/>
-                <w:sz w:val="18"/>
-                <w:szCs w:val="18"/>
-              </w:rPr>
-              <w:t xml:space="preserve">사례지 설명, 벌채 전 임상 변수</w:t>
-            </w:r>
-          </w:p>
-        </w:tc>
-      </w:tr>
-      <w:tr>
-        <w:trPr>
-          <w:tblHeader w:val="false"/>
-        </w:trPr>
-        <w:tc>
-          <w:tcPr>
-            <w:tcW w:type="dxa" w:w="1134"/>
-            <w:tcBorders>
-              <w:top w:val="single" w:color="BFC6BC" w:sz="4"/>
-              <w:left w:val="single" w:color="BFC6BC" w:sz="4"/>
-              <w:bottom w:val="single" w:color="BFC6BC" w:sz="4"/>
-              <w:right w:val="single" w:color="BFC6BC" w:sz="4"/>
-            </w:tcBorders>
-            <w:tcMar>
-              <w:top w:type="dxa" w:w="60"/>
-              <w:left w:type="dxa" w:w="100"/>
-              <w:bottom w:type="dxa" w:w="60"/>
-              <w:right w:type="dxa" w:w="100"/>
-            </w:tcMar>
-          </w:tcPr>
-          <w:p>
-            <w:pPr>
-              <w:spacing w:after="0" w:line="276"/>
-            </w:pPr>
-            <w:r>
-              <w:rPr>
-                <w:rFonts w:ascii="Malgun Gothic" w:cs="Malgun Gothic" w:eastAsia="맑은 고딕" w:hAnsi="Malgun Gothic"/>
-                <w:b w:val="false"/>
-                <w:bCs w:val="false"/>
-                <w:sz w:val="18"/>
-                <w:szCs w:val="18"/>
-              </w:rPr>
-              <w:t xml:space="preserve">교란 이력</w:t>
-            </w:r>
-          </w:p>
-        </w:tc>
-        <w:tc>
-          <w:tcPr>
-            <w:tcW w:type="dxa" w:w="5102"/>
-            <w:tcBorders>
-              <w:top w:val="single" w:color="BFC6BC" w:sz="4"/>
-              <w:left w:val="single" w:color="BFC6BC" w:sz="4"/>
-              <w:bottom w:val="single" w:color="BFC6BC" w:sz="4"/>
-              <w:right w:val="single" w:color="BFC6BC" w:sz="4"/>
-            </w:tcBorders>
-            <w:tcMar>
-              <w:top w:type="dxa" w:w="60"/>
-              <w:left w:type="dxa" w:w="100"/>
-              <w:bottom w:type="dxa" w:w="60"/>
-              <w:right w:type="dxa" w:w="100"/>
-            </w:tcMar>
-          </w:tcPr>
-          <w:p>
-            <w:pPr>
-              <w:spacing w:after="0" w:line="276"/>
-            </w:pPr>
-            <w:r>
-              <w:rPr>
-                <w:rFonts w:ascii="Malgun Gothic" w:cs="Malgun Gothic" w:eastAsia="맑은 고딕" w:hAnsi="Malgun Gothic"/>
-                <w:b w:val="false"/>
-                <w:bCs w:val="false"/>
-                <w:sz w:val="18"/>
-                <w:szCs w:val="18"/>
-              </w:rPr>
-              <w:t xml:space="preserve">산불·병해충 피해 이력</w:t>
-            </w:r>
-          </w:p>
-        </w:tc>
-        <w:tc>
-          <w:tcPr>
-            <w:tcW w:type="dxa" w:w="3402"/>
-            <w:tcBorders>
-              <w:top w:val="single" w:color="BFC6BC" w:sz="4"/>
-              <w:left w:val="single" w:color="BFC6BC" w:sz="4"/>
-              <w:bottom w:val="single" w:color="BFC6BC" w:sz="4"/>
-              <w:right w:val="single" w:color="BFC6BC" w:sz="4"/>
-            </w:tcBorders>
-            <w:tcMar>
-              <w:top w:type="dxa" w:w="60"/>
-              <w:left w:type="dxa" w:w="100"/>
-              <w:bottom w:type="dxa" w:w="60"/>
-              <w:right w:type="dxa" w:w="100"/>
-            </w:tcMar>
-          </w:tcPr>
-          <w:p>
-            <w:pPr>
-              <w:spacing w:after="0" w:line="276"/>
-            </w:pPr>
-            <w:r>
-              <w:rPr>
-                <w:rFonts w:ascii="Malgun Gothic" w:cs="Malgun Gothic" w:eastAsia="맑은 고딕" w:hAnsi="Malgun Gothic"/>
-                <w:b w:val="false"/>
-                <w:bCs w:val="false"/>
-                <w:sz w:val="18"/>
-                <w:szCs w:val="18"/>
-              </w:rPr>
-              <w:t xml:space="preserve">교란 요인 분리</w:t>
+            <w:tcW w:type="dxa" w:w="1081"/>
+            <w:tcBorders>
+              <w:top w:val="single" w:color="BFC6BC" w:sz="4"/>
+              <w:left w:val="single" w:color="BFC6BC" w:sz="4"/>
+              <w:bottom w:val="single" w:color="BFC6BC" w:sz="4"/>
+              <w:right w:val="single" w:color="BFC6BC" w:sz="4"/>
+            </w:tcBorders>
+            <w:tcMar>
+              <w:top w:type="dxa" w:w="60"/>
+              <w:left w:type="dxa" w:w="100"/>
+              <w:bottom w:type="dxa" w:w="60"/>
+              <w:right w:type="dxa" w:w="100"/>
+            </w:tcMar>
+          </w:tcPr>
+          <w:p>
+            <w:pPr>
+              <w:spacing w:after="0" w:line="276"/>
+            </w:pPr>
+            <w:r>
+              <w:rPr>
+                <w:rFonts w:ascii="Malgun Gothic" w:cs="Malgun Gothic" w:eastAsia="맑은 고딕" w:hAnsi="Malgun Gothic"/>
+                <w:b w:val="false"/>
+                <w:bCs w:val="false"/>
+                <w:sz w:val="18"/>
+                <w:szCs w:val="18"/>
+              </w:rPr>
+              <w:t xml:space="preserve">5. 재해·복구 이력</w:t>
+            </w:r>
+          </w:p>
+        </w:tc>
+        <w:tc>
+          <w:tcPr>
+            <w:tcW w:type="dxa" w:w="6035"/>
+            <w:tcBorders>
+              <w:top w:val="single" w:color="BFC6BC" w:sz="4"/>
+              <w:left w:val="single" w:color="BFC6BC" w:sz="4"/>
+              <w:bottom w:val="single" w:color="BFC6BC" w:sz="4"/>
+              <w:right w:val="single" w:color="BFC6BC" w:sz="4"/>
+            </w:tcBorders>
+            <w:tcMar>
+              <w:top w:type="dxa" w:w="60"/>
+              <w:left w:type="dxa" w:w="100"/>
+              <w:bottom w:type="dxa" w:w="60"/>
+              <w:right w:type="dxa" w:w="100"/>
+            </w:tcMar>
+          </w:tcPr>
+          <w:p>
+            <w:pPr>
+              <w:spacing w:after="0" w:line="276"/>
+            </w:pPr>
+            <w:r>
+              <w:rPr>
+                <w:rFonts w:ascii="Malgun Gothic" w:cs="Malgun Gothic" w:eastAsia="맑은 고딕" w:hAnsi="Malgun Gothic"/>
+                <w:b w:val="false"/>
+                <w:bCs w:val="false"/>
+                <w:sz w:val="18"/>
+                <w:szCs w:val="18"/>
+              </w:rPr>
+              <w:t xml:space="preserve">산사태 발생, 산지사방사업 시행, 산불·병해충 피해 이력</w:t>
+            </w:r>
+          </w:p>
+        </w:tc>
+        <w:tc>
+          <w:tcPr>
+            <w:tcW w:type="dxa" w:w="2522"/>
+            <w:tcBorders>
+              <w:top w:val="single" w:color="BFC6BC" w:sz="4"/>
+              <w:left w:val="single" w:color="BFC6BC" w:sz="4"/>
+              <w:bottom w:val="single" w:color="BFC6BC" w:sz="4"/>
+              <w:right w:val="single" w:color="BFC6BC" w:sz="4"/>
+            </w:tcBorders>
+            <w:tcMar>
+              <w:top w:type="dxa" w:w="60"/>
+              <w:left w:type="dxa" w:w="100"/>
+              <w:bottom w:type="dxa" w:w="60"/>
+              <w:right w:type="dxa" w:w="100"/>
+            </w:tcMar>
+          </w:tcPr>
+          <w:p>
+            <w:pPr>
+              <w:spacing w:after="0" w:line="276"/>
+            </w:pPr>
+            <w:r>
+              <w:rPr>
+                <w:rFonts w:ascii="Malgun Gothic" w:cs="Malgun Gothic" w:eastAsia="맑은 고딕" w:hAnsi="Malgun Gothic"/>
+                <w:b w:val="false"/>
+                <w:bCs w:val="false"/>
+                <w:sz w:val="18"/>
+                <w:szCs w:val="18"/>
+              </w:rPr>
+              <w:t xml:space="preserve">벌채–임도–산사태–사방 연결 확인, 교란 요인 분리</w:t>
             </w:r>
           </w:p>
         </w:tc>
@@ -10338,7 +9677,7 @@
           <w:sz w:val="18"/>
           <w:szCs w:val="18"/>
         </w:rPr>
-        <w:t xml:space="preserve">공공기관 정보공개는 청구일로부터 10일 이내 공개 여부를 결정하며, 부득이한 경우 10일 연장할 수 있음. 10월 중순 청구 시 10월 말~11월 초 수령을 예상함.</w:t>
+        <w:t xml:space="preserve">기재요령에는 집재 방법과 토양 항목이 없음. 집재 방법은 "기록되어 있다면"으로 요청하고, 토양은 산림입지토양도로 보완함. 미벌채 대조구는 청구 범위 밖이므로 임상도로 보완함.</w:t>
       </w:r>
     </w:p>
     <w:p>
@@ -10377,7 +9716,7 @@
           <w:b w:val="false"/>
           <w:bCs w:val="false"/>
         </w:rPr>
-        <w:t xml:space="preserve">: 임반은 면적이 매우 커서 표본 단위로 부적합함. 소반은 100ha 미만으로 나뉘므로 작은 소반을 기준으로 표본을 뜸.</w:t>
+        <w:t xml:space="preserve">: 임반은 100ha 내외로 구획되어 표본 단위로 큼. 소반은 임상·임령·작업종 등이 다르면 따로 구획(최소 1ha)되므로, 벌채 이력이 같은 단위인 소반을 기준으로 표본을 뜸(산림경영계획서 기재요령).</w:t>
       </w:r>
     </w:p>
     <w:p>
@@ -13064,15 +12403,15 @@
           <w:b/>
           <w:bCs/>
         </w:rPr>
-        <w:t xml:space="preserve">정보공개 청구 대상 확정</w:t>
-      </w:r>
-      <w:r>
-        <w:rPr>
-          <w:rFonts w:ascii="Malgun Gothic" w:cs="Malgun Gothic" w:eastAsia="맑은 고딕" w:hAnsi="Malgun Gothic"/>
-          <w:b w:val="false"/>
-          <w:bCs w:val="false"/>
-        </w:rPr>
-        <w:t xml:space="preserve">: 목재매각실적 상위 2곳인 동부·북부지방산림청 전체 목록을 받아 관리소(강릉 등)를 고르고, 남부(김천·봉화)는 예비 후보로 두는 방안</w:t>
+        <w:t xml:space="preserve">정보공개 청구서(안) 확정</w:t>
+      </w:r>
+      <w:r>
+        <w:rPr>
+          <w:rFonts w:ascii="Malgun Gothic" w:cs="Malgun Gothic" w:eastAsia="맑은 고딕" w:hAnsi="Malgun Gothic"/>
+          <w:b w:val="false"/>
+          <w:bCs w:val="false"/>
+        </w:rPr>
+        <w:t xml:space="preserve">: 동부·북부지방산림청 1회 일괄 청구, 상세 자료는 주벌 실적 소반으로 한정, 대상 기간(보유 전체 여부). 남부(김천·봉화)는 예비 후보</w:t>
       </w:r>
     </w:p>
     <w:p>

</xml_diff>

<commit_message>
Clarify national ecosystem survey data plan in biodiversity section
Co-Authored-By: Claude Opus 5.5 <noreply@anthropic.com>
Claude-Session: https://claude.ai/code/session_011DrJSR3zzQAfuEGwbEcRfw
</commit_message>
<xml_diff>
--- a/reports/2026-10_RQ1_월간보고.docx
+++ b/reports/2026-10_RQ1_월간보고.docx
@@ -10966,7 +10966,7 @@
           <w:bCs/>
           <w:color w:val="9A4B16"/>
         </w:rPr>
-        <w:t xml:space="preserve">활용 여부 결정 필요</w:t>
+        <w:t xml:space="preserve">활용 수준 결정 필요</w:t>
       </w:r>
       <w:r>
         <w:rPr>
@@ -10985,10 +10985,269 @@
       <w:r>
         <w:rPr>
           <w:rFonts w:ascii="Malgun Gothic" w:cs="Malgun Gothic" w:eastAsia="맑은 고딕" w:hAnsi="Malgun Gothic"/>
-          <w:b w:val="false"/>
-          <w:bCs w:val="false"/>
-        </w:rPr>
-        <w:t xml:space="preserve">제5차 전국자연환경조사(2019~2023)의 생물종 출현 정보로, 조사지역별 좌표가 있는 공간정보 파일로 제공됨. 식물, 조류, 포유류, 어류, 저서성대형무척추동물, 양서파충류, 곤충 7개 분야로 구성됨. 이 자료를 벌채지 자료와 결합해 야생동물 출현 빈도 등을 분석하는 계획을 세움.</w:t>
+          <w:b/>
+          <w:bCs/>
+        </w:rPr>
+        <w:t xml:space="preserve">제안</w:t>
+      </w:r>
+      <w:r>
+        <w:rPr>
+          <w:rFonts w:ascii="Malgun Gothic" w:cs="Malgun Gothic" w:eastAsia="맑은 고딕" w:hAnsi="Malgun Gothic"/>
+          <w:b w:val="false"/>
+          <w:bCs w:val="false"/>
+        </w:rPr>
+        <w:t xml:space="preserve">: 활용하는 방향으로 진행하되, 정량 분석까지 할지는 11월에 사례지와 조사지점의 중첩 정도를 확인한 뒤 정함.</w:t>
+      </w:r>
+    </w:p>
+    <w:p>
+      <w:pPr>
+        <w:pStyle w:val="Heading3"/>
+      </w:pPr>
+      <w:r>
+        <w:rPr>
+          <w:rFonts w:ascii="Malgun Gothic" w:cs="Malgun Gothic" w:eastAsia="맑은 고딕" w:hAnsi="Malgun Gothic"/>
+          <w:b w:val="false"/>
+          <w:bCs w:val="false"/>
+        </w:rPr>
+        <w:t xml:space="preserve">자료 개요</w:t>
+      </w:r>
+    </w:p>
+    <w:p>
+      <w:pPr>
+        <w:pStyle w:val="ListParagraph"/>
+        <w:numPr>
+          <w:ilvl w:val="0"/>
+          <w:numId w:val="2"/>
+        </w:numPr>
+        <w:spacing w:after="60"/>
+      </w:pPr>
+      <w:r>
+        <w:rPr>
+          <w:rFonts w:ascii="Malgun Gothic" w:cs="Malgun Gothic" w:eastAsia="맑은 고딕" w:hAnsi="Malgun Gothic"/>
+          <w:b w:val="false"/>
+          <w:bCs w:val="false"/>
+        </w:rPr>
+        <w:t xml:space="preserve">제5차 전국자연환경조사(2019~2023) 생물종 출현 정보</w:t>
+      </w:r>
+    </w:p>
+    <w:p>
+      <w:pPr>
+        <w:pStyle w:val="ListParagraph"/>
+        <w:numPr>
+          <w:ilvl w:val="0"/>
+          <w:numId w:val="2"/>
+        </w:numPr>
+        <w:spacing w:after="60"/>
+      </w:pPr>
+      <w:r>
+        <w:rPr>
+          <w:rFonts w:ascii="Malgun Gothic" w:cs="Malgun Gothic" w:eastAsia="맑은 고딕" w:hAnsi="Malgun Gothic"/>
+          <w:b w:val="false"/>
+          <w:bCs w:val="false"/>
+        </w:rPr>
+        <w:t xml:space="preserve">식물, 조류, 포유류, 어류, 저서성대형무척추동물, 양서파충류, 곤충 7개 분류군</w:t>
+      </w:r>
+    </w:p>
+    <w:p>
+      <w:pPr>
+        <w:pStyle w:val="ListParagraph"/>
+        <w:numPr>
+          <w:ilvl w:val="0"/>
+          <w:numId w:val="2"/>
+        </w:numPr>
+        <w:spacing w:after="60"/>
+      </w:pPr>
+      <w:r>
+        <w:rPr>
+          <w:rFonts w:ascii="Malgun Gothic" w:cs="Malgun Gothic" w:eastAsia="맑은 고딕" w:hAnsi="Malgun Gothic"/>
+          <w:b w:val="false"/>
+          <w:bCs w:val="false"/>
+        </w:rPr>
+        <w:t xml:space="preserve">조사지역별 좌표가 있는 공간정보 파일(GIS)로 제공</w:t>
+      </w:r>
+    </w:p>
+    <w:p>
+      <w:pPr>
+        <w:pStyle w:val="Heading3"/>
+      </w:pPr>
+      <w:r>
+        <w:rPr>
+          <w:rFonts w:ascii="Malgun Gothic" w:cs="Malgun Gothic" w:eastAsia="맑은 고딕" w:hAnsi="Malgun Gothic"/>
+          <w:b w:val="false"/>
+          <w:bCs w:val="false"/>
+        </w:rPr>
+        <w:t xml:space="preserve">RQ1에서 쓰는 이유</w:t>
+      </w:r>
+    </w:p>
+    <w:p>
+      <w:pPr>
+        <w:pStyle w:val="ListParagraph"/>
+        <w:numPr>
+          <w:ilvl w:val="0"/>
+          <w:numId w:val="2"/>
+        </w:numPr>
+        <w:spacing w:after="60"/>
+      </w:pPr>
+      <w:r>
+        <w:rPr>
+          <w:rFonts w:ascii="Malgun Gothic" w:cs="Malgun Gothic" w:eastAsia="맑은 고딕" w:hAnsi="Malgun Gothic"/>
+          <w:b w:val="false"/>
+          <w:bCs w:val="false"/>
+        </w:rPr>
+        <w:t xml:space="preserve">1회 현장조사로는 경과연수별 동물상 자료를 얻기 어려움</w:t>
+      </w:r>
+    </w:p>
+    <w:p>
+      <w:pPr>
+        <w:pStyle w:val="ListParagraph"/>
+        <w:numPr>
+          <w:ilvl w:val="0"/>
+          <w:numId w:val="2"/>
+        </w:numPr>
+        <w:spacing w:after="60"/>
+      </w:pPr>
+      <w:r>
+        <w:rPr>
+          <w:rFonts w:ascii="Malgun Gothic" w:cs="Malgun Gothic" w:eastAsia="맑은 고딕" w:hAnsi="Malgun Gothic"/>
+          <w:b w:val="false"/>
+          <w:bCs w:val="false"/>
+        </w:rPr>
+        <w:t xml:space="preserve">착수보고서(표 2)도 이 자료로 국내 여건에 맞는 값을 보완한다고 계획함</w:t>
+      </w:r>
+    </w:p>
+    <w:p>
+      <w:pPr>
+        <w:pStyle w:val="ListParagraph"/>
+        <w:numPr>
+          <w:ilvl w:val="0"/>
+          <w:numId w:val="2"/>
+        </w:numPr>
+        <w:spacing w:after="60"/>
+      </w:pPr>
+      <w:r>
+        <w:rPr>
+          <w:rFonts w:ascii="Malgun Gothic" w:cs="Malgun Gothic" w:eastAsia="맑은 고딕" w:hAnsi="Malgun Gothic"/>
+          <w:b w:val="false"/>
+          <w:bCs w:val="false"/>
+        </w:rPr>
+        <w:t xml:space="preserve">사례지 벌채이력과 겹치면, 경과연수별 분류군 출현을 국내 자료로 비교할 수 있음</w:t>
+      </w:r>
+    </w:p>
+    <w:p>
+      <w:pPr>
+        <w:pStyle w:val="Heading3"/>
+      </w:pPr>
+      <w:r>
+        <w:rPr>
+          <w:rFonts w:ascii="Malgun Gothic" w:cs="Malgun Gothic" w:eastAsia="맑은 고딕" w:hAnsi="Malgun Gothic"/>
+          <w:b w:val="false"/>
+          <w:bCs w:val="false"/>
+        </w:rPr>
+        <w:t xml:space="preserve">분석 절차</w:t>
+      </w:r>
+    </w:p>
+    <w:p>
+      <w:pPr>
+        <w:pStyle w:val="ListParagraph"/>
+        <w:numPr>
+          <w:ilvl w:val="0"/>
+          <w:numId w:val="5"/>
+        </w:numPr>
+        <w:spacing w:after="60"/>
+      </w:pPr>
+      <w:r>
+        <w:rPr>
+          <w:rFonts w:ascii="Malgun Gothic" w:cs="Malgun Gothic" w:eastAsia="맑은 고딕" w:hAnsi="Malgun Gothic"/>
+          <w:b/>
+          <w:bCs/>
+        </w:rPr>
+        <w:t xml:space="preserve">조사지점 추출</w:t>
+      </w:r>
+      <w:r>
+        <w:rPr>
+          <w:rFonts w:ascii="Malgun Gothic" w:cs="Malgun Gothic" w:eastAsia="맑은 고딕" w:hAnsi="Malgun Gothic"/>
+          <w:b w:val="false"/>
+          <w:bCs w:val="false"/>
+        </w:rPr>
+        <w:t xml:space="preserve">: 사례지 관리소 범위 안의 자연환경조사 출현 지점을 뽑음</w:t>
+      </w:r>
+    </w:p>
+    <w:p>
+      <w:pPr>
+        <w:pStyle w:val="ListParagraph"/>
+        <w:numPr>
+          <w:ilvl w:val="0"/>
+          <w:numId w:val="5"/>
+        </w:numPr>
+        <w:spacing w:after="60"/>
+      </w:pPr>
+      <w:r>
+        <w:rPr>
+          <w:rFonts w:ascii="Malgun Gothic" w:cs="Malgun Gothic" w:eastAsia="맑은 고딕" w:hAnsi="Malgun Gothic"/>
+          <w:b/>
+          <w:bCs/>
+        </w:rPr>
+        <w:t xml:space="preserve">벌채 정보 부여</w:t>
+      </w:r>
+      <w:r>
+        <w:rPr>
+          <w:rFonts w:ascii="Malgun Gothic" w:cs="Malgun Gothic" w:eastAsia="맑은 고딕" w:hAnsi="Malgun Gothic"/>
+          <w:b w:val="false"/>
+          <w:bCs w:val="false"/>
+        </w:rPr>
+        <w:t xml:space="preserve">: 정보공개로 받은 소반별 벌채이력과 임상도·구글어스 시계열 영상으로 지점마다 벌채 여부와 경과연수(조사 연도 기준)를 붙임</w:t>
+      </w:r>
+    </w:p>
+    <w:p>
+      <w:pPr>
+        <w:pStyle w:val="ListParagraph"/>
+        <w:numPr>
+          <w:ilvl w:val="0"/>
+          <w:numId w:val="5"/>
+        </w:numPr>
+        <w:spacing w:after="60"/>
+      </w:pPr>
+      <w:r>
+        <w:rPr>
+          <w:rFonts w:ascii="Malgun Gothic" w:cs="Malgun Gothic" w:eastAsia="맑은 고딕" w:hAnsi="Malgun Gothic"/>
+          <w:b/>
+          <w:bCs/>
+        </w:rPr>
+        <w:t xml:space="preserve">설명 변수 결합</w:t>
+      </w:r>
+      <w:r>
+        <w:rPr>
+          <w:rFonts w:ascii="Malgun Gothic" w:cs="Malgun Gothic" w:eastAsia="맑은 고딕" w:hAnsi="Malgun Gothic"/>
+          <w:b w:val="false"/>
+          <w:bCs w:val="false"/>
+        </w:rPr>
+        <w:t xml:space="preserve">: 기후, 입지조건(경사·토양), 벌채 전 임상, 임도와의 거리, 산불 이력</w:t>
+      </w:r>
+    </w:p>
+    <w:p>
+      <w:pPr>
+        <w:pStyle w:val="ListParagraph"/>
+        <w:numPr>
+          <w:ilvl w:val="0"/>
+          <w:numId w:val="5"/>
+        </w:numPr>
+        <w:spacing w:after="60"/>
+      </w:pPr>
+      <w:r>
+        <w:rPr>
+          <w:rFonts w:ascii="Malgun Gothic" w:cs="Malgun Gothic" w:eastAsia="맑은 고딕" w:hAnsi="Malgun Gothic"/>
+          <w:b/>
+          <w:bCs/>
+        </w:rPr>
+        <w:t xml:space="preserve">비교·관계식</w:t>
+      </w:r>
+      <w:r>
+        <w:rPr>
+          <w:rFonts w:ascii="Malgun Gothic" w:cs="Malgun Gothic" w:eastAsia="맑은 고딕" w:hAnsi="Malgun Gothic"/>
+          <w:b w:val="false"/>
+          <w:bCs w:val="false"/>
+        </w:rPr>
+        <w:t xml:space="preserve">: 경과연수 구간(미벌채 대조 포함)별로 분류군별 출현 종수와 출현 빈도를 비교하고, 지점 수가 충분하면 아래 관계식을 추정함</w:t>
       </w:r>
     </w:p>
     <w:p>
@@ -11015,7 +11274,20 @@
           <w:b w:val="false"/>
           <w:bCs w:val="false"/>
         </w:rPr>
-        <w:t xml:space="preserve"> = f( 기후, 입지조건[토양·경사 등], 산림생태계 변수[벌채 전 임상], 인위적 조치[벌채·임도·산불] )</w:t>
+        <w:t xml:space="preserve"> = f( 기후, 입지조건[토양·경사], 산림생태계 변수[벌채 전 임상], 인위적 조치[벌채·임도·산불] )</w:t>
+      </w:r>
+    </w:p>
+    <w:p>
+      <w:pPr>
+        <w:pStyle w:val="Heading3"/>
+      </w:pPr>
+      <w:r>
+        <w:rPr>
+          <w:rFonts w:ascii="Malgun Gothic" w:cs="Malgun Gothic" w:eastAsia="맑은 고딕" w:hAnsi="Malgun Gothic"/>
+          <w:b w:val="false"/>
+          <w:bCs w:val="false"/>
+        </w:rPr>
+        <w:t xml:space="preserve">확인하려는 질문</w:t>
       </w:r>
     </w:p>
     <w:p>
@@ -11030,18 +11302,10 @@
       <w:r>
         <w:rPr>
           <w:rFonts w:ascii="Malgun Gothic" w:cs="Malgun Gothic" w:eastAsia="맑은 고딕" w:hAnsi="Malgun Gothic"/>
-          <w:b/>
-          <w:bCs/>
-        </w:rPr>
-        <w:t xml:space="preserve">자료 결합</w:t>
-      </w:r>
-      <w:r>
-        <w:rPr>
-          <w:rFonts w:ascii="Malgun Gothic" w:cs="Malgun Gothic" w:eastAsia="맑은 고딕" w:hAnsi="Malgun Gothic"/>
-          <w:b w:val="false"/>
-          <w:bCs w:val="false"/>
-        </w:rPr>
-        <w:t xml:space="preserve">: 임상도 + 구글어스 시계열 영상(벌채 시점 확인) + 벌채이력(정보공개) + 자연환경조사 출현 지점</w:t>
+          <w:b w:val="false"/>
+          <w:bCs w:val="false"/>
+        </w:rPr>
+        <w:t xml:space="preserve">벌채 후 경과연수에 따라 분류군별 출현 종수가 어떻게 달라지는가</w:t>
       </w:r>
     </w:p>
     <w:p>
@@ -11056,90 +11320,10 @@
       <w:r>
         <w:rPr>
           <w:rFonts w:ascii="Malgun Gothic" w:cs="Malgun Gothic" w:eastAsia="맑은 고딕" w:hAnsi="Malgun Gothic"/>
-          <w:b/>
-          <w:bCs/>
-        </w:rPr>
-        <w:t xml:space="preserve">분석 질문</w:t>
-      </w:r>
-      <w:r>
-        <w:rPr>
-          <w:rFonts w:ascii="Malgun Gothic" w:cs="Malgun Gothic" w:eastAsia="맑은 고딕" w:hAnsi="Malgun Gothic"/>
-          <w:b w:val="false"/>
-          <w:bCs w:val="false"/>
-        </w:rPr>
-        <w:t xml:space="preserve"/>
-      </w:r>
-    </w:p>
-    <w:p>
-      <w:pPr>
-        <w:pStyle w:val="ListParagraph"/>
-        <w:numPr>
-          <w:ilvl w:val="1"/>
-          <w:numId w:val="2"/>
-        </w:numPr>
-        <w:spacing w:after="60"/>
-      </w:pPr>
-      <w:r>
-        <w:rPr>
-          <w:rFonts w:ascii="Malgun Gothic" w:cs="Malgun Gothic" w:eastAsia="맑은 고딕" w:hAnsi="Malgun Gothic"/>
-          <w:b w:val="false"/>
-          <w:bCs w:val="false"/>
-        </w:rPr>
-        <w:t xml:space="preserve">임상 특성이 벌채로 어떤 영향을 받는가</w:t>
-      </w:r>
-    </w:p>
-    <w:p>
-      <w:pPr>
-        <w:pStyle w:val="ListParagraph"/>
-        <w:numPr>
-          <w:ilvl w:val="1"/>
-          <w:numId w:val="2"/>
-        </w:numPr>
-        <w:spacing w:after="60"/>
-      </w:pPr>
-      <w:r>
-        <w:rPr>
-          <w:rFonts w:ascii="Malgun Gothic" w:cs="Malgun Gothic" w:eastAsia="맑은 고딕" w:hAnsi="Malgun Gothic"/>
-          <w:b w:val="false"/>
-          <w:bCs w:val="false"/>
-        </w:rPr>
-        <w:t xml:space="preserve">임상과 자연환경조사에 나타난 생물다양성 지표 사이의 관계식</w:t>
-      </w:r>
-    </w:p>
-    <w:p>
-      <w:pPr>
-        <w:pStyle w:val="ListParagraph"/>
-        <w:numPr>
-          <w:ilvl w:val="1"/>
-          <w:numId w:val="2"/>
-        </w:numPr>
-        <w:spacing w:after="60"/>
-      </w:pPr>
-      <w:r>
-        <w:rPr>
-          <w:rFonts w:ascii="Malgun Gothic" w:cs="Malgun Gothic" w:eastAsia="맑은 고딕" w:hAnsi="Malgun Gothic"/>
-          <w:b w:val="false"/>
-          <w:bCs w:val="false"/>
-        </w:rPr>
-        <w:t xml:space="preserve">참나무 벌채 여부와 멧돼지 출현의 관계(멧돼지는 도토리를 많이 먹음)</w:t>
-      </w:r>
-    </w:p>
-    <w:p>
-      <w:pPr>
-        <w:pStyle w:val="ListParagraph"/>
-        <w:numPr>
-          <w:ilvl w:val="1"/>
-          <w:numId w:val="2"/>
-        </w:numPr>
-        <w:spacing w:after="60"/>
-      </w:pPr>
-      <w:r>
-        <w:rPr>
-          <w:rFonts w:ascii="Malgun Gothic" w:cs="Malgun Gothic" w:eastAsia="맑은 고딕" w:hAnsi="Malgun Gothic"/>
-          <w:b w:val="false"/>
-          <w:bCs w:val="false"/>
-        </w:rPr>
-        <w:t xml:space="preserve">임도와의 거리와 야생동물 출현의 관계</w:t>
+          <w:b w:val="false"/>
+          <w:bCs w:val="false"/>
+        </w:rPr>
+        <w:t xml:space="preserve">임상 특성이 벌채로 어떻게 바뀌고, 그 변화가 생물다양성 지표와 어떤 관계인가</w:t>
       </w:r>
     </w:p>
     <w:p>
@@ -11154,34 +11338,145 @@
       <w:r>
         <w:rPr>
           <w:rFonts w:ascii="Malgun Gothic" w:cs="Malgun Gothic" w:eastAsia="맑은 고딕" w:hAnsi="Malgun Gothic"/>
+          <w:b w:val="false"/>
+          <w:bCs w:val="false"/>
+        </w:rPr>
+        <w:t xml:space="preserve">참나무 벌채지에서 멧돼지 출현이 달라지는가(멧돼지는 도토리를 많이 먹음)</w:t>
+      </w:r>
+    </w:p>
+    <w:p>
+      <w:pPr>
+        <w:pStyle w:val="ListParagraph"/>
+        <w:numPr>
+          <w:ilvl w:val="0"/>
+          <w:numId w:val="2"/>
+        </w:numPr>
+        <w:spacing w:after="60"/>
+      </w:pPr>
+      <w:r>
+        <w:rPr>
+          <w:rFonts w:ascii="Malgun Gothic" w:cs="Malgun Gothic" w:eastAsia="맑은 고딕" w:hAnsi="Malgun Gothic"/>
+          <w:b w:val="false"/>
+          <w:bCs w:val="false"/>
+        </w:rPr>
+        <w:t xml:space="preserve">임도와의 거리에 따라 야생동물 출현이 달라지는가</w:t>
+      </w:r>
+    </w:p>
+    <w:p>
+      <w:pPr>
+        <w:pStyle w:val="Heading3"/>
+      </w:pPr>
+      <w:r>
+        <w:rPr>
+          <w:rFonts w:ascii="Malgun Gothic" w:cs="Malgun Gothic" w:eastAsia="맑은 고딕" w:hAnsi="Malgun Gothic"/>
+          <w:b w:val="false"/>
+          <w:bCs w:val="false"/>
+        </w:rPr>
+        <w:t xml:space="preserve">한계와 대응</w:t>
+      </w:r>
+    </w:p>
+    <w:p>
+      <w:pPr>
+        <w:pStyle w:val="ListParagraph"/>
+        <w:numPr>
+          <w:ilvl w:val="0"/>
+          <w:numId w:val="2"/>
+        </w:numPr>
+        <w:spacing w:after="60"/>
+      </w:pPr>
+      <w:r>
+        <w:rPr>
+          <w:rFonts w:ascii="Malgun Gothic" w:cs="Malgun Gothic" w:eastAsia="맑은 고딕" w:hAnsi="Malgun Gothic"/>
           <w:b/>
           <w:bCs/>
         </w:rPr>
-        <w:t xml:space="preserve">검토할 한계</w:t>
-      </w:r>
-      <w:r>
-        <w:rPr>
-          <w:rFonts w:ascii="Malgun Gothic" w:cs="Malgun Gothic" w:eastAsia="맑은 고딕" w:hAnsi="Malgun Gothic"/>
-          <w:b w:val="false"/>
-          <w:bCs w:val="false"/>
-        </w:rPr>
-        <w:t xml:space="preserve">: 출현 기록 위주 자료라 부재를 확정하기 어려움, 조사지점과 벌채지가 겹치는 곳이 제한적일 수 있음, 조사 연도와 벌채 연도의 시차, 지점별 조사 노력 차이. 사례지 후보에서 </w:t>
-      </w:r>
+        <w:t xml:space="preserve">출현 기록 위주 자료</w:t>
+      </w:r>
+      <w:r>
+        <w:rPr>
+          <w:rFonts w:ascii="Malgun Gothic" w:cs="Malgun Gothic" w:eastAsia="맑은 고딕" w:hAnsi="Malgun Gothic"/>
+          <w:b w:val="false"/>
+          <w:bCs w:val="false"/>
+        </w:rPr>
+        <w:t xml:space="preserve">: 없다는 기록이 아니므로 "부재"로 해석하지 않고, 출현 종수와 빈도 비교로 한정함</w:t>
+      </w:r>
+    </w:p>
+    <w:p>
+      <w:pPr>
+        <w:pStyle w:val="ListParagraph"/>
+        <w:numPr>
+          <w:ilvl w:val="0"/>
+          <w:numId w:val="2"/>
+        </w:numPr>
+        <w:spacing w:after="60"/>
+      </w:pPr>
       <w:r>
         <w:rPr>
           <w:rFonts w:ascii="Malgun Gothic" w:cs="Malgun Gothic" w:eastAsia="맑은 고딕" w:hAnsi="Malgun Gothic"/>
           <w:b/>
           <w:bCs/>
         </w:rPr>
-        <w:t xml:space="preserve">자연환경조사 지점과 겹치는 곳</w:t>
-      </w:r>
-      <w:r>
-        <w:rPr>
-          <w:rFonts w:ascii="Malgun Gothic" w:cs="Malgun Gothic" w:eastAsia="맑은 고딕" w:hAnsi="Malgun Gothic"/>
-          <w:b w:val="false"/>
-          <w:bCs w:val="false"/>
-        </w:rPr>
-        <w:t xml:space="preserve">이 얼마나 되는지 먼저 확인함.</w:t>
+        <w:t xml:space="preserve">벌채지와 조사지점의 중첩 부족 가능성</w:t>
+      </w:r>
+      <w:r>
+        <w:rPr>
+          <w:rFonts w:ascii="Malgun Gothic" w:cs="Malgun Gothic" w:eastAsia="맑은 고딕" w:hAnsi="Malgun Gothic"/>
+          <w:b w:val="false"/>
+          <w:bCs w:val="false"/>
+        </w:rPr>
+        <w:t xml:space="preserve">: 11월에 중첩 지점 수를 먼저 세고, 부족하면 정량 분석 대신 문헌 종합을 보완하는 정성 자료로만 씀</w:t>
+      </w:r>
+    </w:p>
+    <w:p>
+      <w:pPr>
+        <w:pStyle w:val="ListParagraph"/>
+        <w:numPr>
+          <w:ilvl w:val="0"/>
+          <w:numId w:val="2"/>
+        </w:numPr>
+        <w:spacing w:after="60"/>
+      </w:pPr>
+      <w:r>
+        <w:rPr>
+          <w:rFonts w:ascii="Malgun Gothic" w:cs="Malgun Gothic" w:eastAsia="맑은 고딕" w:hAnsi="Malgun Gothic"/>
+          <w:b/>
+          <w:bCs/>
+        </w:rPr>
+        <w:t xml:space="preserve">조사 연도와 벌채 연도의 시차</w:t>
+      </w:r>
+      <w:r>
+        <w:rPr>
+          <w:rFonts w:ascii="Malgun Gothic" w:cs="Malgun Gothic" w:eastAsia="맑은 고딕" w:hAnsi="Malgun Gothic"/>
+          <w:b w:val="false"/>
+          <w:bCs w:val="false"/>
+        </w:rPr>
+        <w:t xml:space="preserve">: 경과연수를 조사 연도 기준으로 계산함</w:t>
+      </w:r>
+    </w:p>
+    <w:p>
+      <w:pPr>
+        <w:pStyle w:val="ListParagraph"/>
+        <w:numPr>
+          <w:ilvl w:val="0"/>
+          <w:numId w:val="2"/>
+        </w:numPr>
+        <w:spacing w:after="60"/>
+      </w:pPr>
+      <w:r>
+        <w:rPr>
+          <w:rFonts w:ascii="Malgun Gothic" w:cs="Malgun Gothic" w:eastAsia="맑은 고딕" w:hAnsi="Malgun Gothic"/>
+          <w:b/>
+          <w:bCs/>
+        </w:rPr>
+        <w:t xml:space="preserve">지점별 조사 노력 차이</w:t>
+      </w:r>
+      <w:r>
+        <w:rPr>
+          <w:rFonts w:ascii="Malgun Gothic" w:cs="Malgun Gothic" w:eastAsia="맑은 고딕" w:hAnsi="Malgun Gothic"/>
+          <w:b w:val="false"/>
+          <w:bCs w:val="false"/>
+        </w:rPr>
+        <w:t xml:space="preserve">: 조사 단위(지점·구간)당 값으로 비교함</w:t>
       </w:r>
     </w:p>
     <w:p>
@@ -12104,7 +12399,7 @@
                 <w:sz w:val="18"/>
                 <w:szCs w:val="18"/>
               </w:rPr>
-              <w:t xml:space="preserve">정보공개 청구(동부·북부지방산림청), WEPP 입력자료 구축 착수(기상·토양·DEM), 집재 방법 기준 문헌 재분류, 자연환경조사 자료 확보 및 사례지 후보와의 중첩 확인, 포유류 자문 여부 결정</w:t>
+              <w:t xml:space="preserve">정보공개 청구(동부·북부지방산림청), WEPP 입력자료 구축 착수(기상·토양·DEM), 집재 방법 기준 문헌 재분류, 자연환경조사 자료 확보, 포유류 자문 여부 결정</w:t>
             </w:r>
           </w:p>
         </w:tc>
@@ -12205,7 +12500,7 @@
                 <w:sz w:val="18"/>
                 <w:szCs w:val="18"/>
               </w:rPr>
-              <w:t xml:space="preserve">정보공개 자료 수령(1회 일괄 청구) → 관리소·소반 선정, 사례지 확정, WEPP 모의(경과연수·벌기령 시나리오), 생물다양성 공간분석, 경제적 최적벌기령 산출 착수</w:t>
+              <w:t xml:space="preserve">정보공개 자료 수령(1회 일괄 청구) → 관리소·소반 선정, 사례지 확정, 자연환경조사 지점 중첩 확인·활용 수준 결정, WEPP 모의(경과연수·벌기령 시나리오), 생물다양성 공간분석, 경제적 최적벌기령 산출 착수</w:t>
             </w:r>
           </w:p>
         </w:tc>
@@ -12367,7 +12662,7 @@
         <w:pStyle w:val="ListParagraph"/>
         <w:numPr>
           <w:ilvl w:val="0"/>
-          <w:numId w:val="5"/>
+          <w:numId w:val="6"/>
         </w:numPr>
         <w:spacing w:after="60"/>
       </w:pPr>
@@ -12393,7 +12688,7 @@
         <w:pStyle w:val="ListParagraph"/>
         <w:numPr>
           <w:ilvl w:val="0"/>
-          <w:numId w:val="5"/>
+          <w:numId w:val="6"/>
         </w:numPr>
         <w:spacing w:after="60"/>
       </w:pPr>
@@ -12419,7 +12714,7 @@
         <w:pStyle w:val="ListParagraph"/>
         <w:numPr>
           <w:ilvl w:val="0"/>
-          <w:numId w:val="5"/>
+          <w:numId w:val="6"/>
         </w:numPr>
         <w:spacing w:after="60"/>
       </w:pPr>
@@ -12429,7 +12724,15 @@
           <w:b/>
           <w:bCs/>
         </w:rPr>
-        <w:t xml:space="preserve">국립생태원 제5차 전국자연환경조사 자료 활용 여부</w:t>
+        <w:t xml:space="preserve">국립생태원 제5차 전국자연환경조사 자료 활용</w:t>
+      </w:r>
+      <w:r>
+        <w:rPr>
+          <w:rFonts w:ascii="Malgun Gothic" w:cs="Malgun Gothic" w:eastAsia="맑은 고딕" w:hAnsi="Malgun Gothic"/>
+          <w:b w:val="false"/>
+          <w:bCs w:val="false"/>
+        </w:rPr>
+        <w:t xml:space="preserve">: 활용 방향으로 진행하고, 11월 중첩 확인 결과로 정량 분석 여부를 정하는 방안</w:t>
       </w:r>
     </w:p>
     <w:p>
@@ -12437,7 +12740,7 @@
         <w:pStyle w:val="ListParagraph"/>
         <w:numPr>
           <w:ilvl w:val="0"/>
-          <w:numId w:val="5"/>
+          <w:numId w:val="6"/>
         </w:numPr>
         <w:spacing w:after="60"/>
       </w:pPr>
@@ -12870,6 +13173,12 @@
     </w:lvlOverride>
   </w:num>
   <w:num w:numId="5">
+    <w:abstractNumId w:val="3"/>
+    <w:lvlOverride w:ilvl="0">
+      <w:startOverride w:val="1"/>
+    </w:lvlOverride>
+  </w:num>
+  <w:num w:numId="6">
     <w:abstractNumId w:val="4"/>
     <w:lvlOverride w:ilvl="0">
       <w:startOverride w:val="1"/>

</xml_diff>

<commit_message>
Soften field survey adjustment wording in report overview
Co-Authored-By: Claude Opus 5.5 <noreply@anthropic.com>
Claude-Session: https://claude.ai/code/session_011DrJSR3zzQAfuEGwbEcRfw
</commit_message>
<xml_diff>
--- a/reports/2026-10_RQ1_월간보고.docx
+++ b/reports/2026-10_RQ1_월간보고.docx
@@ -207,12 +207,46 @@
     </w:p>
     <w:p>
       <w:pPr>
-        <w:pStyle w:val="ListParagraph"/>
-        <w:numPr>
-          <w:ilvl w:val="0"/>
-          <w:numId w:val="2"/>
-        </w:numPr>
-        <w:spacing w:after="60"/>
+        <w:spacing w:after="120"/>
+      </w:pPr>
+      <w:r>
+        <w:rPr>
+          <w:rFonts w:ascii="Malgun Gothic" w:cs="Malgun Gothic" w:eastAsia="맑은 고딕" w:hAnsi="Malgun Gothic"/>
+          <w:b w:val="false"/>
+          <w:bCs w:val="false"/>
+        </w:rPr>
+        <w:t xml:space="preserve">이번 보고는 토사유출 분석 방법, 생물다양성 분석 범위, 사례지 선정을 위한 정보공개 청구 계획을 다룬다. 특히 착수보고서에서 계획한 현장조사의 조정 방향을 함께 보고한다.</w:t>
+      </w:r>
+    </w:p>
+    <w:p>
+      <w:pPr>
+        <w:pStyle w:val="Heading2"/>
+      </w:pPr>
+      <w:r>
+        <w:rPr>
+          <w:rFonts w:ascii="Malgun Gothic" w:cs="Malgun Gothic" w:eastAsia="맑은 고딕" w:hAnsi="Malgun Gothic"/>
+          <w:b w:val="false"/>
+          <w:bCs w:val="false"/>
+        </w:rPr>
+        <w:t xml:space="preserve">1.1 현장조사 계획의 조정</w:t>
+      </w:r>
+    </w:p>
+    <w:p>
+      <w:pPr>
+        <w:spacing w:after="120"/>
+      </w:pPr>
+      <w:r>
+        <w:rPr>
+          <w:rFonts w:ascii="Malgun Gothic" w:cs="Malgun Gothic" w:eastAsia="맑은 고딕" w:hAnsi="Malgun Gothic"/>
+          <w:b w:val="false"/>
+          <w:bCs w:val="false"/>
+        </w:rPr>
+        <w:t xml:space="preserve">토사유출과 생물다양성 현장조사 계획을 수립하는 과정에서, 본 연구의 기간과 예산, 인력 여건을 고려할 때 이번 연차에는 체계적인 현장조사를 진행하기 어렵다고 판단하였다.</w:t>
+      </w:r>
+    </w:p>
+    <w:p>
+      <w:pPr>
+        <w:spacing w:after="120"/>
       </w:pPr>
       <w:r>
         <w:rPr>
@@ -228,17 +262,12 @@
           <w:b w:val="false"/>
           <w:bCs w:val="false"/>
         </w:rPr>
-        <w:t xml:space="preserve">: 국내 벌채지 대부분이 우드그랩 방식으로 집재한다는 자문을 반영해, 문헌을 집재 방법별로 정리한다. 현장 실측 대신 물리 기반 모형인 WEPP로 토사유출을 추정한다.</w:t>
+        <w:t xml:space="preserve">: 선행 연구는 WEPP와 같은 예측 모형과 함께 현장에 실트펜스를 설치해 토사유출량을 실측하는 방식으로 수행되어 왔다. 그러나 사례지에 실트펜스를 설치하고 주기적으로 방문해 유출량을 측정하는 것은 현재 여건에서 어렵다고 판단하였으며, 우기가 이미 지난 점도 현장조사의 제약이다. 토양의 물리·화학적 특성 분석 역시 본 연구의 예산 범위에서는 쉽지 않을 것으로 보인다. 이에 본 연구는 WEPP 예측 모형으로 토사유출량을 추정하고, 국내 문헌의 실측값으로 보정하는 방향으로 진행하고자 한다(2.5 참조).</w:t>
       </w:r>
     </w:p>
     <w:p>
       <w:pPr>
-        <w:pStyle w:val="ListParagraph"/>
-        <w:numPr>
-          <w:ilvl w:val="0"/>
-          <w:numId w:val="2"/>
-        </w:numPr>
-        <w:spacing w:after="60"/>
+        <w:spacing w:after="120"/>
       </w:pPr>
       <w:r>
         <w:rPr>
@@ -254,33 +283,46 @@
           <w:b w:val="false"/>
           <w:bCs w:val="false"/>
         </w:rPr>
-        <w:t xml:space="preserve">: 2차년도에는 현장조사를 하지 않는다. 국립생태원 제5차 전국자연환경조사 자료로 생물다양성 지수 분석을 먼저 완성한다.</w:t>
+        <w:t xml:space="preserve">: 야생동물은 이동성이 커서 주기적인 모니터링이 필요하므로, 이번 연구 기간 안에 수행하기는 쉽지 않을 것으로 판단된다. 한상훈 박사는 지난해 3월 산불 피해지에서 야생동물이 받은 영향을 모니터링하고 있으며, 최근 현장에서는 1년 만에 야생동물이 상당수 돌아온 것으로 보고되었다. 교수님은 이 사례를 근거로 야생동물은 이동성이 높아 벌채 영향이 지속되는 기간이 짧을 수 있고, 종 구성이나 서식 밀도 변화는 한두 차례의 현장 모니터링으로 정량화하기 어렵다고 보셨다.</w:t>
       </w:r>
     </w:p>
     <w:p>
       <w:pPr>
-        <w:pStyle w:val="ListParagraph"/>
-        <w:numPr>
-          <w:ilvl w:val="0"/>
-          <w:numId w:val="2"/>
-        </w:numPr>
-        <w:spacing w:after="60"/>
-      </w:pPr>
-      <w:r>
-        <w:rPr>
-          <w:rFonts w:ascii="Malgun Gothic" w:cs="Malgun Gothic" w:eastAsia="맑은 고딕" w:hAnsi="Malgun Gothic"/>
-          <w:b/>
-          <w:bCs/>
-        </w:rPr>
-        <w:t xml:space="preserve">사례지</w:t>
-      </w:r>
+        <w:spacing w:after="120"/>
+      </w:pPr>
       <w:r>
         <w:rPr>
           <w:rFonts w:ascii="Malgun Gothic" w:cs="Malgun Gothic" w:eastAsia="맑은 고딕" w:hAnsi="Malgun Gothic"/>
           <w:b w:val="false"/>
           <w:bCs w:val="false"/>
         </w:rPr>
-        <w:t xml:space="preserve">: 벌채 실적을 먼저 보고 사례지를 정한다. 국유림 목재매각실적 상위 2곳인 동부·북부지방산림청에 정보공개를 청구한다.</w:t>
+        <w:t xml:space="preserve">한상훈 박사는 현재 참나무 숲에 무인 카메라 8대를 설치해 겨울까지 3~4개월간 모니터링하고 있다. 본 연구 사례지에도 설치가 가능한지 의견을 듣고, 카메라 트랩 기반 심층 분석은 3차년도 과제로 제안하고자 한다. 이번 연차에는 환경부 전국자연환경조사 자료의 활용 방안에 대해 자문을 받고, 이 자료를 활용해 생물다양성 변화를 분석할 계획이다(3장 참조).</w:t>
+      </w:r>
+    </w:p>
+    <w:p>
+      <w:pPr>
+        <w:pStyle w:val="Heading2"/>
+      </w:pPr>
+      <w:r>
+        <w:rPr>
+          <w:rFonts w:ascii="Malgun Gothic" w:cs="Malgun Gothic" w:eastAsia="맑은 고딕" w:hAnsi="Malgun Gothic"/>
+          <w:b w:val="false"/>
+          <w:bCs w:val="false"/>
+        </w:rPr>
+        <w:t xml:space="preserve">1.2 사례지 선정</w:t>
+      </w:r>
+    </w:p>
+    <w:p>
+      <w:pPr>
+        <w:spacing w:after="120"/>
+      </w:pPr>
+      <w:r>
+        <w:rPr>
+          <w:rFonts w:ascii="Malgun Gothic" w:cs="Malgun Gothic" w:eastAsia="맑은 고딕" w:hAnsi="Malgun Gothic"/>
+          <w:b w:val="false"/>
+          <w:bCs w:val="false"/>
+        </w:rPr>
+        <w:t xml:space="preserve">사례지는 벌채 실적을 먼저 살펴 정한다. 국유림 목재매각실적 상위 2곳인 동부·북부지방산림청에 정보공개를 청구하고, 받은 자료로 관리소와 소반을 선정할 계획이다(4장 참조).</w:t>
       </w:r>
     </w:p>
     <w:p>
@@ -917,7 +959,7 @@
         <w:pStyle w:val="ListParagraph"/>
         <w:numPr>
           <w:ilvl w:val="0"/>
-          <w:numId w:val="3"/>
+          <w:numId w:val="2"/>
         </w:numPr>
         <w:spacing w:after="60"/>
       </w:pPr>
@@ -951,7 +993,7 @@
         <w:pStyle w:val="ListParagraph"/>
         <w:numPr>
           <w:ilvl w:val="0"/>
-          <w:numId w:val="3"/>
+          <w:numId w:val="2"/>
         </w:numPr>
         <w:spacing w:after="60"/>
       </w:pPr>
@@ -985,7 +1027,7 @@
         <w:pStyle w:val="ListParagraph"/>
         <w:numPr>
           <w:ilvl w:val="0"/>
-          <w:numId w:val="3"/>
+          <w:numId w:val="2"/>
         </w:numPr>
         <w:spacing w:after="60"/>
       </w:pPr>
@@ -1019,7 +1061,7 @@
         <w:pStyle w:val="ListParagraph"/>
         <w:numPr>
           <w:ilvl w:val="0"/>
-          <w:numId w:val="3"/>
+          <w:numId w:val="2"/>
         </w:numPr>
         <w:spacing w:after="60"/>
       </w:pPr>
@@ -1053,7 +1095,7 @@
         <w:pStyle w:val="ListParagraph"/>
         <w:numPr>
           <w:ilvl w:val="0"/>
-          <w:numId w:val="3"/>
+          <w:numId w:val="2"/>
         </w:numPr>
         <w:spacing w:after="60"/>
       </w:pPr>
@@ -1868,7 +1910,7 @@
           <w:b w:val="false"/>
           <w:bCs w:val="false"/>
         </w:rPr>
-        <w:t xml:space="preserve">착수보고서는 사례지 현장조사로 침식 흔적과 임도 상태를 확인해 문헌값을 검증할 계획이었다. 그러나 실트펜스 실측은 강우 사상마다 포집 토사를 계량해야 하고 최소 한 번의 우기(6~9월) 관측이 필요하다. 연구기간(2026.9~2027.2)은 우기 이후부터 동절기까지여서 의미 있는 강우 사상을 확보하기 어렵다. 경과연수별 비교구 여러 곳에 설치·회수하는 예산과 인력도 부족하다. 따라서 현장 실측 대신 물리 기반 모형인 WEPP로 토사유출을 추정한다.</w:t>
+        <w:t xml:space="preserve">1.1에서 설명한 여건에 따라 토사유출은 물리 기반 모형인 WEPP로 추정하고, 국내 실측값으로 보정한다. 여러 토양침식 모형 가운데 WEPP를 선택한 이유와 적용 계획은 다음과 같다.</w:t>
       </w:r>
     </w:p>
     <w:p>
@@ -3022,7 +3064,7 @@
         <w:pStyle w:val="ListParagraph"/>
         <w:numPr>
           <w:ilvl w:val="0"/>
-          <w:numId w:val="2"/>
+          <w:numId w:val="3"/>
         </w:numPr>
         <w:spacing w:after="60"/>
       </w:pPr>
@@ -3040,7 +3082,7 @@
         <w:pStyle w:val="ListParagraph"/>
         <w:numPr>
           <w:ilvl w:val="0"/>
-          <w:numId w:val="2"/>
+          <w:numId w:val="3"/>
         </w:numPr>
         <w:spacing w:after="60"/>
       </w:pPr>
@@ -3058,7 +3100,7 @@
         <w:pStyle w:val="ListParagraph"/>
         <w:numPr>
           <w:ilvl w:val="0"/>
-          <w:numId w:val="2"/>
+          <w:numId w:val="3"/>
         </w:numPr>
         <w:spacing w:after="60"/>
       </w:pPr>
@@ -3076,7 +3118,7 @@
         <w:pStyle w:val="ListParagraph"/>
         <w:numPr>
           <w:ilvl w:val="0"/>
-          <w:numId w:val="2"/>
+          <w:numId w:val="3"/>
         </w:numPr>
         <w:spacing w:after="60"/>
       </w:pPr>
@@ -3568,12 +3610,7 @@
     </w:p>
     <w:p>
       <w:pPr>
-        <w:pStyle w:val="ListParagraph"/>
-        <w:numPr>
-          <w:ilvl w:val="0"/>
-          <w:numId w:val="2"/>
-        </w:numPr>
-        <w:spacing w:after="60"/>
+        <w:spacing w:after="120"/>
       </w:pPr>
       <w:r>
         <w:rPr>
@@ -3581,61 +3618,7 @@
           <w:b w:val="false"/>
           <w:bCs w:val="false"/>
         </w:rPr>
-        <w:t xml:space="preserve">2차년도에는 현장조사를 하지 않는다. 국립생태원 제5차 전국자연환경조사 자료로 생물다양성 지수 분석을 먼저 완성한다.</w:t>
-      </w:r>
-    </w:p>
-    <w:p>
-      <w:pPr>
-        <w:pStyle w:val="ListParagraph"/>
-        <w:numPr>
-          <w:ilvl w:val="0"/>
-          <w:numId w:val="2"/>
-        </w:numPr>
-        <w:spacing w:after="60"/>
-      </w:pPr>
-      <w:r>
-        <w:rPr>
-          <w:rFonts w:ascii="Malgun Gothic" w:cs="Malgun Gothic" w:eastAsia="맑은 고딕" w:hAnsi="Malgun Gothic"/>
-          <w:b w:val="false"/>
-          <w:bCs w:val="false"/>
-        </w:rPr>
-        <w:t xml:space="preserve">분석 결과는 한상훈 박사와 사례지를 한 차례 방문해 확인하는 수준으로 하고, 결론은 "추가 연구 필요"로 둔다.</w:t>
-      </w:r>
-    </w:p>
-    <w:p>
-      <w:pPr>
-        <w:pStyle w:val="ListParagraph"/>
-        <w:numPr>
-          <w:ilvl w:val="0"/>
-          <w:numId w:val="2"/>
-        </w:numPr>
-        <w:spacing w:after="60"/>
-      </w:pPr>
-      <w:r>
-        <w:rPr>
-          <w:rFonts w:ascii="Malgun Gothic" w:cs="Malgun Gothic" w:eastAsia="맑은 고딕" w:hAnsi="Malgun Gothic"/>
-          <w:b w:val="false"/>
-          <w:bCs w:val="false"/>
-        </w:rPr>
-        <w:t xml:space="preserve">야생동물 전문가 자문은 자연환경조사 자료의 활용 방안에 초점을 두며, 세부 내용은 자문 후 정리해 보고한다.</w:t>
-      </w:r>
-    </w:p>
-    <w:p>
-      <w:pPr>
-        <w:pStyle w:val="ListParagraph"/>
-        <w:numPr>
-          <w:ilvl w:val="0"/>
-          <w:numId w:val="2"/>
-        </w:numPr>
-        <w:spacing w:after="60"/>
-      </w:pPr>
-      <w:r>
-        <w:rPr>
-          <w:rFonts w:ascii="Malgun Gothic" w:cs="Malgun Gothic" w:eastAsia="맑은 고딕" w:hAnsi="Malgun Gothic"/>
-          <w:b w:val="false"/>
-          <w:bCs w:val="false"/>
-        </w:rPr>
-        <w:t xml:space="preserve">카메라 트랩 기반 심층 모니터링은 3차년도 과제로 제안하며, 야생동물 전문가의 의견을 구한다.</w:t>
+        <w:t xml:space="preserve">1.1에서 설명한 여건에 따라 2차년도에는 전국자연환경조사 자료를 활용한 생물다양성 지수 분석을 우선 완성하고자 한다. 분석 결과는 한상훈 박사와 사례지를 한 차례 방문해 확인하고, 결론은 추가 연구가 필요한 과제로 정리할 예정이다. 자문 세부 내용은 자문 후 정리해 보고한다.</w:t>
       </w:r>
     </w:p>
     <w:p>
@@ -3839,7 +3822,7 @@
         <w:pStyle w:val="ListParagraph"/>
         <w:numPr>
           <w:ilvl w:val="0"/>
-          <w:numId w:val="2"/>
+          <w:numId w:val="3"/>
         </w:numPr>
         <w:spacing w:after="60"/>
       </w:pPr>
@@ -3857,7 +3840,7 @@
         <w:pStyle w:val="ListParagraph"/>
         <w:numPr>
           <w:ilvl w:val="0"/>
-          <w:numId w:val="2"/>
+          <w:numId w:val="3"/>
         </w:numPr>
         <w:spacing w:after="60"/>
       </w:pPr>
@@ -3875,7 +3858,7 @@
         <w:pStyle w:val="ListParagraph"/>
         <w:numPr>
           <w:ilvl w:val="0"/>
-          <w:numId w:val="2"/>
+          <w:numId w:val="3"/>
         </w:numPr>
         <w:spacing w:after="60"/>
       </w:pPr>
@@ -3893,7 +3876,7 @@
         <w:pStyle w:val="ListParagraph"/>
         <w:numPr>
           <w:ilvl w:val="0"/>
-          <w:numId w:val="2"/>
+          <w:numId w:val="3"/>
         </w:numPr>
         <w:spacing w:after="60"/>
       </w:pPr>
@@ -8712,7 +8695,7 @@
         <w:pStyle w:val="ListParagraph"/>
         <w:numPr>
           <w:ilvl w:val="0"/>
-          <w:numId w:val="2"/>
+          <w:numId w:val="3"/>
         </w:numPr>
         <w:spacing w:after="60"/>
       </w:pPr>
@@ -8730,7 +8713,7 @@
         <w:pStyle w:val="ListParagraph"/>
         <w:numPr>
           <w:ilvl w:val="0"/>
-          <w:numId w:val="2"/>
+          <w:numId w:val="3"/>
         </w:numPr>
         <w:spacing w:after="60"/>
       </w:pPr>
@@ -8748,7 +8731,7 @@
         <w:pStyle w:val="ListParagraph"/>
         <w:numPr>
           <w:ilvl w:val="0"/>
-          <w:numId w:val="2"/>
+          <w:numId w:val="3"/>
         </w:numPr>
         <w:spacing w:after="60"/>
       </w:pPr>
@@ -8766,7 +8749,7 @@
         <w:pStyle w:val="ListParagraph"/>
         <w:numPr>
           <w:ilvl w:val="0"/>
-          <w:numId w:val="2"/>
+          <w:numId w:val="3"/>
         </w:numPr>
         <w:spacing w:after="60"/>
       </w:pPr>
@@ -8818,9 +8801,9 @@
         </w:tblBorders>
       </w:tblPr>
       <w:tblGrid>
-        <w:gridCol w:w="1779"/>
-        <w:gridCol w:w="1186"/>
-        <w:gridCol w:w="6673"/>
+        <w:gridCol w:w="1606"/>
+        <w:gridCol w:w="1071"/>
+        <w:gridCol w:w="6961"/>
       </w:tblGrid>
       <w:tr>
         <w:trPr>
@@ -8828,7 +8811,7 @@
         </w:trPr>
         <w:tc>
           <w:tcPr>
-            <w:tcW w:type="dxa" w:w="1779"/>
+            <w:tcW w:type="dxa" w:w="1606"/>
             <w:tcBorders>
               <w:top w:val="single" w:color="BFC6BC" w:sz="4"/>
               <w:left w:val="single" w:color="BFC6BC" w:sz="4"/>
@@ -8861,7 +8844,7 @@
         </w:tc>
         <w:tc>
           <w:tcPr>
-            <w:tcW w:type="dxa" w:w="1186"/>
+            <w:tcW w:type="dxa" w:w="1071"/>
             <w:tcBorders>
               <w:top w:val="single" w:color="BFC6BC" w:sz="4"/>
               <w:left w:val="single" w:color="BFC6BC" w:sz="4"/>
@@ -8894,7 +8877,7 @@
         </w:tc>
         <w:tc>
           <w:tcPr>
-            <w:tcW w:type="dxa" w:w="6673"/>
+            <w:tcW w:type="dxa" w:w="6961"/>
             <w:tcBorders>
               <w:top w:val="single" w:color="BFC6BC" w:sz="4"/>
               <w:left w:val="single" w:color="BFC6BC" w:sz="4"/>
@@ -8932,7 +8915,7 @@
         </w:trPr>
         <w:tc>
           <w:tcPr>
-            <w:tcW w:type="dxa" w:w="1779"/>
+            <w:tcW w:type="dxa" w:w="1606"/>
             <w:tcBorders>
               <w:top w:val="single" w:color="BFC6BC" w:sz="4"/>
               <w:left w:val="single" w:color="BFC6BC" w:sz="4"/>
@@ -8964,7 +8947,7 @@
         </w:tc>
         <w:tc>
           <w:tcPr>
-            <w:tcW w:type="dxa" w:w="1186"/>
+            <w:tcW w:type="dxa" w:w="1071"/>
             <w:tcBorders>
               <w:top w:val="single" w:color="BFC6BC" w:sz="4"/>
               <w:left w:val="single" w:color="BFC6BC" w:sz="4"/>
@@ -8996,7 +8979,7 @@
         </w:tc>
         <w:tc>
           <w:tcPr>
-            <w:tcW w:type="dxa" w:w="6673"/>
+            <w:tcW w:type="dxa" w:w="6961"/>
             <w:tcBorders>
               <w:top w:val="single" w:color="BFC6BC" w:sz="4"/>
               <w:left w:val="single" w:color="BFC6BC" w:sz="4"/>
@@ -9033,7 +9016,7 @@
         </w:trPr>
         <w:tc>
           <w:tcPr>
-            <w:tcW w:type="dxa" w:w="1779"/>
+            <w:tcW w:type="dxa" w:w="1606"/>
             <w:tcBorders>
               <w:top w:val="single" w:color="BFC6BC" w:sz="4"/>
               <w:left w:val="single" w:color="BFC6BC" w:sz="4"/>
@@ -9065,7 +9048,7 @@
         </w:tc>
         <w:tc>
           <w:tcPr>
-            <w:tcW w:type="dxa" w:w="1186"/>
+            <w:tcW w:type="dxa" w:w="1071"/>
             <w:tcBorders>
               <w:top w:val="single" w:color="BFC6BC" w:sz="4"/>
               <w:left w:val="single" w:color="BFC6BC" w:sz="4"/>
@@ -9097,7 +9080,7 @@
         </w:tc>
         <w:tc>
           <w:tcPr>
-            <w:tcW w:type="dxa" w:w="6673"/>
+            <w:tcW w:type="dxa" w:w="6961"/>
             <w:tcBorders>
               <w:top w:val="single" w:color="BFC6BC" w:sz="4"/>
               <w:left w:val="single" w:color="BFC6BC" w:sz="4"/>
@@ -9134,7 +9117,7 @@
         </w:trPr>
         <w:tc>
           <w:tcPr>
-            <w:tcW w:type="dxa" w:w="1779"/>
+            <w:tcW w:type="dxa" w:w="1606"/>
             <w:tcBorders>
               <w:top w:val="single" w:color="BFC6BC" w:sz="4"/>
               <w:left w:val="single" w:color="BFC6BC" w:sz="4"/>
@@ -9166,7 +9149,7 @@
         </w:tc>
         <w:tc>
           <w:tcPr>
-            <w:tcW w:type="dxa" w:w="1186"/>
+            <w:tcW w:type="dxa" w:w="1071"/>
             <w:tcBorders>
               <w:top w:val="single" w:color="BFC6BC" w:sz="4"/>
               <w:left w:val="single" w:color="BFC6BC" w:sz="4"/>
@@ -9198,7 +9181,7 @@
         </w:tc>
         <w:tc>
           <w:tcPr>
-            <w:tcW w:type="dxa" w:w="6673"/>
+            <w:tcW w:type="dxa" w:w="6961"/>
             <w:tcBorders>
               <w:top w:val="single" w:color="BFC6BC" w:sz="4"/>
               <w:left w:val="single" w:color="BFC6BC" w:sz="4"/>
@@ -9235,7 +9218,7 @@
         </w:trPr>
         <w:tc>
           <w:tcPr>
-            <w:tcW w:type="dxa" w:w="1779"/>
+            <w:tcW w:type="dxa" w:w="1606"/>
             <w:tcBorders>
               <w:top w:val="single" w:color="BFC6BC" w:sz="4"/>
               <w:left w:val="single" w:color="BFC6BC" w:sz="4"/>
@@ -9267,7 +9250,7 @@
         </w:tc>
         <w:tc>
           <w:tcPr>
-            <w:tcW w:type="dxa" w:w="1186"/>
+            <w:tcW w:type="dxa" w:w="1071"/>
             <w:tcBorders>
               <w:top w:val="single" w:color="BFC6BC" w:sz="4"/>
               <w:left w:val="single" w:color="BFC6BC" w:sz="4"/>
@@ -9299,33 +9282,33 @@
         </w:tc>
         <w:tc>
           <w:tcPr>
-            <w:tcW w:type="dxa" w:w="6673"/>
-            <w:tcBorders>
-              <w:top w:val="single" w:color="BFC6BC" w:sz="4"/>
-              <w:left w:val="single" w:color="BFC6BC" w:sz="4"/>
-              <w:bottom w:val="single" w:color="BFC6BC" w:sz="4"/>
-              <w:right w:val="single" w:color="BFC6BC" w:sz="4"/>
-            </w:tcBorders>
-            <w:tcMar>
-              <w:top w:type="dxa" w:w="60"/>
-              <w:left w:type="dxa" w:w="100"/>
-              <w:bottom w:type="dxa" w:w="60"/>
-              <w:right w:type="dxa" w:w="100"/>
-            </w:tcMar>
-          </w:tcPr>
-          <w:p>
-            <w:pPr>
-              <w:spacing w:after="0" w:line="276"/>
-            </w:pPr>
-            <w:r>
-              <w:rPr>
-                <w:rFonts w:ascii="Malgun Gothic" w:cs="Malgun Gothic" w:eastAsia="맑은 고딕" w:hAnsi="Malgun Gothic"/>
-                <w:b w:val="false"/>
-                <w:bCs w:val="false"/>
-                <w:sz w:val="18"/>
-                <w:szCs w:val="18"/>
-              </w:rPr>
-              <w:t xml:space="preserve">변경. 토사유출은 WEPP로 대체, 생물다양성은 2차년도 현장조사 없음</w:t>
+            <w:tcW w:type="dxa" w:w="6961"/>
+            <w:tcBorders>
+              <w:top w:val="single" w:color="BFC6BC" w:sz="4"/>
+              <w:left w:val="single" w:color="BFC6BC" w:sz="4"/>
+              <w:bottom w:val="single" w:color="BFC6BC" w:sz="4"/>
+              <w:right w:val="single" w:color="BFC6BC" w:sz="4"/>
+            </w:tcBorders>
+            <w:tcMar>
+              <w:top w:type="dxa" w:w="60"/>
+              <w:left w:type="dxa" w:w="100"/>
+              <w:bottom w:type="dxa" w:w="60"/>
+              <w:right w:type="dxa" w:w="100"/>
+            </w:tcMar>
+          </w:tcPr>
+          <w:p>
+            <w:pPr>
+              <w:spacing w:after="0" w:line="276"/>
+            </w:pPr>
+            <w:r>
+              <w:rPr>
+                <w:rFonts w:ascii="Malgun Gothic" w:cs="Malgun Gothic" w:eastAsia="맑은 고딕" w:hAnsi="Malgun Gothic"/>
+                <w:b w:val="false"/>
+                <w:bCs w:val="false"/>
+                <w:sz w:val="18"/>
+                <w:szCs w:val="18"/>
+              </w:rPr>
+              <w:t xml:space="preserve">조정. 토사유출은 WEPP 예측과 문헌 실측값 보정, 생물다양성은 자연환경조사 자료 분석 중심</w:t>
             </w:r>
           </w:p>
         </w:tc>
@@ -9336,7 +9319,7 @@
         </w:trPr>
         <w:tc>
           <w:tcPr>
-            <w:tcW w:type="dxa" w:w="1779"/>
+            <w:tcW w:type="dxa" w:w="1606"/>
             <w:tcBorders>
               <w:top w:val="single" w:color="BFC6BC" w:sz="4"/>
               <w:left w:val="single" w:color="BFC6BC" w:sz="4"/>
@@ -9368,7 +9351,7 @@
         </w:tc>
         <w:tc>
           <w:tcPr>
-            <w:tcW w:type="dxa" w:w="1186"/>
+            <w:tcW w:type="dxa" w:w="1071"/>
             <w:tcBorders>
               <w:top w:val="single" w:color="BFC6BC" w:sz="4"/>
               <w:left w:val="single" w:color="BFC6BC" w:sz="4"/>
@@ -9400,7 +9383,7 @@
         </w:tc>
         <w:tc>
           <w:tcPr>
-            <w:tcW w:type="dxa" w:w="6673"/>
+            <w:tcW w:type="dxa" w:w="6961"/>
             <w:tcBorders>
               <w:top w:val="single" w:color="BFC6BC" w:sz="4"/>
               <w:left w:val="single" w:color="BFC6BC" w:sz="4"/>
@@ -9463,10 +9446,10 @@
         </w:tblBorders>
       </w:tblPr>
       <w:tblGrid>
-        <w:gridCol w:w="886"/>
-        <w:gridCol w:w="2548"/>
-        <w:gridCol w:w="4431"/>
-        <w:gridCol w:w="1773"/>
+        <w:gridCol w:w="701"/>
+        <w:gridCol w:w="2015"/>
+        <w:gridCol w:w="4731"/>
+        <w:gridCol w:w="2191"/>
       </w:tblGrid>
       <w:tr>
         <w:trPr>
@@ -9474,7 +9457,7 @@
         </w:trPr>
         <w:tc>
           <w:tcPr>
-            <w:tcW w:type="dxa" w:w="886"/>
+            <w:tcW w:type="dxa" w:w="701"/>
             <w:tcBorders>
               <w:top w:val="single" w:color="BFC6BC" w:sz="4"/>
               <w:left w:val="single" w:color="BFC6BC" w:sz="4"/>
@@ -9507,7 +9490,7 @@
         </w:tc>
         <w:tc>
           <w:tcPr>
-            <w:tcW w:type="dxa" w:w="2548"/>
+            <w:tcW w:type="dxa" w:w="2015"/>
             <w:tcBorders>
               <w:top w:val="single" w:color="BFC6BC" w:sz="4"/>
               <w:left w:val="single" w:color="BFC6BC" w:sz="4"/>
@@ -9540,7 +9523,7 @@
         </w:tc>
         <w:tc>
           <w:tcPr>
-            <w:tcW w:type="dxa" w:w="4431"/>
+            <w:tcW w:type="dxa" w:w="4731"/>
             <w:tcBorders>
               <w:top w:val="single" w:color="BFC6BC" w:sz="4"/>
               <w:left w:val="single" w:color="BFC6BC" w:sz="4"/>
@@ -9573,7 +9556,7 @@
         </w:tc>
         <w:tc>
           <w:tcPr>
-            <w:tcW w:type="dxa" w:w="1773"/>
+            <w:tcW w:type="dxa" w:w="2191"/>
             <w:tcBorders>
               <w:top w:val="single" w:color="BFC6BC" w:sz="4"/>
               <w:left w:val="single" w:color="BFC6BC" w:sz="4"/>
@@ -9611,7 +9594,7 @@
         </w:trPr>
         <w:tc>
           <w:tcPr>
-            <w:tcW w:type="dxa" w:w="886"/>
+            <w:tcW w:type="dxa" w:w="701"/>
             <w:tcBorders>
               <w:top w:val="single" w:color="BFC6BC" w:sz="4"/>
               <w:left w:val="single" w:color="BFC6BC" w:sz="4"/>
@@ -9643,7 +9626,7 @@
         </w:tc>
         <w:tc>
           <w:tcPr>
-            <w:tcW w:type="dxa" w:w="2548"/>
+            <w:tcW w:type="dxa" w:w="2015"/>
             <w:tcBorders>
               <w:top w:val="single" w:color="BFC6BC" w:sz="4"/>
               <w:left w:val="single" w:color="BFC6BC" w:sz="4"/>
@@ -9675,65 +9658,65 @@
         </w:tc>
         <w:tc>
           <w:tcPr>
-            <w:tcW w:type="dxa" w:w="4431"/>
-            <w:tcBorders>
-              <w:top w:val="single" w:color="BFC6BC" w:sz="4"/>
-              <w:left w:val="single" w:color="BFC6BC" w:sz="4"/>
-              <w:bottom w:val="single" w:color="BFC6BC" w:sz="4"/>
-              <w:right w:val="single" w:color="BFC6BC" w:sz="4"/>
-            </w:tcBorders>
-            <w:tcMar>
-              <w:top w:type="dxa" w:w="60"/>
-              <w:left w:type="dxa" w:w="100"/>
-              <w:bottom w:type="dxa" w:w="60"/>
-              <w:right w:type="dxa" w:w="100"/>
-            </w:tcMar>
-          </w:tcPr>
-          <w:p>
-            <w:pPr>
-              <w:spacing w:after="0" w:line="276"/>
-            </w:pPr>
-            <w:r>
-              <w:rPr>
-                <w:rFonts w:ascii="Malgun Gothic" w:cs="Malgun Gothic" w:eastAsia="맑은 고딕" w:hAnsi="Malgun Gothic"/>
-                <w:b w:val="false"/>
-                <w:bCs w:val="false"/>
-                <w:sz w:val="18"/>
-                <w:szCs w:val="18"/>
-              </w:rPr>
-              <w:t xml:space="preserve">WEPP 모의, 국내 실측 문헌값으로 대조</w:t>
-            </w:r>
-          </w:p>
-        </w:tc>
-        <w:tc>
-          <w:tcPr>
-            <w:tcW w:type="dxa" w:w="1773"/>
-            <w:tcBorders>
-              <w:top w:val="single" w:color="BFC6BC" w:sz="4"/>
-              <w:left w:val="single" w:color="BFC6BC" w:sz="4"/>
-              <w:bottom w:val="single" w:color="BFC6BC" w:sz="4"/>
-              <w:right w:val="single" w:color="BFC6BC" w:sz="4"/>
-            </w:tcBorders>
-            <w:tcMar>
-              <w:top w:type="dxa" w:w="60"/>
-              <w:left w:type="dxa" w:w="100"/>
-              <w:bottom w:type="dxa" w:w="60"/>
-              <w:right w:type="dxa" w:w="100"/>
-            </w:tcMar>
-          </w:tcPr>
-          <w:p>
-            <w:pPr>
-              <w:spacing w:after="0" w:line="276"/>
-            </w:pPr>
-            <w:r>
-              <w:rPr>
-                <w:rFonts w:ascii="Malgun Gothic" w:cs="Malgun Gothic" w:eastAsia="맑은 고딕" w:hAnsi="Malgun Gothic"/>
-                <w:b w:val="false"/>
-                <w:bCs w:val="false"/>
-                <w:sz w:val="18"/>
-                <w:szCs w:val="18"/>
-              </w:rPr>
-              <w:t xml:space="preserve">우기 이후 연구기간, 예산</w:t>
+            <w:tcW w:type="dxa" w:w="4731"/>
+            <w:tcBorders>
+              <w:top w:val="single" w:color="BFC6BC" w:sz="4"/>
+              <w:left w:val="single" w:color="BFC6BC" w:sz="4"/>
+              <w:bottom w:val="single" w:color="BFC6BC" w:sz="4"/>
+              <w:right w:val="single" w:color="BFC6BC" w:sz="4"/>
+            </w:tcBorders>
+            <w:tcMar>
+              <w:top w:type="dxa" w:w="60"/>
+              <w:left w:type="dxa" w:w="100"/>
+              <w:bottom w:type="dxa" w:w="60"/>
+              <w:right w:type="dxa" w:w="100"/>
+            </w:tcMar>
+          </w:tcPr>
+          <w:p>
+            <w:pPr>
+              <w:spacing w:after="0" w:line="276"/>
+            </w:pPr>
+            <w:r>
+              <w:rPr>
+                <w:rFonts w:ascii="Malgun Gothic" w:cs="Malgun Gothic" w:eastAsia="맑은 고딕" w:hAnsi="Malgun Gothic"/>
+                <w:b w:val="false"/>
+                <w:bCs w:val="false"/>
+                <w:sz w:val="18"/>
+                <w:szCs w:val="18"/>
+              </w:rPr>
+              <w:t xml:space="preserve">WEPP 모의, 국내 실측 문헌값으로 보정</w:t>
+            </w:r>
+          </w:p>
+        </w:tc>
+        <w:tc>
+          <w:tcPr>
+            <w:tcW w:type="dxa" w:w="2191"/>
+            <w:tcBorders>
+              <w:top w:val="single" w:color="BFC6BC" w:sz="4"/>
+              <w:left w:val="single" w:color="BFC6BC" w:sz="4"/>
+              <w:bottom w:val="single" w:color="BFC6BC" w:sz="4"/>
+              <w:right w:val="single" w:color="BFC6BC" w:sz="4"/>
+            </w:tcBorders>
+            <w:tcMar>
+              <w:top w:type="dxa" w:w="60"/>
+              <w:left w:type="dxa" w:w="100"/>
+              <w:bottom w:type="dxa" w:w="60"/>
+              <w:right w:type="dxa" w:w="100"/>
+            </w:tcMar>
+          </w:tcPr>
+          <w:p>
+            <w:pPr>
+              <w:spacing w:after="0" w:line="276"/>
+            </w:pPr>
+            <w:r>
+              <w:rPr>
+                <w:rFonts w:ascii="Malgun Gothic" w:cs="Malgun Gothic" w:eastAsia="맑은 고딕" w:hAnsi="Malgun Gothic"/>
+                <w:b w:val="false"/>
+                <w:bCs w:val="false"/>
+                <w:sz w:val="18"/>
+                <w:szCs w:val="18"/>
+              </w:rPr>
+              <w:t xml:space="preserve">연구 기간·예산·인력 여건, 우기 경과</w:t>
             </w:r>
           </w:p>
         </w:tc>
@@ -9744,7 +9727,7 @@
         </w:trPr>
         <w:tc>
           <w:tcPr>
-            <w:tcW w:type="dxa" w:w="886"/>
+            <w:tcW w:type="dxa" w:w="701"/>
             <w:tcBorders>
               <w:top w:val="single" w:color="BFC6BC" w:sz="4"/>
               <w:left w:val="single" w:color="BFC6BC" w:sz="4"/>
@@ -9776,7 +9759,7 @@
         </w:tc>
         <w:tc>
           <w:tcPr>
-            <w:tcW w:type="dxa" w:w="2548"/>
+            <w:tcW w:type="dxa" w:w="2015"/>
             <w:tcBorders>
               <w:top w:val="single" w:color="BFC6BC" w:sz="4"/>
               <w:left w:val="single" w:color="BFC6BC" w:sz="4"/>
@@ -9808,7 +9791,7 @@
         </w:tc>
         <w:tc>
           <w:tcPr>
-            <w:tcW w:type="dxa" w:w="4431"/>
+            <w:tcW w:type="dxa" w:w="4731"/>
             <w:tcBorders>
               <w:top w:val="single" w:color="BFC6BC" w:sz="4"/>
               <w:left w:val="single" w:color="BFC6BC" w:sz="4"/>
@@ -9840,7 +9823,7 @@
         </w:tc>
         <w:tc>
           <w:tcPr>
-            <w:tcW w:type="dxa" w:w="1773"/>
+            <w:tcW w:type="dxa" w:w="2191"/>
             <w:tcBorders>
               <w:top w:val="single" w:color="BFC6BC" w:sz="4"/>
               <w:left w:val="single" w:color="BFC6BC" w:sz="4"/>
@@ -9877,7 +9860,7 @@
         </w:trPr>
         <w:tc>
           <w:tcPr>
-            <w:tcW w:type="dxa" w:w="886"/>
+            <w:tcW w:type="dxa" w:w="701"/>
             <w:tcBorders>
               <w:top w:val="single" w:color="BFC6BC" w:sz="4"/>
               <w:left w:val="single" w:color="BFC6BC" w:sz="4"/>
@@ -9909,7 +9892,7 @@
         </w:tc>
         <w:tc>
           <w:tcPr>
-            <w:tcW w:type="dxa" w:w="2548"/>
+            <w:tcW w:type="dxa" w:w="2015"/>
             <w:tcBorders>
               <w:top w:val="single" w:color="BFC6BC" w:sz="4"/>
               <w:left w:val="single" w:color="BFC6BC" w:sz="4"/>
@@ -9941,7 +9924,7 @@
         </w:tc>
         <w:tc>
           <w:tcPr>
-            <w:tcW w:type="dxa" w:w="4431"/>
+            <w:tcW w:type="dxa" w:w="4731"/>
             <w:tcBorders>
               <w:top w:val="single" w:color="BFC6BC" w:sz="4"/>
               <w:left w:val="single" w:color="BFC6BC" w:sz="4"/>
@@ -9973,7 +9956,7 @@
         </w:tc>
         <w:tc>
           <w:tcPr>
-            <w:tcW w:type="dxa" w:w="1773"/>
+            <w:tcW w:type="dxa" w:w="2191"/>
             <w:tcBorders>
               <w:top w:val="single" w:color="BFC6BC" w:sz="4"/>
               <w:left w:val="single" w:color="BFC6BC" w:sz="4"/>
@@ -10010,7 +9993,7 @@
         </w:trPr>
         <w:tc>
           <w:tcPr>
-            <w:tcW w:type="dxa" w:w="886"/>
+            <w:tcW w:type="dxa" w:w="701"/>
             <w:tcBorders>
               <w:top w:val="single" w:color="BFC6BC" w:sz="4"/>
               <w:left w:val="single" w:color="BFC6BC" w:sz="4"/>
@@ -10042,7 +10025,7 @@
         </w:tc>
         <w:tc>
           <w:tcPr>
-            <w:tcW w:type="dxa" w:w="2548"/>
+            <w:tcW w:type="dxa" w:w="2015"/>
             <w:tcBorders>
               <w:top w:val="single" w:color="BFC6BC" w:sz="4"/>
               <w:left w:val="single" w:color="BFC6BC" w:sz="4"/>
@@ -10074,65 +10057,65 @@
         </w:tc>
         <w:tc>
           <w:tcPr>
-            <w:tcW w:type="dxa" w:w="4431"/>
-            <w:tcBorders>
-              <w:top w:val="single" w:color="BFC6BC" w:sz="4"/>
-              <w:left w:val="single" w:color="BFC6BC" w:sz="4"/>
-              <w:bottom w:val="single" w:color="BFC6BC" w:sz="4"/>
-              <w:right w:val="single" w:color="BFC6BC" w:sz="4"/>
-            </w:tcBorders>
-            <w:tcMar>
-              <w:top w:type="dxa" w:w="60"/>
-              <w:left w:type="dxa" w:w="100"/>
-              <w:bottom w:type="dxa" w:w="60"/>
-              <w:right w:type="dxa" w:w="100"/>
-            </w:tcMar>
-          </w:tcPr>
-          <w:p>
-            <w:pPr>
-              <w:spacing w:after="0" w:line="276"/>
-            </w:pPr>
-            <w:r>
-              <w:rPr>
-                <w:rFonts w:ascii="Malgun Gothic" w:cs="Malgun Gothic" w:eastAsia="맑은 고딕" w:hAnsi="Malgun Gothic"/>
-                <w:b w:val="false"/>
-                <w:bCs w:val="false"/>
-                <w:sz w:val="18"/>
-                <w:szCs w:val="18"/>
-              </w:rPr>
-              <w:t xml:space="preserve">현장조사 없이 자연환경조사 자료로 지수 분석, 전문가와 사례지 1회 확인</w:t>
-            </w:r>
-          </w:p>
-        </w:tc>
-        <w:tc>
-          <w:tcPr>
-            <w:tcW w:type="dxa" w:w="1773"/>
-            <w:tcBorders>
-              <w:top w:val="single" w:color="BFC6BC" w:sz="4"/>
-              <w:left w:val="single" w:color="BFC6BC" w:sz="4"/>
-              <w:bottom w:val="single" w:color="BFC6BC" w:sz="4"/>
-              <w:right w:val="single" w:color="BFC6BC" w:sz="4"/>
-            </w:tcBorders>
-            <w:tcMar>
-              <w:top w:type="dxa" w:w="60"/>
-              <w:left w:type="dxa" w:w="100"/>
-              <w:bottom w:type="dxa" w:w="60"/>
-              <w:right w:type="dxa" w:w="100"/>
-            </w:tcMar>
-          </w:tcPr>
-          <w:p>
-            <w:pPr>
-              <w:spacing w:after="0" w:line="276"/>
-            </w:pPr>
-            <w:r>
-              <w:rPr>
-                <w:rFonts w:ascii="Malgun Gothic" w:cs="Malgun Gothic" w:eastAsia="맑은 고딕" w:hAnsi="Malgun Gothic"/>
-                <w:b w:val="false"/>
-                <w:bCs w:val="false"/>
-                <w:sz w:val="18"/>
-                <w:szCs w:val="18"/>
-              </w:rPr>
-              <w:t xml:space="preserve">초기 단계, 예산 한정</w:t>
+            <w:tcW w:type="dxa" w:w="4731"/>
+            <w:tcBorders>
+              <w:top w:val="single" w:color="BFC6BC" w:sz="4"/>
+              <w:left w:val="single" w:color="BFC6BC" w:sz="4"/>
+              <w:bottom w:val="single" w:color="BFC6BC" w:sz="4"/>
+              <w:right w:val="single" w:color="BFC6BC" w:sz="4"/>
+            </w:tcBorders>
+            <w:tcMar>
+              <w:top w:type="dxa" w:w="60"/>
+              <w:left w:type="dxa" w:w="100"/>
+              <w:bottom w:type="dxa" w:w="60"/>
+              <w:right w:type="dxa" w:w="100"/>
+            </w:tcMar>
+          </w:tcPr>
+          <w:p>
+            <w:pPr>
+              <w:spacing w:after="0" w:line="276"/>
+            </w:pPr>
+            <w:r>
+              <w:rPr>
+                <w:rFonts w:ascii="Malgun Gothic" w:cs="Malgun Gothic" w:eastAsia="맑은 고딕" w:hAnsi="Malgun Gothic"/>
+                <w:b w:val="false"/>
+                <w:bCs w:val="false"/>
+                <w:sz w:val="18"/>
+                <w:szCs w:val="18"/>
+              </w:rPr>
+              <w:t xml:space="preserve">자연환경조사 자료로 지수 분석, 전문가와 사례지 1회 확인. 카메라 트랩 모니터링은 3차년도 제안</w:t>
+            </w:r>
+          </w:p>
+        </w:tc>
+        <w:tc>
+          <w:tcPr>
+            <w:tcW w:type="dxa" w:w="2191"/>
+            <w:tcBorders>
+              <w:top w:val="single" w:color="BFC6BC" w:sz="4"/>
+              <w:left w:val="single" w:color="BFC6BC" w:sz="4"/>
+              <w:bottom w:val="single" w:color="BFC6BC" w:sz="4"/>
+              <w:right w:val="single" w:color="BFC6BC" w:sz="4"/>
+            </w:tcBorders>
+            <w:tcMar>
+              <w:top w:type="dxa" w:w="60"/>
+              <w:left w:type="dxa" w:w="100"/>
+              <w:bottom w:type="dxa" w:w="60"/>
+              <w:right w:type="dxa" w:w="100"/>
+            </w:tcMar>
+          </w:tcPr>
+          <w:p>
+            <w:pPr>
+              <w:spacing w:after="0" w:line="276"/>
+            </w:pPr>
+            <w:r>
+              <w:rPr>
+                <w:rFonts w:ascii="Malgun Gothic" w:cs="Malgun Gothic" w:eastAsia="맑은 고딕" w:hAnsi="Malgun Gothic"/>
+                <w:b w:val="false"/>
+                <w:bCs w:val="false"/>
+                <w:sz w:val="18"/>
+                <w:szCs w:val="18"/>
+              </w:rPr>
+              <w:t xml:space="preserve">야생동물의 높은 이동성, 연구 기간·예산 여건</w:t>
             </w:r>
           </w:p>
         </w:tc>
@@ -10682,7 +10665,7 @@
         <w:pStyle w:val="ListParagraph"/>
         <w:numPr>
           <w:ilvl w:val="0"/>
-          <w:numId w:val="2"/>
+          <w:numId w:val="3"/>
         </w:numPr>
         <w:spacing w:after="60"/>
       </w:pPr>
@@ -10698,7 +10681,7 @@
         <w:pStyle w:val="ListParagraph"/>
         <w:numPr>
           <w:ilvl w:val="0"/>
-          <w:numId w:val="2"/>
+          <w:numId w:val="3"/>
         </w:numPr>
         <w:spacing w:after="60"/>
       </w:pPr>
@@ -10714,7 +10697,7 @@
         <w:pStyle w:val="ListParagraph"/>
         <w:numPr>
           <w:ilvl w:val="0"/>
-          <w:numId w:val="2"/>
+          <w:numId w:val="3"/>
         </w:numPr>
         <w:spacing w:after="60"/>
       </w:pPr>
@@ -10730,7 +10713,7 @@
         <w:pStyle w:val="ListParagraph"/>
         <w:numPr>
           <w:ilvl w:val="0"/>
-          <w:numId w:val="2"/>
+          <w:numId w:val="3"/>
         </w:numPr>
         <w:spacing w:after="60"/>
       </w:pPr>
@@ -10746,7 +10729,7 @@
         <w:pStyle w:val="ListParagraph"/>
         <w:numPr>
           <w:ilvl w:val="0"/>
-          <w:numId w:val="2"/>
+          <w:numId w:val="3"/>
         </w:numPr>
         <w:spacing w:after="60"/>
       </w:pPr>
@@ -10762,7 +10745,7 @@
         <w:pStyle w:val="ListParagraph"/>
         <w:numPr>
           <w:ilvl w:val="0"/>
-          <w:numId w:val="2"/>
+          <w:numId w:val="3"/>
         </w:numPr>
         <w:spacing w:after="60"/>
       </w:pPr>
@@ -10778,7 +10761,7 @@
         <w:pStyle w:val="ListParagraph"/>
         <w:numPr>
           <w:ilvl w:val="0"/>
-          <w:numId w:val="2"/>
+          <w:numId w:val="3"/>
         </w:numPr>
         <w:spacing w:after="60"/>
       </w:pPr>
@@ -10794,7 +10777,7 @@
         <w:pStyle w:val="ListParagraph"/>
         <w:numPr>
           <w:ilvl w:val="0"/>
-          <w:numId w:val="2"/>
+          <w:numId w:val="3"/>
         </w:numPr>
         <w:spacing w:after="60"/>
       </w:pPr>
@@ -11060,13 +11043,13 @@
     </w:lvlOverride>
   </w:num>
   <w:num w:numId="2">
-    <w:abstractNumId w:val="2"/>
+    <w:abstractNumId w:val="3"/>
     <w:lvlOverride w:ilvl="0">
       <w:startOverride w:val="1"/>
     </w:lvlOverride>
   </w:num>
   <w:num w:numId="3">
-    <w:abstractNumId w:val="3"/>
+    <w:abstractNumId w:val="2"/>
     <w:lvlOverride w:ilvl="0">
       <w:startOverride w:val="1"/>
     </w:lvlOverride>

</xml_diff>

<commit_message>
Remove repeated content and record submitted information request text
Co-Authored-By: Claude Opus 5.5 <noreply@anthropic.com>
Claude-Session: https://claude.ai/code/session_011DrJSR3zzQAfuEGwbEcRfw
</commit_message>
<xml_diff>
--- a/reports/2026-10_RQ1_월간보고.docx
+++ b/reports/2026-10_RQ1_월간보고.docx
@@ -215,7 +215,7 @@
           <w:b w:val="false"/>
           <w:bCs w:val="false"/>
         </w:rPr>
-        <w:t xml:space="preserve">이번 보고는 토사유출 분석 방법, 생물다양성 분석 범위, 사례지 선정을 위한 정보공개 청구 계획을 다룬다. 특히 착수보고서에서 계획한 현장조사의 조정 방향을 함께 보고한다.</w:t>
+        <w:t xml:space="preserve">이번 보고는 착수보고서에서 계획한 현장조사의 조정 방향과, 이에 따른 토사유출 분석 방법(2장), 생물다양성 분석 범위(3장), 사례지 선정을 위한 정보공개 청구(4장)를 다룬다.</w:t>
       </w:r>
     </w:p>
     <w:p>
@@ -228,7 +228,7 @@
           <w:b w:val="false"/>
           <w:bCs w:val="false"/>
         </w:rPr>
-        <w:t xml:space="preserve">1.1 현장조사 계획의 조정</w:t>
+        <w:t xml:space="preserve">현장조사 계획의 조정</w:t>
       </w:r>
     </w:p>
     <w:p>
@@ -262,7 +262,7 @@
           <w:b w:val="false"/>
           <w:bCs w:val="false"/>
         </w:rPr>
-        <w:t xml:space="preserve">: 선행 연구는 WEPP와 같은 예측 모형과 함께 현장에 실트펜스를 설치해 토사유출량을 실측하는 방식으로 수행되어 왔다. 그러나 사례지에 실트펜스를 설치하고 주기적으로 방문해 유출량을 측정하는 것은 현재 여건에서 어렵다고 판단하였으며, 우기가 이미 지난 점도 현장조사의 제약이다. 토양의 물리·화학적 특성 분석 역시 본 연구의 예산 범위에서는 쉽지 않을 것으로 보인다. 이에 본 연구는 WEPP 예측 모형으로 토사유출량을 추정하고, 국내 문헌의 실측값으로 보정하는 방향으로 진행하고자 한다(2.5 참조).</w:t>
+        <w:t xml:space="preserve">: 선행 연구는 WEPP와 같은 예측 모형과 함께 현장에 실트펜스를 설치해 토사유출량을 실측하는 방식으로 수행되어 왔다. 그러나 사례지에 실트펜스를 설치하고 주기적으로 방문해 유출량을 측정하는 것은 현재 여건에서 어렵다고 판단하였으며, 우기가 이미 지난 점도 현장조사의 제약이다. 토양의 물리·화학적 특성 분석 역시 본 연구의 예산 범위에서는 쉽지 않을 것으로 보인다. 이에 본 연구는 WEPP 예측 모형으로 토사유출량을 추정하고, 국내 문헌의 실측값으로 보정하는 방향으로 진행하고자 한다.</w:t>
       </w:r>
     </w:p>
     <w:p>
@@ -296,33 +296,7 @@
           <w:b w:val="false"/>
           <w:bCs w:val="false"/>
         </w:rPr>
-        <w:t xml:space="preserve">한상훈 박사는 현재 참나무 숲에 무인 카메라 8대를 설치해 겨울까지 3~4개월간 모니터링하고 있다. 본 연구 사례지에도 설치가 가능한지 의견을 듣고, 카메라 트랩 기반 심층 분석은 3차년도 과제로 제안하고자 한다. 이번 연차에는 환경부 전국자연환경조사 자료의 활용 방안에 대해 자문을 받고, 이 자료를 활용해 생물다양성 변화를 분석할 계획이다(3장 참조).</w:t>
-      </w:r>
-    </w:p>
-    <w:p>
-      <w:pPr>
-        <w:pStyle w:val="Heading2"/>
-      </w:pPr>
-      <w:r>
-        <w:rPr>
-          <w:rFonts w:ascii="Malgun Gothic" w:cs="Malgun Gothic" w:eastAsia="맑은 고딕" w:hAnsi="Malgun Gothic"/>
-          <w:b w:val="false"/>
-          <w:bCs w:val="false"/>
-        </w:rPr>
-        <w:t xml:space="preserve">1.2 사례지 선정</w:t>
-      </w:r>
-    </w:p>
-    <w:p>
-      <w:pPr>
-        <w:spacing w:after="120"/>
-      </w:pPr>
-      <w:r>
-        <w:rPr>
-          <w:rFonts w:ascii="Malgun Gothic" w:cs="Malgun Gothic" w:eastAsia="맑은 고딕" w:hAnsi="Malgun Gothic"/>
-          <w:b w:val="false"/>
-          <w:bCs w:val="false"/>
-        </w:rPr>
-        <w:t xml:space="preserve">사례지는 벌채 실적을 먼저 살펴 정한다. 국유림 목재매각실적 상위 2곳인 동부·북부지방산림청에 정보공개를 청구하고, 받은 자료로 관리소와 소반을 선정할 계획이다(4장 참조).</w:t>
+        <w:t xml:space="preserve">한상훈 박사는 현재 참나무 숲에 무인 카메라 8대를 설치해 겨울까지 3~4개월간 모니터링하고 있다. 본 연구 사례지에도 설치가 가능한지 의견을 듣고, 카메라 트랩 기반 심층 분석은 3차년도 과제로 제안하고자 한다. 이번 연차에는 환경부 전국자연환경조사 자료의 활용 방안에 대해 자문을 받고, 이 자료를 활용해 생물다양성 변화를 분석할 계획이다. 분석 결과는 한상훈 박사와 사례지를 한 차례 방문해 확인하고, 결론은 추가 연구가 필요한 과제로 정리할 예정이다.</w:t>
       </w:r>
     </w:p>
     <w:p>
@@ -1126,7 +1100,7 @@
     </w:p>
     <w:p>
       <w:pPr>
-        <w:pStyle w:val="Heading2"/>
+        <w:spacing w:after="120"/>
       </w:pPr>
       <w:r>
         <w:rPr>
@@ -1134,12 +1108,12 @@
           <w:b w:val="false"/>
           <w:bCs w:val="false"/>
         </w:rPr>
-        <w:t xml:space="preserve">2.3 국내 집재 방식과 토양 영향</w:t>
-      </w:r>
-    </w:p>
-    <w:p>
-      <w:pPr>
-        <w:spacing w:after="120"/>
+        <w:t xml:space="preserve">특히 작업로가 등고선 방향이 아닌 경사 방향으로 나면 그 자체가 물길이 되어 침식이 빨라진다.</w:t>
+      </w:r>
+    </w:p>
+    <w:p>
+      <w:pPr>
+        <w:pStyle w:val="Heading2"/>
       </w:pPr>
       <w:r>
         <w:rPr>
@@ -1147,7 +1121,20 @@
           <w:b w:val="false"/>
           <w:bCs w:val="false"/>
         </w:rPr>
-        <w:t xml:space="preserve">이학준 교수(상지대) 자문에 따르면 국내 벌채 현장의 약 99%는 우드그랩 방식으로 집재한다. 굴착기에 집게를 달아 쓸 만한 재목은 던져 모으고 쓸모없는 것은 버리는 방식으로, 등고선 방향이 아닌 경사 방향(수직)으로 작업한다. 임지 표면 교란이 심해 작업 후 민둥산에 가까운 상태가 되며, 이 방식을 다룬 연구 자료는 많지 않다. 하베스터·포워더 방식은 장비가 비싸고 운전 인력 교육이 필요해 완경사지 일부와 연구용으로만 쓰인다. 경사 방향으로 난 작업로는 강우 시 그 자체가 물길이 되어 침식을 빠르게 한다.</w:t>
+        <w:t xml:space="preserve">2.3 국내 집재 방식과 토양 영향</w:t>
+      </w:r>
+    </w:p>
+    <w:p>
+      <w:pPr>
+        <w:spacing w:after="120"/>
+      </w:pPr>
+      <w:r>
+        <w:rPr>
+          <w:rFonts w:ascii="Malgun Gothic" w:cs="Malgun Gothic" w:eastAsia="맑은 고딕" w:hAnsi="Malgun Gothic"/>
+          <w:b w:val="false"/>
+          <w:bCs w:val="false"/>
+        </w:rPr>
+        <w:t xml:space="preserve">이학준 교수(상지대) 자문에 따르면 국내 벌채 현장의 약 99%는 우드그랩 방식으로 집재한다. 굴착기에 집게를 달아 쓸 만한 재목은 던져 모으고 쓸모없는 것은 버리는 방식으로, 등고선 방향이 아닌 경사 방향(수직)으로 작업한다. 임지 표면 교란이 심해 작업 후 민둥산에 가까운 상태가 되며, 이 방식을 다룬 연구 자료는 많지 않다. 하베스터·포워더 방식은 장비가 비싸고 운전 인력 교육이 필요해 완경사지 일부와 연구용으로만 쓰인다.</w:t>
       </w:r>
     </w:p>
     <w:p>
@@ -1871,7 +1858,7 @@
           <w:b w:val="false"/>
           <w:bCs w:val="false"/>
         </w:rPr>
-        <w:t xml:space="preserve">임도·작업로 설치와 벌목은 경사가 급하고 집중호우가 잦은 한국·일본에서 산사태 등 재난을 키우는 요인이다(홍석환·안미연, 2025). 산림작업은 대부분 임도에서 500m 이내(Cha et al., 1998), 벌목·조림은 200m 이내(Norihiko, 1994)에 집중된다. 그러나 국유림 경영비용 산정에서 벌목지의 사방사업비와 재해 복구·복원비는 정량화가 어려워 빠져 있다(홍석환·안미연, 2025). 본 연구는 이 토사유출 영향을 벌기령 시나리오별 범위값으로 산정해 RQ2·RQ3의 외부환경비용 산정에 넘긴다.</w:t>
+        <w:t xml:space="preserve">임도·작업로 설치와 벌목은 경사가 급하고 집중호우가 잦은 한국·일본에서 산사태 등 재난을 키우는 요인이다(홍석환·안미연, 2025). 산림작업은 대부분 임도에서 500m 이내(Cha et al., 1998), 벌목·조림은 200m 이내(Norihiko, 1994)에 집중된다. 즉 벌채가 많은 곳에 임도가 많이 개설되고, 임도가 많은 곳에 토사유출과 산사태가 많이 발생하며, 산사태가 발생했거나 위험이 있는 곳에서 산지사방사업이 시행된다.</w:t>
       </w:r>
     </w:p>
     <w:p>
@@ -1884,7 +1871,7 @@
           <w:b w:val="false"/>
           <w:bCs w:val="false"/>
         </w:rPr>
-        <w:t xml:space="preserve">재해복구비와 사방사업비가 경영비용에 들어가지 않았으므로, 이것이 외부환경비용에 해당함을 보이려면 추가 분석이 필요하다. 정보공개로 사방사업지 자료를 얻으면 사방사업지와 벌채지의 공간통계분석을 수행해 두 지역이 얼마나 상관관계가 있는지 확인한다.</w:t>
+        <w:t xml:space="preserve">그러나 국유림 경영비용 산정에서 벌목지의 사방사업비와 재해 복구·복원비는 정량화가 어려워 빠져 있다(홍석환·안미연, 2025). 이 비용이 외부환경비용에 해당함을 보이려면 추가 분석이 필요하다. 정보공개로 사방사업지 자료를 얻으면 사방사업지와 벌채지의 공간통계분석을 수행해 두 지역의 상관관계를 확인한다. 본 연구는 이러한 토사유출 영향을 벌기령 시나리오별 범위값으로 산정해 RQ2·RQ3의 외부환경비용 산정에 넘긴다.</w:t>
       </w:r>
     </w:p>
     <w:p>
@@ -1910,7 +1897,7 @@
           <w:b w:val="false"/>
           <w:bCs w:val="false"/>
         </w:rPr>
-        <w:t xml:space="preserve">1.1에서 설명한 여건에 따라 토사유출은 물리 기반 모형인 WEPP로 추정하고, 국내 실측값으로 보정한다. 여러 토양침식 모형 가운데 WEPP를 선택한 이유와 적용 계획은 다음과 같다.</w:t>
+        <w:t xml:space="preserve">토양침식 모형 가운데 물리 기반 모형인 WEPP를 선택한 이유와 적용 계획은 다음과 같다.</w:t>
       </w:r>
     </w:p>
     <w:p>
@@ -3110,7 +3097,7 @@
           <w:b w:val="false"/>
           <w:bCs w:val="false"/>
         </w:rPr>
-        <w:t xml:space="preserve">모형 검증에는 모니터링 자료가 필요하다(이학준 자문). 본 연구는 국내 실측값(Lee et al., 2022)과 국외 문헌 범위로 대조하고, WEPP가 약한 노면 값은 국내 실측값으로 보정한다. 이 한계는 결과와 함께 명시한다.</w:t>
+        <w:t xml:space="preserve">모형 검증에는 모니터링 자료가 필요하다(이학준 자문). 표 2의 국내 실측값(Lee et al., 2022)과 국외 문헌 범위로 대조하고, WEPP 정확도가 낮은 노면 값은 국내 실측값으로 보정한다. 이 한계는 결과와 함께 명시한다.</w:t>
       </w:r>
     </w:p>
     <w:p>
@@ -3605,7 +3592,7 @@
           <w:b w:val="false"/>
           <w:bCs w:val="false"/>
         </w:rPr>
-        <w:t xml:space="preserve">3.1 2차년도 분석 범위</w:t>
+        <w:t xml:space="preserve">3.1 활용 자료</w:t>
       </w:r>
     </w:p>
     <w:p>
@@ -3618,7 +3605,7 @@
           <w:b w:val="false"/>
           <w:bCs w:val="false"/>
         </w:rPr>
-        <w:t xml:space="preserve">1.1에서 설명한 여건에 따라 2차년도에는 전국자연환경조사 자료를 활용한 생물다양성 지수 분석을 우선 완성하고자 한다. 분석 결과는 한상훈 박사와 사례지를 한 차례 방문해 확인하고, 결론은 추가 연구가 필요한 과제로 정리할 예정이다. 자문 세부 내용은 자문 후 정리해 보고한다.</w:t>
+        <w:t xml:space="preserve">제5차 전국자연환경조사(2019~2023)는 식물, 조류, 포유류, 어류, 저서성대형무척추동물, 양서파충류, 곤충 7개 분류군의 출현 위치를 좌표가 있는 공간정보 파일로 제공한다. 착수보고서에서도 이 자료로 국내 여건에 맞는 값을 보완하도록 계획하였다. 사례지 벌채이력과 겹치는 조사지점을 이용하면 벌채 후 경과연수별 분류군 출현을 국내 자료로 비교할 수 있다.</w:t>
       </w:r>
     </w:p>
     <w:p>
@@ -3631,33 +3618,7 @@
           <w:b w:val="false"/>
           <w:bCs w:val="false"/>
         </w:rPr>
-        <w:t xml:space="preserve">3.2 활용 자료</w:t>
-      </w:r>
-    </w:p>
-    <w:p>
-      <w:pPr>
-        <w:spacing w:after="120"/>
-      </w:pPr>
-      <w:r>
-        <w:rPr>
-          <w:rFonts w:ascii="Malgun Gothic" w:cs="Malgun Gothic" w:eastAsia="맑은 고딕" w:hAnsi="Malgun Gothic"/>
-          <w:b w:val="false"/>
-          <w:bCs w:val="false"/>
-        </w:rPr>
-        <w:t xml:space="preserve">제5차 전국자연환경조사(2019~2023)는 식물, 조류, 포유류, 어류, 저서성대형무척추동물, 양서파충류, 곤충 7개 분류군의 출현 위치를 좌표가 있는 공간정보 파일로 제공한다. 착수보고서에서도 이 자료로 국내 여건에 맞는 값을 보완하도록 계획하였다. 사례지 벌채이력과 겹치는 조사지점을 이용하면 벌채 후 경과연수별 분류군 출현을 국내 자료로 비교할 수 있다.</w:t>
-      </w:r>
-    </w:p>
-    <w:p>
-      <w:pPr>
-        <w:pStyle w:val="Heading2"/>
-      </w:pPr>
-      <w:r>
-        <w:rPr>
-          <w:rFonts w:ascii="Malgun Gothic" w:cs="Malgun Gothic" w:eastAsia="맑은 고딕" w:hAnsi="Malgun Gothic"/>
-          <w:b w:val="false"/>
-          <w:bCs w:val="false"/>
-        </w:rPr>
-        <w:t xml:space="preserve">3.3 분석 절차</w:t>
+        <w:t xml:space="preserve">3.2 분석 절차</w:t>
       </w:r>
     </w:p>
     <w:p>
@@ -3814,7 +3775,7 @@
           <w:b w:val="false"/>
           <w:bCs w:val="false"/>
         </w:rPr>
-        <w:t xml:space="preserve">3.4 자료의 한계와 대응</w:t>
+        <w:t xml:space="preserve">3.3 자료의 한계와 대응</w:t>
       </w:r>
     </w:p>
     <w:p>
@@ -3925,7 +3886,7 @@
           <w:b w:val="false"/>
           <w:bCs w:val="false"/>
         </w:rPr>
-        <w:t xml:space="preserve">벌채가 많은 곳에 임도가 많이 개설되고, 임도가 많은 곳에 토사유출과 산사태가 많이 발생하며, 산사태가 발생했거나 위험이 있는 곳에서 산지사방사업이 시행된다. 따라서 벌채 실적을 먼저 관찰하고, 국유림별로 벌채 실적이 많은 곳을 사례분석지역으로 정한다. 요청 정보는 산림경영정보시스템에 기록되는 항목을 기준으로 구체적으로 정리해 요구한다.</w:t>
+        <w:t xml:space="preserve">2.4에서 본 것처럼 벌채, 임도 개설, 토사유출·산사태, 산지사방사업은 서로 연결된다. 따라서 벌채 실적을 먼저 관찰하고, 국유림별로 벌채 실적이 많은 곳을 사례분석지역으로 정한다. 요청 정보는 산림경영정보시스템에 기록되는 항목을 기준으로 구체적으로 정리해 요구한다.</w:t>
       </w:r>
     </w:p>
     <w:p>
@@ -8013,7 +7974,7 @@
           <w:b w:val="false"/>
           <w:bCs w:val="false"/>
         </w:rPr>
-        <w:t xml:space="preserve">10월 중순 동부·북부지방산림청에 같은 내용으로 각각 1회 청구한다. 처리 기간은 10일이며 최대 10일 연장될 수 있다. 사전 문의 없이 청구하므로 요청 항목은 산림경영계획서 기재요령의 항목명으로 적고, 보유하지 않은 항목은 부존재 처리 후 나머지를 제공해 달라고 명시한다. 대상 기간은 보유 전체이며 엑셀(공간자료 SHP)로 요청한다. 매수자 상호·계약 금액·개인정보·소득사업 자료는 요청하지 않는다.</w:t>
+        <w:t xml:space="preserve">동부·북부지방산림청에 아래 내용으로 각각 정보공개를 청구하였다(처리 기간 10일, 최대 10일 연장). 사전 문의 없이 청구하였으므로 요청 항목은 산림경영계획서 기재요령의 항목명으로 적었다.</w:t>
       </w:r>
     </w:p>
     <w:p>
@@ -8026,7 +7987,272 @@
           <w:b w:val="false"/>
           <w:bCs w:val="false"/>
         </w:rPr>
-        <w:t xml:space="preserve">표 8. 청구 항목과 활용</w:t>
+        <w:t xml:space="preserve">청구 내용</w:t>
+      </w:r>
+    </w:p>
+    <w:p>
+      <w:pPr>
+        <w:shd w:fill="F1F3EE" w:color="auto" w:val="clear"/>
+        <w:spacing w:after="0" w:before="0"/>
+        <w:ind w:left="170" w:right="170"/>
+        <w:jc w:val="left"/>
+      </w:pPr>
+      <w:r>
+        <w:rPr>
+          <w:rFonts w:ascii="Malgun Gothic" w:cs="Malgun Gothic" w:eastAsia="맑은 고딕" w:hAnsi="Malgun Gothic"/>
+          <w:b w:val="false"/>
+          <w:bCs w:val="false"/>
+        </w:rPr>
+        <w:t xml:space="preserve">귀 기관 산하 국유림관리소의 수확벌채 실적과 산림경영 자료를 아래와 같이 요청드립니다. 자료는 산림경영정보시스템 등 귀 기관이 보유한 항목을 기준으로 제공해 주시고, 보유하지 않은 항목은 부존재로 처리하신 뒤 나머지 자료를 제공해 주시기 바랍니다. 대상 기간은 귀 기관이 보유한 전체 기간이며, 엑셀 파일(공간자료는 SHP 파일)로 받기를 희망합니다.</w:t>
+      </w:r>
+    </w:p>
+    <w:p>
+      <w:pPr>
+        <w:shd w:fill="F1F3EE" w:color="auto" w:val="clear"/>
+        <w:spacing w:after="0" w:before="0"/>
+        <w:ind w:left="170" w:right="170"/>
+        <w:jc w:val="left"/>
+      </w:pPr>
+      <w:r>
+        <w:rPr>
+          <w:rFonts w:ascii="Malgun Gothic" w:cs="Malgun Gothic" w:eastAsia="맑은 고딕" w:hAnsi="Malgun Gothic"/>
+          <w:b w:val="false"/>
+          <w:bCs w:val="false"/>
+        </w:rPr>
+        <w:t xml:space="preserve">1. 벌채 실적: 산하 국유림관리소별·연도별 목재매각(수확벌채) 계약건수, 벌채면적(ha), 벌채 입목재적(㎥)을 요청합니다.</w:t>
+      </w:r>
+    </w:p>
+    <w:p>
+      <w:pPr>
+        <w:shd w:fill="F1F3EE" w:color="auto" w:val="clear"/>
+        <w:spacing w:after="0" w:before="0"/>
+        <w:ind w:left="170" w:right="170"/>
+        <w:jc w:val="left"/>
+      </w:pPr>
+      <w:r>
+        <w:rPr>
+          <w:rFonts w:ascii="Malgun Gothic" w:cs="Malgun Gothic" w:eastAsia="맑은 고딕" w:hAnsi="Malgun Gothic"/>
+          <w:b w:val="false"/>
+          <w:bCs w:val="false"/>
+        </w:rPr>
+        <w:t xml:space="preserve">2. 임목생산 실적: 산하 전 국유림관리소별 임목생산 사업에 대해 연도, 임반·소반 번호, 사업종(간벌·주벌), 작업종(모두베기·모수작업·골라베기·왜림작업 등), 면적, 수종, 재적을 요청합니다. 집재 방법이나 사용 장비가 기록되어 있다면 함께 요청합니다.</w:t>
+      </w:r>
+    </w:p>
+    <w:p>
+      <w:pPr>
+        <w:shd w:fill="F1F3EE" w:color="auto" w:val="clear"/>
+        <w:spacing w:after="0" w:before="0"/>
+        <w:ind w:left="170" w:right="170"/>
+        <w:jc w:val="left"/>
+      </w:pPr>
+      <w:r>
+        <w:rPr>
+          <w:rFonts w:ascii="Malgun Gothic" w:cs="Malgun Gothic" w:eastAsia="맑은 고딕" w:hAnsi="Malgun Gothic"/>
+          <w:b w:val="false"/>
+          <w:bCs w:val="false"/>
+        </w:rPr>
+        <w:t xml:space="preserve">매수자 상호, 계약 금액, 개인정보, 소득사업 자료는 요청하지 않습니다.</w:t>
+      </w:r>
+    </w:p>
+    <w:p>
+      <w:pPr>
+        <w:shd w:fill="F1F3EE" w:color="auto" w:val="clear"/>
+        <w:spacing w:after="0" w:before="0"/>
+        <w:ind w:left="170" w:right="170"/>
+        <w:jc w:val="left"/>
+      </w:pPr>
+      <w:r>
+        <w:rPr>
+          <w:rFonts w:ascii="Malgun Gothic" w:cs="Malgun Gothic" w:eastAsia="맑은 고딕" w:hAnsi="Malgun Gothic"/>
+          <w:b w:val="false"/>
+          <w:bCs w:val="false"/>
+        </w:rPr>
+        <w:t xml:space="preserve">3. 산림경영계획 자료: 주벌 실적이 있는 소반에 한하여 소반별 소반 면적, 산지구분, 경사도 구분(완경사지·경사지·급경사지·험준지·절험지), 수종, 임령, 수고, 경급, 총축적, 경영목표와, 조림 실적(연도·수종·면적·본수·조림사유) 및 숲가꾸기 실적(연도·종별·면적)을 요청합니다.</w:t>
+      </w:r>
+    </w:p>
+    <w:p>
+      <w:pPr>
+        <w:shd w:fill="F1F3EE" w:color="auto" w:val="clear"/>
+        <w:spacing w:after="0" w:before="0"/>
+        <w:ind w:left="170" w:right="170"/>
+        <w:jc w:val="left"/>
+      </w:pPr>
+      <w:r>
+        <w:rPr>
+          <w:rFonts w:ascii="Malgun Gothic" w:cs="Malgun Gothic" w:eastAsia="맑은 고딕" w:hAnsi="Malgun Gothic"/>
+          <w:b w:val="false"/>
+          <w:bCs w:val="false"/>
+        </w:rPr>
+        <w:t xml:space="preserve">4. 시설 자료: 산하 국유림관리소별 관할 임도·운재로·작업로의 시설 연도, 개소수, 사업량(km)과 임도 노선 공간자료(SHP)를 요청합니다.</w:t>
+      </w:r>
+    </w:p>
+    <w:p>
+      <w:pPr>
+        <w:shd w:fill="F1F3EE" w:color="auto" w:val="clear"/>
+        <w:spacing w:after="0" w:before="0"/>
+        <w:ind w:left="170" w:right="170"/>
+        <w:jc w:val="left"/>
+      </w:pPr>
+      <w:r>
+        <w:rPr>
+          <w:rFonts w:ascii="Malgun Gothic" w:cs="Malgun Gothic" w:eastAsia="맑은 고딕" w:hAnsi="Malgun Gothic"/>
+          <w:b w:val="false"/>
+          <w:bCs w:val="false"/>
+        </w:rPr>
+        <w:t xml:space="preserve">5. 재해·복구 이력: 산하 국유림관리소별 관할 산사태 발생 이력(연도·위치·면적), 산지사방사업 시행 이력(연도·위치·사업량), 산불 및 병해충 피해 이력(연도·위치·면적)을 요청합니다.</w:t>
+      </w:r>
+    </w:p>
+    <w:p>
+      <w:pPr>
+        <w:spacing w:after="120"/>
+      </w:pPr>
+      <w:r>
+        <w:rPr>
+          <w:rFonts w:ascii="Malgun Gothic" w:cs="Malgun Gothic" w:eastAsia="맑은 고딕" w:hAnsi="Malgun Gothic"/>
+          <w:b w:val="false"/>
+          <w:bCs w:val="false"/>
+        </w:rPr>
+        <w:t xml:space="preserve">청구 목적</w:t>
+      </w:r>
+    </w:p>
+    <w:p>
+      <w:pPr>
+        <w:shd w:fill="F1F3EE" w:color="auto" w:val="clear"/>
+        <w:spacing w:after="0" w:before="0"/>
+        <w:ind w:left="170" w:right="170"/>
+        <w:jc w:val="left"/>
+      </w:pPr>
+      <w:r>
+        <w:rPr>
+          <w:rFonts w:ascii="Malgun Gothic" w:cs="Malgun Gothic" w:eastAsia="맑은 고딕" w:hAnsi="Malgun Gothic"/>
+          <w:b w:val="false"/>
+          <w:bCs w:val="false"/>
+        </w:rPr>
+        <w:t xml:space="preserve">기후변화 대응 산림정책 전환 연구에서 벌채 후 경과연수에 따른 토사유출과 생물다양성 변화를 분석하기 위해, 사례지를 선정하고 기초자료를 구축하는 학술 연구 목적입니다.</w:t>
+      </w:r>
+    </w:p>
+    <w:p>
+      <w:pPr>
+        <w:spacing w:after="120"/>
+      </w:pPr>
+      <w:r>
+        <w:rPr>
+          <w:rFonts w:ascii="Malgun Gothic" w:cs="Malgun Gothic" w:eastAsia="맑은 고딕" w:hAnsi="Malgun Gothic"/>
+          <w:b w:val="false"/>
+          <w:bCs w:val="false"/>
+        </w:rPr>
+        <w:t xml:space="preserve">받은 자료는 다음과 같이 활용한다. 1번은 관리소 선정에, 2번은 경과연수별 소반 선정과 WEPP 시나리오 구성에 쓴다. 3번은 사례지 설명, WEPP 입력, 벌채 전 임상 변수로, 4번은 WEPP:Road 입력과 임도 거리 분석에 쓴다. 5번은 사방사업지와 벌채지의 공간통계분석(2.4)에 쓴다. 기재요령에 토양 항목이 없어 토양은 산림입지토양도로 보완하고, 청구 범위 밖인 미벌채 대조구는 임상도로 보완한다.</w:t>
+      </w:r>
+    </w:p>
+    <w:p>
+      <w:pPr>
+        <w:pStyle w:val="Heading2"/>
+      </w:pPr>
+      <w:r>
+        <w:rPr>
+          <w:rFonts w:ascii="Malgun Gothic" w:cs="Malgun Gothic" w:eastAsia="맑은 고딕" w:hAnsi="Malgun Gothic"/>
+          <w:b w:val="false"/>
+          <w:bCs w:val="false"/>
+        </w:rPr>
+        <w:t xml:space="preserve">4.5 표본 구성</w:t>
+      </w:r>
+    </w:p>
+    <w:p>
+      <w:pPr>
+        <w:pStyle w:val="ListParagraph"/>
+        <w:numPr>
+          <w:ilvl w:val="0"/>
+          <w:numId w:val="3"/>
+        </w:numPr>
+        <w:spacing w:after="60"/>
+      </w:pPr>
+      <w:r>
+        <w:rPr>
+          <w:rFonts w:ascii="Malgun Gothic" w:cs="Malgun Gothic" w:eastAsia="맑은 고딕" w:hAnsi="Malgun Gothic"/>
+          <w:b w:val="false"/>
+          <w:bCs w:val="false"/>
+        </w:rPr>
+        <w:t xml:space="preserve">표본 단위는 소반으로 한다. 임반은 100ha 내외로 구획되어 크고, 소반은 임상·임령·작업종 등이 다르면 따로 구획(최소 1ha)되므로 벌채 이력이 같은 단위이다.</w:t>
+      </w:r>
+    </w:p>
+    <w:p>
+      <w:pPr>
+        <w:pStyle w:val="ListParagraph"/>
+        <w:numPr>
+          <w:ilvl w:val="0"/>
+          <w:numId w:val="3"/>
+        </w:numPr>
+        <w:spacing w:after="60"/>
+      </w:pPr>
+      <w:r>
+        <w:rPr>
+          <w:rFonts w:ascii="Malgun Gothic" w:cs="Malgun Gothic" w:eastAsia="맑은 고딕" w:hAnsi="Malgun Gothic"/>
+          <w:b w:val="false"/>
+          <w:bCs w:val="false"/>
+        </w:rPr>
+        <w:t xml:space="preserve">한 사이트가 아니라 임도를 따라 벌채 후 경과연수가 다른 소반들을 고른다(예: 2017년 벌채 소반 약 9년 경과, 약 40년 전 벌채 소반).</w:t>
+      </w:r>
+    </w:p>
+    <w:p>
+      <w:pPr>
+        <w:pStyle w:val="ListParagraph"/>
+        <w:numPr>
+          <w:ilvl w:val="0"/>
+          <w:numId w:val="3"/>
+        </w:numPr>
+        <w:spacing w:after="60"/>
+      </w:pPr>
+      <w:r>
+        <w:rPr>
+          <w:rFonts w:ascii="Malgun Gothic" w:cs="Malgun Gothic" w:eastAsia="맑은 고딕" w:hAnsi="Malgun Gothic"/>
+          <w:b w:val="false"/>
+          <w:bCs w:val="false"/>
+        </w:rPr>
+        <w:t xml:space="preserve">전국자연환경조사 조사지점과 공간적으로 겹치는 소반을 우선 선정한다.</w:t>
+      </w:r>
+    </w:p>
+    <w:p>
+      <w:pPr>
+        <w:pStyle w:val="ListParagraph"/>
+        <w:numPr>
+          <w:ilvl w:val="0"/>
+          <w:numId w:val="3"/>
+        </w:numPr>
+        <w:spacing w:after="60"/>
+      </w:pPr>
+      <w:r>
+        <w:rPr>
+          <w:rFonts w:ascii="Malgun Gothic" w:cs="Malgun Gothic" w:eastAsia="맑은 고딕" w:hAnsi="Malgun Gothic"/>
+          <w:b w:val="false"/>
+          <w:bCs w:val="false"/>
+        </w:rPr>
+        <w:t xml:space="preserve">사례지 설명에는 입지 조건, 위치도, 소반별 경영이력, 측정 가능한 변수(경사·토양·임상·임도 거리 등)를 담는다.</w:t>
+      </w:r>
+    </w:p>
+    <w:p>
+      <w:pPr>
+        <w:pStyle w:val="Heading1"/>
+      </w:pPr>
+      <w:r>
+        <w:rPr>
+          <w:rFonts w:ascii="Malgun Gothic" w:cs="Malgun Gothic" w:eastAsia="맑은 고딕" w:hAnsi="Malgun Gothic"/>
+          <w:b w:val="false"/>
+          <w:bCs w:val="false"/>
+        </w:rPr>
+        <w:t xml:space="preserve">5. 추진 현황과 향후 일정</w:t>
+      </w:r>
+    </w:p>
+    <w:p>
+      <w:pPr>
+        <w:pStyle w:val="Heading2"/>
+      </w:pPr>
+      <w:r>
+        <w:rPr>
+          <w:rFonts w:ascii="Malgun Gothic" w:cs="Malgun Gothic" w:eastAsia="맑은 고딕" w:hAnsi="Malgun Gothic"/>
+          <w:b w:val="false"/>
+          <w:bCs w:val="false"/>
+        </w:rPr>
+        <w:t xml:space="preserve">5.1 착수보고서 대비 추진 현황</w:t>
       </w:r>
     </w:p>
     <w:tbl>
@@ -8042,9 +8268,9 @@
         </w:tblBorders>
       </w:tblPr>
       <w:tblGrid>
-        <w:gridCol w:w="1145"/>
-        <w:gridCol w:w="5916"/>
-        <w:gridCol w:w="2577"/>
+        <w:gridCol w:w="1726"/>
+        <w:gridCol w:w="1151"/>
+        <w:gridCol w:w="6761"/>
       </w:tblGrid>
       <w:tr>
         <w:trPr>
@@ -8052,7 +8278,7 @@
         </w:trPr>
         <w:tc>
           <w:tcPr>
-            <w:tcW w:type="dxa" w:w="1145"/>
+            <w:tcW w:type="dxa" w:w="1726"/>
             <w:tcBorders>
               <w:top w:val="single" w:color="BFC6BC" w:sz="4"/>
               <w:left w:val="single" w:color="BFC6BC" w:sz="4"/>
@@ -8079,13 +8305,13 @@
                 <w:sz w:val="18"/>
                 <w:szCs w:val="18"/>
               </w:rPr>
-              <w:t xml:space="preserve">청구 항목</w:t>
-            </w:r>
-          </w:p>
-        </w:tc>
-        <w:tc>
-          <w:tcPr>
-            <w:tcW w:type="dxa" w:w="5916"/>
+              <w:t xml:space="preserve">착수보고서 계획</w:t>
+            </w:r>
+          </w:p>
+        </w:tc>
+        <w:tc>
+          <w:tcPr>
+            <w:tcW w:type="dxa" w:w="1151"/>
             <w:tcBorders>
               <w:top w:val="single" w:color="BFC6BC" w:sz="4"/>
               <w:left w:val="single" w:color="BFC6BC" w:sz="4"/>
@@ -8112,13 +8338,13 @@
                 <w:sz w:val="18"/>
                 <w:szCs w:val="18"/>
               </w:rPr>
-              <w:t xml:space="preserve">세부 내용</w:t>
-            </w:r>
-          </w:p>
-        </w:tc>
-        <w:tc>
-          <w:tcPr>
-            <w:tcW w:type="dxa" w:w="2577"/>
+              <w:t xml:space="preserve">시기</w:t>
+            </w:r>
+          </w:p>
+        </w:tc>
+        <w:tc>
+          <w:tcPr>
+            <w:tcW w:type="dxa" w:w="6761"/>
             <w:tcBorders>
               <w:top w:val="single" w:color="BFC6BC" w:sz="4"/>
               <w:left w:val="single" w:color="BFC6BC" w:sz="4"/>
@@ -8145,7 +8371,7 @@
                 <w:sz w:val="18"/>
                 <w:szCs w:val="18"/>
               </w:rPr>
-              <w:t xml:space="preserve">활용</w:t>
+              <w:t xml:space="preserve">현황</w:t>
             </w:r>
           </w:p>
         </w:tc>
@@ -8156,97 +8382,97 @@
         </w:trPr>
         <w:tc>
           <w:tcPr>
-            <w:tcW w:type="dxa" w:w="1145"/>
-            <w:tcBorders>
-              <w:top w:val="single" w:color="BFC6BC" w:sz="4"/>
-              <w:left w:val="single" w:color="BFC6BC" w:sz="4"/>
-              <w:bottom w:val="single" w:color="BFC6BC" w:sz="4"/>
-              <w:right w:val="single" w:color="BFC6BC" w:sz="4"/>
-            </w:tcBorders>
-            <w:tcMar>
-              <w:top w:type="dxa" w:w="60"/>
-              <w:left w:type="dxa" w:w="100"/>
-              <w:bottom w:type="dxa" w:w="60"/>
-              <w:right w:type="dxa" w:w="100"/>
-            </w:tcMar>
-          </w:tcPr>
-          <w:p>
-            <w:pPr>
-              <w:spacing w:after="0" w:line="276"/>
-            </w:pPr>
-            <w:r>
-              <w:rPr>
-                <w:rFonts w:ascii="Malgun Gothic" w:cs="Malgun Gothic" w:eastAsia="맑은 고딕" w:hAnsi="Malgun Gothic"/>
-                <w:b w:val="false"/>
-                <w:bCs w:val="false"/>
-                <w:sz w:val="18"/>
-                <w:szCs w:val="18"/>
-              </w:rPr>
-              <w:t xml:space="preserve">1. 벌채 실적</w:t>
-            </w:r>
-          </w:p>
-        </w:tc>
-        <w:tc>
-          <w:tcPr>
-            <w:tcW w:type="dxa" w:w="5916"/>
-            <w:tcBorders>
-              <w:top w:val="single" w:color="BFC6BC" w:sz="4"/>
-              <w:left w:val="single" w:color="BFC6BC" w:sz="4"/>
-              <w:bottom w:val="single" w:color="BFC6BC" w:sz="4"/>
-              <w:right w:val="single" w:color="BFC6BC" w:sz="4"/>
-            </w:tcBorders>
-            <w:tcMar>
-              <w:top w:type="dxa" w:w="60"/>
-              <w:left w:type="dxa" w:w="100"/>
-              <w:bottom w:type="dxa" w:w="60"/>
-              <w:right w:type="dxa" w:w="100"/>
-            </w:tcMar>
-          </w:tcPr>
-          <w:p>
-            <w:pPr>
-              <w:spacing w:after="0" w:line="276"/>
-            </w:pPr>
-            <w:r>
-              <w:rPr>
-                <w:rFonts w:ascii="Malgun Gothic" w:cs="Malgun Gothic" w:eastAsia="맑은 고딕" w:hAnsi="Malgun Gothic"/>
-                <w:b w:val="false"/>
-                <w:bCs w:val="false"/>
-                <w:sz w:val="18"/>
-                <w:szCs w:val="18"/>
-              </w:rPr>
-              <w:t xml:space="preserve">관리소별·연도별 계약건수, 벌채면적, 입목재적</w:t>
-            </w:r>
-          </w:p>
-        </w:tc>
-        <w:tc>
-          <w:tcPr>
-            <w:tcW w:type="dxa" w:w="2577"/>
-            <w:tcBorders>
-              <w:top w:val="single" w:color="BFC6BC" w:sz="4"/>
-              <w:left w:val="single" w:color="BFC6BC" w:sz="4"/>
-              <w:bottom w:val="single" w:color="BFC6BC" w:sz="4"/>
-              <w:right w:val="single" w:color="BFC6BC" w:sz="4"/>
-            </w:tcBorders>
-            <w:tcMar>
-              <w:top w:type="dxa" w:w="60"/>
-              <w:left w:type="dxa" w:w="100"/>
-              <w:bottom w:type="dxa" w:w="60"/>
-              <w:right w:type="dxa" w:w="100"/>
-            </w:tcMar>
-          </w:tcPr>
-          <w:p>
-            <w:pPr>
-              <w:spacing w:after="0" w:line="276"/>
-            </w:pPr>
-            <w:r>
-              <w:rPr>
-                <w:rFonts w:ascii="Malgun Gothic" w:cs="Malgun Gothic" w:eastAsia="맑은 고딕" w:hAnsi="Malgun Gothic"/>
-                <w:b w:val="false"/>
-                <w:bCs w:val="false"/>
-                <w:sz w:val="18"/>
-                <w:szCs w:val="18"/>
-              </w:rPr>
-              <w:t xml:space="preserve">관리소 선정</w:t>
+            <w:tcW w:type="dxa" w:w="1726"/>
+            <w:tcBorders>
+              <w:top w:val="single" w:color="BFC6BC" w:sz="4"/>
+              <w:left w:val="single" w:color="BFC6BC" w:sz="4"/>
+              <w:bottom w:val="single" w:color="BFC6BC" w:sz="4"/>
+              <w:right w:val="single" w:color="BFC6BC" w:sz="4"/>
+            </w:tcBorders>
+            <w:tcMar>
+              <w:top w:type="dxa" w:w="60"/>
+              <w:left w:type="dxa" w:w="100"/>
+              <w:bottom w:type="dxa" w:w="60"/>
+              <w:right w:type="dxa" w:w="100"/>
+            </w:tcMar>
+          </w:tcPr>
+          <w:p>
+            <w:pPr>
+              <w:spacing w:after="0" w:line="276"/>
+            </w:pPr>
+            <w:r>
+              <w:rPr>
+                <w:rFonts w:ascii="Malgun Gothic" w:cs="Malgun Gothic" w:eastAsia="맑은 고딕" w:hAnsi="Malgun Gothic"/>
+                <w:b w:val="false"/>
+                <w:bCs w:val="false"/>
+                <w:sz w:val="18"/>
+                <w:szCs w:val="18"/>
+              </w:rPr>
+              <w:t xml:space="preserve">사례지 선정</w:t>
+            </w:r>
+          </w:p>
+        </w:tc>
+        <w:tc>
+          <w:tcPr>
+            <w:tcW w:type="dxa" w:w="1151"/>
+            <w:tcBorders>
+              <w:top w:val="single" w:color="BFC6BC" w:sz="4"/>
+              <w:left w:val="single" w:color="BFC6BC" w:sz="4"/>
+              <w:bottom w:val="single" w:color="BFC6BC" w:sz="4"/>
+              <w:right w:val="single" w:color="BFC6BC" w:sz="4"/>
+            </w:tcBorders>
+            <w:tcMar>
+              <w:top w:type="dxa" w:w="60"/>
+              <w:left w:type="dxa" w:w="100"/>
+              <w:bottom w:type="dxa" w:w="60"/>
+              <w:right w:type="dxa" w:w="100"/>
+            </w:tcMar>
+          </w:tcPr>
+          <w:p>
+            <w:pPr>
+              <w:spacing w:after="0" w:line="276"/>
+            </w:pPr>
+            <w:r>
+              <w:rPr>
+                <w:rFonts w:ascii="Malgun Gothic" w:cs="Malgun Gothic" w:eastAsia="맑은 고딕" w:hAnsi="Malgun Gothic"/>
+                <w:b w:val="false"/>
+                <w:bCs w:val="false"/>
+                <w:sz w:val="18"/>
+                <w:szCs w:val="18"/>
+              </w:rPr>
+              <w:t xml:space="preserve">9월</w:t>
+            </w:r>
+          </w:p>
+        </w:tc>
+        <w:tc>
+          <w:tcPr>
+            <w:tcW w:type="dxa" w:w="6761"/>
+            <w:tcBorders>
+              <w:top w:val="single" w:color="BFC6BC" w:sz="4"/>
+              <w:left w:val="single" w:color="BFC6BC" w:sz="4"/>
+              <w:bottom w:val="single" w:color="BFC6BC" w:sz="4"/>
+              <w:right w:val="single" w:color="BFC6BC" w:sz="4"/>
+            </w:tcBorders>
+            <w:tcMar>
+              <w:top w:type="dxa" w:w="60"/>
+              <w:left w:type="dxa" w:w="100"/>
+              <w:bottom w:type="dxa" w:w="60"/>
+              <w:right w:type="dxa" w:w="100"/>
+            </w:tcMar>
+          </w:tcPr>
+          <w:p>
+            <w:pPr>
+              <w:spacing w:after="0" w:line="276"/>
+            </w:pPr>
+            <w:r>
+              <w:rPr>
+                <w:rFonts w:ascii="Malgun Gothic" w:cs="Malgun Gothic" w:eastAsia="맑은 고딕" w:hAnsi="Malgun Gothic"/>
+                <w:b w:val="false"/>
+                <w:bCs w:val="false"/>
+                <w:sz w:val="18"/>
+                <w:szCs w:val="18"/>
+              </w:rPr>
+              <w:t xml:space="preserve">진행 중. 동부·북부지방산림청 정보공개 청구 완료, 자료 수령 후 11월 확정(4장)</w:t>
             </w:r>
           </w:p>
         </w:tc>
@@ -8257,97 +8483,97 @@
         </w:trPr>
         <w:tc>
           <w:tcPr>
-            <w:tcW w:type="dxa" w:w="1145"/>
-            <w:tcBorders>
-              <w:top w:val="single" w:color="BFC6BC" w:sz="4"/>
-              <w:left w:val="single" w:color="BFC6BC" w:sz="4"/>
-              <w:bottom w:val="single" w:color="BFC6BC" w:sz="4"/>
-              <w:right w:val="single" w:color="BFC6BC" w:sz="4"/>
-            </w:tcBorders>
-            <w:tcMar>
-              <w:top w:type="dxa" w:w="60"/>
-              <w:left w:type="dxa" w:w="100"/>
-              <w:bottom w:type="dxa" w:w="60"/>
-              <w:right w:type="dxa" w:w="100"/>
-            </w:tcMar>
-          </w:tcPr>
-          <w:p>
-            <w:pPr>
-              <w:spacing w:after="0" w:line="276"/>
-            </w:pPr>
-            <w:r>
-              <w:rPr>
-                <w:rFonts w:ascii="Malgun Gothic" w:cs="Malgun Gothic" w:eastAsia="맑은 고딕" w:hAnsi="Malgun Gothic"/>
-                <w:b w:val="false"/>
-                <w:bCs w:val="false"/>
-                <w:sz w:val="18"/>
-                <w:szCs w:val="18"/>
-              </w:rPr>
-              <w:t xml:space="preserve">2. 임목생산 실적</w:t>
-            </w:r>
-          </w:p>
-        </w:tc>
-        <w:tc>
-          <w:tcPr>
-            <w:tcW w:type="dxa" w:w="5916"/>
-            <w:tcBorders>
-              <w:top w:val="single" w:color="BFC6BC" w:sz="4"/>
-              <w:left w:val="single" w:color="BFC6BC" w:sz="4"/>
-              <w:bottom w:val="single" w:color="BFC6BC" w:sz="4"/>
-              <w:right w:val="single" w:color="BFC6BC" w:sz="4"/>
-            </w:tcBorders>
-            <w:tcMar>
-              <w:top w:type="dxa" w:w="60"/>
-              <w:left w:type="dxa" w:w="100"/>
-              <w:bottom w:type="dxa" w:w="60"/>
-              <w:right w:type="dxa" w:w="100"/>
-            </w:tcMar>
-          </w:tcPr>
-          <w:p>
-            <w:pPr>
-              <w:spacing w:after="0" w:line="276"/>
-            </w:pPr>
-            <w:r>
-              <w:rPr>
-                <w:rFonts w:ascii="Malgun Gothic" w:cs="Malgun Gothic" w:eastAsia="맑은 고딕" w:hAnsi="Malgun Gothic"/>
-                <w:b w:val="false"/>
-                <w:bCs w:val="false"/>
-                <w:sz w:val="18"/>
-                <w:szCs w:val="18"/>
-              </w:rPr>
-              <w:t xml:space="preserve">연도, 관리소, 임반·소반 번호, 사업종, 작업종, 면적, 수종, 재적, 집재 방법(기록된 경우)</w:t>
-            </w:r>
-          </w:p>
-        </w:tc>
-        <w:tc>
-          <w:tcPr>
-            <w:tcW w:type="dxa" w:w="2577"/>
-            <w:tcBorders>
-              <w:top w:val="single" w:color="BFC6BC" w:sz="4"/>
-              <w:left w:val="single" w:color="BFC6BC" w:sz="4"/>
-              <w:bottom w:val="single" w:color="BFC6BC" w:sz="4"/>
-              <w:right w:val="single" w:color="BFC6BC" w:sz="4"/>
-            </w:tcBorders>
-            <w:tcMar>
-              <w:top w:type="dxa" w:w="60"/>
-              <w:left w:type="dxa" w:w="100"/>
-              <w:bottom w:type="dxa" w:w="60"/>
-              <w:right w:type="dxa" w:w="100"/>
-            </w:tcMar>
-          </w:tcPr>
-          <w:p>
-            <w:pPr>
-              <w:spacing w:after="0" w:line="276"/>
-            </w:pPr>
-            <w:r>
-              <w:rPr>
-                <w:rFonts w:ascii="Malgun Gothic" w:cs="Malgun Gothic" w:eastAsia="맑은 고딕" w:hAnsi="Malgun Gothic"/>
-                <w:b w:val="false"/>
-                <w:bCs w:val="false"/>
-                <w:sz w:val="18"/>
-                <w:szCs w:val="18"/>
-              </w:rPr>
-              <w:t xml:space="preserve">경과연수별 소반 선정, WEPP 시나리오</w:t>
+            <w:tcW w:type="dxa" w:w="1726"/>
+            <w:tcBorders>
+              <w:top w:val="single" w:color="BFC6BC" w:sz="4"/>
+              <w:left w:val="single" w:color="BFC6BC" w:sz="4"/>
+              <w:bottom w:val="single" w:color="BFC6BC" w:sz="4"/>
+              <w:right w:val="single" w:color="BFC6BC" w:sz="4"/>
+            </w:tcBorders>
+            <w:tcMar>
+              <w:top w:type="dxa" w:w="60"/>
+              <w:left w:type="dxa" w:w="100"/>
+              <w:bottom w:type="dxa" w:w="60"/>
+              <w:right w:type="dxa" w:w="100"/>
+            </w:tcMar>
+          </w:tcPr>
+          <w:p>
+            <w:pPr>
+              <w:spacing w:after="0" w:line="276"/>
+            </w:pPr>
+            <w:r>
+              <w:rPr>
+                <w:rFonts w:ascii="Malgun Gothic" w:cs="Malgun Gothic" w:eastAsia="맑은 고딕" w:hAnsi="Malgun Gothic"/>
+                <w:b w:val="false"/>
+                <w:bCs w:val="false"/>
+                <w:sz w:val="18"/>
+                <w:szCs w:val="18"/>
+              </w:rPr>
+              <w:t xml:space="preserve">경제성 산출 자료 수집</w:t>
+            </w:r>
+          </w:p>
+        </w:tc>
+        <w:tc>
+          <w:tcPr>
+            <w:tcW w:type="dxa" w:w="1151"/>
+            <w:tcBorders>
+              <w:top w:val="single" w:color="BFC6BC" w:sz="4"/>
+              <w:left w:val="single" w:color="BFC6BC" w:sz="4"/>
+              <w:bottom w:val="single" w:color="BFC6BC" w:sz="4"/>
+              <w:right w:val="single" w:color="BFC6BC" w:sz="4"/>
+            </w:tcBorders>
+            <w:tcMar>
+              <w:top w:type="dxa" w:w="60"/>
+              <w:left w:type="dxa" w:w="100"/>
+              <w:bottom w:type="dxa" w:w="60"/>
+              <w:right w:type="dxa" w:w="100"/>
+            </w:tcMar>
+          </w:tcPr>
+          <w:p>
+            <w:pPr>
+              <w:spacing w:after="0" w:line="276"/>
+            </w:pPr>
+            <w:r>
+              <w:rPr>
+                <w:rFonts w:ascii="Malgun Gothic" w:cs="Malgun Gothic" w:eastAsia="맑은 고딕" w:hAnsi="Malgun Gothic"/>
+                <w:b w:val="false"/>
+                <w:bCs w:val="false"/>
+                <w:sz w:val="18"/>
+                <w:szCs w:val="18"/>
+              </w:rPr>
+              <w:t xml:space="preserve">9월</w:t>
+            </w:r>
+          </w:p>
+        </w:tc>
+        <w:tc>
+          <w:tcPr>
+            <w:tcW w:type="dxa" w:w="6761"/>
+            <w:tcBorders>
+              <w:top w:val="single" w:color="BFC6BC" w:sz="4"/>
+              <w:left w:val="single" w:color="BFC6BC" w:sz="4"/>
+              <w:bottom w:val="single" w:color="BFC6BC" w:sz="4"/>
+              <w:right w:val="single" w:color="BFC6BC" w:sz="4"/>
+            </w:tcBorders>
+            <w:tcMar>
+              <w:top w:type="dxa" w:w="60"/>
+              <w:left w:type="dxa" w:w="100"/>
+              <w:bottom w:type="dxa" w:w="60"/>
+              <w:right w:type="dxa" w:w="100"/>
+            </w:tcMar>
+          </w:tcPr>
+          <w:p>
+            <w:pPr>
+              <w:spacing w:after="0" w:line="276"/>
+            </w:pPr>
+            <w:r>
+              <w:rPr>
+                <w:rFonts w:ascii="Malgun Gothic" w:cs="Malgun Gothic" w:eastAsia="맑은 고딕" w:hAnsi="Malgun Gothic"/>
+                <w:b w:val="false"/>
+                <w:bCs w:val="false"/>
+                <w:sz w:val="18"/>
+                <w:szCs w:val="18"/>
+              </w:rPr>
+              <w:t xml:space="preserve">진행 중. 국유림 경영비용·매각단가(홍석환·안미연, 2025), 목재매각실적 정리</w:t>
             </w:r>
           </w:p>
         </w:tc>
@@ -8358,97 +8584,97 @@
         </w:trPr>
         <w:tc>
           <w:tcPr>
-            <w:tcW w:type="dxa" w:w="1145"/>
-            <w:tcBorders>
-              <w:top w:val="single" w:color="BFC6BC" w:sz="4"/>
-              <w:left w:val="single" w:color="BFC6BC" w:sz="4"/>
-              <w:bottom w:val="single" w:color="BFC6BC" w:sz="4"/>
-              <w:right w:val="single" w:color="BFC6BC" w:sz="4"/>
-            </w:tcBorders>
-            <w:tcMar>
-              <w:top w:type="dxa" w:w="60"/>
-              <w:left w:type="dxa" w:w="100"/>
-              <w:bottom w:type="dxa" w:w="60"/>
-              <w:right w:type="dxa" w:w="100"/>
-            </w:tcMar>
-          </w:tcPr>
-          <w:p>
-            <w:pPr>
-              <w:spacing w:after="0" w:line="276"/>
-            </w:pPr>
-            <w:r>
-              <w:rPr>
-                <w:rFonts w:ascii="Malgun Gothic" w:cs="Malgun Gothic" w:eastAsia="맑은 고딕" w:hAnsi="Malgun Gothic"/>
-                <w:b w:val="false"/>
-                <w:bCs w:val="false"/>
-                <w:sz w:val="18"/>
-                <w:szCs w:val="18"/>
-              </w:rPr>
-              <w:t xml:space="preserve">3. 산림경영계획 자료</w:t>
-            </w:r>
-          </w:p>
-        </w:tc>
-        <w:tc>
-          <w:tcPr>
-            <w:tcW w:type="dxa" w:w="5916"/>
-            <w:tcBorders>
-              <w:top w:val="single" w:color="BFC6BC" w:sz="4"/>
-              <w:left w:val="single" w:color="BFC6BC" w:sz="4"/>
-              <w:bottom w:val="single" w:color="BFC6BC" w:sz="4"/>
-              <w:right w:val="single" w:color="BFC6BC" w:sz="4"/>
-            </w:tcBorders>
-            <w:tcMar>
-              <w:top w:type="dxa" w:w="60"/>
-              <w:left w:type="dxa" w:w="100"/>
-              <w:bottom w:type="dxa" w:w="60"/>
-              <w:right w:type="dxa" w:w="100"/>
-            </w:tcMar>
-          </w:tcPr>
-          <w:p>
-            <w:pPr>
-              <w:spacing w:after="0" w:line="276"/>
-            </w:pPr>
-            <w:r>
-              <w:rPr>
-                <w:rFonts w:ascii="Malgun Gothic" w:cs="Malgun Gothic" w:eastAsia="맑은 고딕" w:hAnsi="Malgun Gothic"/>
-                <w:b w:val="false"/>
-                <w:bCs w:val="false"/>
-                <w:sz w:val="18"/>
-                <w:szCs w:val="18"/>
-              </w:rPr>
-              <w:t xml:space="preserve">주벌 실적 소반의 면적, 산지구분, 경사도, 수종, 임령, 수고, 경급, 총축적, 경영목표, 조림·숲가꾸기 실적</w:t>
-            </w:r>
-          </w:p>
-        </w:tc>
-        <w:tc>
-          <w:tcPr>
-            <w:tcW w:type="dxa" w:w="2577"/>
-            <w:tcBorders>
-              <w:top w:val="single" w:color="BFC6BC" w:sz="4"/>
-              <w:left w:val="single" w:color="BFC6BC" w:sz="4"/>
-              <w:bottom w:val="single" w:color="BFC6BC" w:sz="4"/>
-              <w:right w:val="single" w:color="BFC6BC" w:sz="4"/>
-            </w:tcBorders>
-            <w:tcMar>
-              <w:top w:type="dxa" w:w="60"/>
-              <w:left w:type="dxa" w:w="100"/>
-              <w:bottom w:type="dxa" w:w="60"/>
-              <w:right w:type="dxa" w:w="100"/>
-            </w:tcMar>
-          </w:tcPr>
-          <w:p>
-            <w:pPr>
-              <w:spacing w:after="0" w:line="276"/>
-            </w:pPr>
-            <w:r>
-              <w:rPr>
-                <w:rFonts w:ascii="Malgun Gothic" w:cs="Malgun Gothic" w:eastAsia="맑은 고딕" w:hAnsi="Malgun Gothic"/>
-                <w:b w:val="false"/>
-                <w:bCs w:val="false"/>
-                <w:sz w:val="18"/>
-                <w:szCs w:val="18"/>
-              </w:rPr>
-              <w:t xml:space="preserve">사례지 설명, WEPP 입력, 벌채 전 임상 변수</w:t>
+            <w:tcW w:type="dxa" w:w="1726"/>
+            <w:tcBorders>
+              <w:top w:val="single" w:color="BFC6BC" w:sz="4"/>
+              <w:left w:val="single" w:color="BFC6BC" w:sz="4"/>
+              <w:bottom w:val="single" w:color="BFC6BC" w:sz="4"/>
+              <w:right w:val="single" w:color="BFC6BC" w:sz="4"/>
+            </w:tcBorders>
+            <w:tcMar>
+              <w:top w:type="dxa" w:w="60"/>
+              <w:left w:type="dxa" w:w="100"/>
+              <w:bottom w:type="dxa" w:w="60"/>
+              <w:right w:type="dxa" w:w="100"/>
+            </w:tcMar>
+          </w:tcPr>
+          <w:p>
+            <w:pPr>
+              <w:spacing w:after="0" w:line="276"/>
+            </w:pPr>
+            <w:r>
+              <w:rPr>
+                <w:rFonts w:ascii="Malgun Gothic" w:cs="Malgun Gothic" w:eastAsia="맑은 고딕" w:hAnsi="Malgun Gothic"/>
+                <w:b w:val="false"/>
+                <w:bCs w:val="false"/>
+                <w:sz w:val="18"/>
+                <w:szCs w:val="18"/>
+              </w:rPr>
+              <w:t xml:space="preserve">토사유출 전문가 자문</w:t>
+            </w:r>
+          </w:p>
+        </w:tc>
+        <w:tc>
+          <w:tcPr>
+            <w:tcW w:type="dxa" w:w="1151"/>
+            <w:tcBorders>
+              <w:top w:val="single" w:color="BFC6BC" w:sz="4"/>
+              <w:left w:val="single" w:color="BFC6BC" w:sz="4"/>
+              <w:bottom w:val="single" w:color="BFC6BC" w:sz="4"/>
+              <w:right w:val="single" w:color="BFC6BC" w:sz="4"/>
+            </w:tcBorders>
+            <w:tcMar>
+              <w:top w:type="dxa" w:w="60"/>
+              <w:left w:type="dxa" w:w="100"/>
+              <w:bottom w:type="dxa" w:w="60"/>
+              <w:right w:type="dxa" w:w="100"/>
+            </w:tcMar>
+          </w:tcPr>
+          <w:p>
+            <w:pPr>
+              <w:spacing w:after="0" w:line="276"/>
+            </w:pPr>
+            <w:r>
+              <w:rPr>
+                <w:rFonts w:ascii="Malgun Gothic" w:cs="Malgun Gothic" w:eastAsia="맑은 고딕" w:hAnsi="Malgun Gothic"/>
+                <w:b w:val="false"/>
+                <w:bCs w:val="false"/>
+                <w:sz w:val="18"/>
+                <w:szCs w:val="18"/>
+              </w:rPr>
+              <w:t xml:space="preserve">—</w:t>
+            </w:r>
+          </w:p>
+        </w:tc>
+        <w:tc>
+          <w:tcPr>
+            <w:tcW w:type="dxa" w:w="6761"/>
+            <w:tcBorders>
+              <w:top w:val="single" w:color="BFC6BC" w:sz="4"/>
+              <w:left w:val="single" w:color="BFC6BC" w:sz="4"/>
+              <w:bottom w:val="single" w:color="BFC6BC" w:sz="4"/>
+              <w:right w:val="single" w:color="BFC6BC" w:sz="4"/>
+            </w:tcBorders>
+            <w:tcMar>
+              <w:top w:type="dxa" w:w="60"/>
+              <w:left w:type="dxa" w:w="100"/>
+              <w:bottom w:type="dxa" w:w="60"/>
+              <w:right w:type="dxa" w:w="100"/>
+            </w:tcMar>
+          </w:tcPr>
+          <w:p>
+            <w:pPr>
+              <w:spacing w:after="0" w:line="276"/>
+            </w:pPr>
+            <w:r>
+              <w:rPr>
+                <w:rFonts w:ascii="Malgun Gothic" w:cs="Malgun Gothic" w:eastAsia="맑은 고딕" w:hAnsi="Malgun Gothic"/>
+                <w:b w:val="false"/>
+                <w:bCs w:val="false"/>
+                <w:sz w:val="18"/>
+                <w:szCs w:val="18"/>
+              </w:rPr>
+              <w:t xml:space="preserve">완료. 이학준 교수(2.3, 2.5)</w:t>
             </w:r>
           </w:p>
         </w:tc>
@@ -8459,97 +8685,97 @@
         </w:trPr>
         <w:tc>
           <w:tcPr>
-            <w:tcW w:type="dxa" w:w="1145"/>
-            <w:tcBorders>
-              <w:top w:val="single" w:color="BFC6BC" w:sz="4"/>
-              <w:left w:val="single" w:color="BFC6BC" w:sz="4"/>
-              <w:bottom w:val="single" w:color="BFC6BC" w:sz="4"/>
-              <w:right w:val="single" w:color="BFC6BC" w:sz="4"/>
-            </w:tcBorders>
-            <w:tcMar>
-              <w:top w:type="dxa" w:w="60"/>
-              <w:left w:type="dxa" w:w="100"/>
-              <w:bottom w:type="dxa" w:w="60"/>
-              <w:right w:type="dxa" w:w="100"/>
-            </w:tcMar>
-          </w:tcPr>
-          <w:p>
-            <w:pPr>
-              <w:spacing w:after="0" w:line="276"/>
-            </w:pPr>
-            <w:r>
-              <w:rPr>
-                <w:rFonts w:ascii="Malgun Gothic" w:cs="Malgun Gothic" w:eastAsia="맑은 고딕" w:hAnsi="Malgun Gothic"/>
-                <w:b w:val="false"/>
-                <w:bCs w:val="false"/>
-                <w:sz w:val="18"/>
-                <w:szCs w:val="18"/>
-              </w:rPr>
-              <w:t xml:space="preserve">4. 시설 자료</w:t>
-            </w:r>
-          </w:p>
-        </w:tc>
-        <w:tc>
-          <w:tcPr>
-            <w:tcW w:type="dxa" w:w="5916"/>
-            <w:tcBorders>
-              <w:top w:val="single" w:color="BFC6BC" w:sz="4"/>
-              <w:left w:val="single" w:color="BFC6BC" w:sz="4"/>
-              <w:bottom w:val="single" w:color="BFC6BC" w:sz="4"/>
-              <w:right w:val="single" w:color="BFC6BC" w:sz="4"/>
-            </w:tcBorders>
-            <w:tcMar>
-              <w:top w:type="dxa" w:w="60"/>
-              <w:left w:type="dxa" w:w="100"/>
-              <w:bottom w:type="dxa" w:w="60"/>
-              <w:right w:type="dxa" w:w="100"/>
-            </w:tcMar>
-          </w:tcPr>
-          <w:p>
-            <w:pPr>
-              <w:spacing w:after="0" w:line="276"/>
-            </w:pPr>
-            <w:r>
-              <w:rPr>
-                <w:rFonts w:ascii="Malgun Gothic" w:cs="Malgun Gothic" w:eastAsia="맑은 고딕" w:hAnsi="Malgun Gothic"/>
-                <w:b w:val="false"/>
-                <w:bCs w:val="false"/>
-                <w:sz w:val="18"/>
-                <w:szCs w:val="18"/>
-              </w:rPr>
-              <w:t xml:space="preserve">임도·운재로·작업로의 시설 연도, 개소수, 사업량(km), 임도 노선 SHP</w:t>
-            </w:r>
-          </w:p>
-        </w:tc>
-        <w:tc>
-          <w:tcPr>
-            <w:tcW w:type="dxa" w:w="2577"/>
-            <w:tcBorders>
-              <w:top w:val="single" w:color="BFC6BC" w:sz="4"/>
-              <w:left w:val="single" w:color="BFC6BC" w:sz="4"/>
-              <w:bottom w:val="single" w:color="BFC6BC" w:sz="4"/>
-              <w:right w:val="single" w:color="BFC6BC" w:sz="4"/>
-            </w:tcBorders>
-            <w:tcMar>
-              <w:top w:type="dxa" w:w="60"/>
-              <w:left w:type="dxa" w:w="100"/>
-              <w:bottom w:type="dxa" w:w="60"/>
-              <w:right w:type="dxa" w:w="100"/>
-            </w:tcMar>
-          </w:tcPr>
-          <w:p>
-            <w:pPr>
-              <w:spacing w:after="0" w:line="276"/>
-            </w:pPr>
-            <w:r>
-              <w:rPr>
-                <w:rFonts w:ascii="Malgun Gothic" w:cs="Malgun Gothic" w:eastAsia="맑은 고딕" w:hAnsi="Malgun Gothic"/>
-                <w:b w:val="false"/>
-                <w:bCs w:val="false"/>
-                <w:sz w:val="18"/>
-                <w:szCs w:val="18"/>
-              </w:rPr>
-              <w:t xml:space="preserve">WEPP:Road 입력, 임도 거리 분석</w:t>
+            <w:tcW w:type="dxa" w:w="1726"/>
+            <w:tcBorders>
+              <w:top w:val="single" w:color="BFC6BC" w:sz="4"/>
+              <w:left w:val="single" w:color="BFC6BC" w:sz="4"/>
+              <w:bottom w:val="single" w:color="BFC6BC" w:sz="4"/>
+              <w:right w:val="single" w:color="BFC6BC" w:sz="4"/>
+            </w:tcBorders>
+            <w:tcMar>
+              <w:top w:type="dxa" w:w="60"/>
+              <w:left w:type="dxa" w:w="100"/>
+              <w:bottom w:type="dxa" w:w="60"/>
+              <w:right w:type="dxa" w:w="100"/>
+            </w:tcMar>
+          </w:tcPr>
+          <w:p>
+            <w:pPr>
+              <w:spacing w:after="0" w:line="276"/>
+            </w:pPr>
+            <w:r>
+              <w:rPr>
+                <w:rFonts w:ascii="Malgun Gothic" w:cs="Malgun Gothic" w:eastAsia="맑은 고딕" w:hAnsi="Malgun Gothic"/>
+                <w:b w:val="false"/>
+                <w:bCs w:val="false"/>
+                <w:sz w:val="18"/>
+                <w:szCs w:val="18"/>
+              </w:rPr>
+              <w:t xml:space="preserve">사례지 현장조사</w:t>
+            </w:r>
+          </w:p>
+        </w:tc>
+        <w:tc>
+          <w:tcPr>
+            <w:tcW w:type="dxa" w:w="1151"/>
+            <w:tcBorders>
+              <w:top w:val="single" w:color="BFC6BC" w:sz="4"/>
+              <w:left w:val="single" w:color="BFC6BC" w:sz="4"/>
+              <w:bottom w:val="single" w:color="BFC6BC" w:sz="4"/>
+              <w:right w:val="single" w:color="BFC6BC" w:sz="4"/>
+            </w:tcBorders>
+            <w:tcMar>
+              <w:top w:type="dxa" w:w="60"/>
+              <w:left w:type="dxa" w:w="100"/>
+              <w:bottom w:type="dxa" w:w="60"/>
+              <w:right w:type="dxa" w:w="100"/>
+            </w:tcMar>
+          </w:tcPr>
+          <w:p>
+            <w:pPr>
+              <w:spacing w:after="0" w:line="276"/>
+            </w:pPr>
+            <w:r>
+              <w:rPr>
+                <w:rFonts w:ascii="Malgun Gothic" w:cs="Malgun Gothic" w:eastAsia="맑은 고딕" w:hAnsi="Malgun Gothic"/>
+                <w:b w:val="false"/>
+                <w:bCs w:val="false"/>
+                <w:sz w:val="18"/>
+                <w:szCs w:val="18"/>
+              </w:rPr>
+              <w:t xml:space="preserve">10월</w:t>
+            </w:r>
+          </w:p>
+        </w:tc>
+        <w:tc>
+          <w:tcPr>
+            <w:tcW w:type="dxa" w:w="6761"/>
+            <w:tcBorders>
+              <w:top w:val="single" w:color="BFC6BC" w:sz="4"/>
+              <w:left w:val="single" w:color="BFC6BC" w:sz="4"/>
+              <w:bottom w:val="single" w:color="BFC6BC" w:sz="4"/>
+              <w:right w:val="single" w:color="BFC6BC" w:sz="4"/>
+            </w:tcBorders>
+            <w:tcMar>
+              <w:top w:type="dxa" w:w="60"/>
+              <w:left w:type="dxa" w:w="100"/>
+              <w:bottom w:type="dxa" w:w="60"/>
+              <w:right w:type="dxa" w:w="100"/>
+            </w:tcMar>
+          </w:tcPr>
+          <w:p>
+            <w:pPr>
+              <w:spacing w:after="0" w:line="276"/>
+            </w:pPr>
+            <w:r>
+              <w:rPr>
+                <w:rFonts w:ascii="Malgun Gothic" w:cs="Malgun Gothic" w:eastAsia="맑은 고딕" w:hAnsi="Malgun Gothic"/>
+                <w:b w:val="false"/>
+                <w:bCs w:val="false"/>
+                <w:sz w:val="18"/>
+                <w:szCs w:val="18"/>
+              </w:rPr>
+              <w:t xml:space="preserve">조정(1장)</w:t>
             </w:r>
           </w:p>
         </w:tc>
@@ -8560,97 +8786,97 @@
         </w:trPr>
         <w:tc>
           <w:tcPr>
-            <w:tcW w:type="dxa" w:w="1145"/>
-            <w:tcBorders>
-              <w:top w:val="single" w:color="BFC6BC" w:sz="4"/>
-              <w:left w:val="single" w:color="BFC6BC" w:sz="4"/>
-              <w:bottom w:val="single" w:color="BFC6BC" w:sz="4"/>
-              <w:right w:val="single" w:color="BFC6BC" w:sz="4"/>
-            </w:tcBorders>
-            <w:tcMar>
-              <w:top w:type="dxa" w:w="60"/>
-              <w:left w:type="dxa" w:w="100"/>
-              <w:bottom w:type="dxa" w:w="60"/>
-              <w:right w:type="dxa" w:w="100"/>
-            </w:tcMar>
-          </w:tcPr>
-          <w:p>
-            <w:pPr>
-              <w:spacing w:after="0" w:line="276"/>
-            </w:pPr>
-            <w:r>
-              <w:rPr>
-                <w:rFonts w:ascii="Malgun Gothic" w:cs="Malgun Gothic" w:eastAsia="맑은 고딕" w:hAnsi="Malgun Gothic"/>
-                <w:b w:val="false"/>
-                <w:bCs w:val="false"/>
-                <w:sz w:val="18"/>
-                <w:szCs w:val="18"/>
-              </w:rPr>
-              <w:t xml:space="preserve">5. 재해·복구 이력</w:t>
-            </w:r>
-          </w:p>
-        </w:tc>
-        <w:tc>
-          <w:tcPr>
-            <w:tcW w:type="dxa" w:w="5916"/>
-            <w:tcBorders>
-              <w:top w:val="single" w:color="BFC6BC" w:sz="4"/>
-              <w:left w:val="single" w:color="BFC6BC" w:sz="4"/>
-              <w:bottom w:val="single" w:color="BFC6BC" w:sz="4"/>
-              <w:right w:val="single" w:color="BFC6BC" w:sz="4"/>
-            </w:tcBorders>
-            <w:tcMar>
-              <w:top w:type="dxa" w:w="60"/>
-              <w:left w:type="dxa" w:w="100"/>
-              <w:bottom w:type="dxa" w:w="60"/>
-              <w:right w:type="dxa" w:w="100"/>
-            </w:tcMar>
-          </w:tcPr>
-          <w:p>
-            <w:pPr>
-              <w:spacing w:after="0" w:line="276"/>
-            </w:pPr>
-            <w:r>
-              <w:rPr>
-                <w:rFonts w:ascii="Malgun Gothic" w:cs="Malgun Gothic" w:eastAsia="맑은 고딕" w:hAnsi="Malgun Gothic"/>
-                <w:b w:val="false"/>
-                <w:bCs w:val="false"/>
-                <w:sz w:val="18"/>
-                <w:szCs w:val="18"/>
-              </w:rPr>
-              <w:t xml:space="preserve">산사태 발생, 산지사방사업 시행, 산불·병해충 피해 이력</w:t>
-            </w:r>
-          </w:p>
-        </w:tc>
-        <w:tc>
-          <w:tcPr>
-            <w:tcW w:type="dxa" w:w="2577"/>
-            <w:tcBorders>
-              <w:top w:val="single" w:color="BFC6BC" w:sz="4"/>
-              <w:left w:val="single" w:color="BFC6BC" w:sz="4"/>
-              <w:bottom w:val="single" w:color="BFC6BC" w:sz="4"/>
-              <w:right w:val="single" w:color="BFC6BC" w:sz="4"/>
-            </w:tcBorders>
-            <w:tcMar>
-              <w:top w:type="dxa" w:w="60"/>
-              <w:left w:type="dxa" w:w="100"/>
-              <w:bottom w:type="dxa" w:w="60"/>
-              <w:right w:type="dxa" w:w="100"/>
-            </w:tcMar>
-          </w:tcPr>
-          <w:p>
-            <w:pPr>
-              <w:spacing w:after="0" w:line="276"/>
-            </w:pPr>
-            <w:r>
-              <w:rPr>
-                <w:rFonts w:ascii="Malgun Gothic" w:cs="Malgun Gothic" w:eastAsia="맑은 고딕" w:hAnsi="Malgun Gothic"/>
-                <w:b w:val="false"/>
-                <w:bCs w:val="false"/>
-                <w:sz w:val="18"/>
-                <w:szCs w:val="18"/>
-              </w:rPr>
-              <w:t xml:space="preserve">사방사업지–벌채지 공간통계분석</w:t>
+            <w:tcW w:type="dxa" w:w="1726"/>
+            <w:tcBorders>
+              <w:top w:val="single" w:color="BFC6BC" w:sz="4"/>
+              <w:left w:val="single" w:color="BFC6BC" w:sz="4"/>
+              <w:bottom w:val="single" w:color="BFC6BC" w:sz="4"/>
+              <w:right w:val="single" w:color="BFC6BC" w:sz="4"/>
+            </w:tcBorders>
+            <w:tcMar>
+              <w:top w:type="dxa" w:w="60"/>
+              <w:left w:type="dxa" w:w="100"/>
+              <w:bottom w:type="dxa" w:w="60"/>
+              <w:right w:type="dxa" w:w="100"/>
+            </w:tcMar>
+          </w:tcPr>
+          <w:p>
+            <w:pPr>
+              <w:spacing w:after="0" w:line="276"/>
+            </w:pPr>
+            <w:r>
+              <w:rPr>
+                <w:rFonts w:ascii="Malgun Gothic" w:cs="Malgun Gothic" w:eastAsia="맑은 고딕" w:hAnsi="Malgun Gothic"/>
+                <w:b w:val="false"/>
+                <w:bCs w:val="false"/>
+                <w:sz w:val="18"/>
+                <w:szCs w:val="18"/>
+              </w:rPr>
+              <w:t xml:space="preserve">문헌 종합</w:t>
+            </w:r>
+          </w:p>
+        </w:tc>
+        <w:tc>
+          <w:tcPr>
+            <w:tcW w:type="dxa" w:w="1151"/>
+            <w:tcBorders>
+              <w:top w:val="single" w:color="BFC6BC" w:sz="4"/>
+              <w:left w:val="single" w:color="BFC6BC" w:sz="4"/>
+              <w:bottom w:val="single" w:color="BFC6BC" w:sz="4"/>
+              <w:right w:val="single" w:color="BFC6BC" w:sz="4"/>
+            </w:tcBorders>
+            <w:tcMar>
+              <w:top w:type="dxa" w:w="60"/>
+              <w:left w:type="dxa" w:w="100"/>
+              <w:bottom w:type="dxa" w:w="60"/>
+              <w:right w:type="dxa" w:w="100"/>
+            </w:tcMar>
+          </w:tcPr>
+          <w:p>
+            <w:pPr>
+              <w:spacing w:after="0" w:line="276"/>
+            </w:pPr>
+            <w:r>
+              <w:rPr>
+                <w:rFonts w:ascii="Malgun Gothic" w:cs="Malgun Gothic" w:eastAsia="맑은 고딕" w:hAnsi="Malgun Gothic"/>
+                <w:b w:val="false"/>
+                <w:bCs w:val="false"/>
+                <w:sz w:val="18"/>
+                <w:szCs w:val="18"/>
+              </w:rPr>
+              <w:t xml:space="preserve">10월</w:t>
+            </w:r>
+          </w:p>
+        </w:tc>
+        <w:tc>
+          <w:tcPr>
+            <w:tcW w:type="dxa" w:w="6761"/>
+            <w:tcBorders>
+              <w:top w:val="single" w:color="BFC6BC" w:sz="4"/>
+              <w:left w:val="single" w:color="BFC6BC" w:sz="4"/>
+              <w:bottom w:val="single" w:color="BFC6BC" w:sz="4"/>
+              <w:right w:val="single" w:color="BFC6BC" w:sz="4"/>
+            </w:tcBorders>
+            <w:tcMar>
+              <w:top w:type="dxa" w:w="60"/>
+              <w:left w:type="dxa" w:w="100"/>
+              <w:bottom w:type="dxa" w:w="60"/>
+              <w:right w:type="dxa" w:w="100"/>
+            </w:tcMar>
+          </w:tcPr>
+          <w:p>
+            <w:pPr>
+              <w:spacing w:after="0" w:line="276"/>
+            </w:pPr>
+            <w:r>
+              <w:rPr>
+                <w:rFonts w:ascii="Malgun Gothic" w:cs="Malgun Gothic" w:eastAsia="맑은 고딕" w:hAnsi="Malgun Gothic"/>
+                <w:b w:val="false"/>
+                <w:bCs w:val="false"/>
+                <w:sz w:val="18"/>
+                <w:szCs w:val="18"/>
+              </w:rPr>
+              <w:t xml:space="preserve">진행 중. 토사유출 문헌을 집재 방법 기준으로 재분류(표 5)</w:t>
             </w:r>
           </w:p>
         </w:tc>
@@ -8663,129 +8889,15 @@
     </w:p>
     <w:p>
       <w:pPr>
-        <w:spacing w:after="120"/>
+        <w:pStyle w:val="Heading2"/>
       </w:pPr>
       <w:r>
         <w:rPr>
           <w:rFonts w:ascii="Malgun Gothic" w:cs="Malgun Gothic" w:eastAsia="맑은 고딕" w:hAnsi="Malgun Gothic"/>
           <w:b w:val="false"/>
           <w:bCs w:val="false"/>
-          <w:color w:val="5D685F"/>
-          <w:sz w:val="18"/>
-          <w:szCs w:val="18"/>
-        </w:rPr>
-        <w:t xml:space="preserve">기재요령에 집재 방법과 토양 항목이 없어, 집재 방법은 기록된 경우에만 요청하고 토양은 산림입지토양도로 보완한다. 미벌채 대조구는 청구 범위 밖이므로 임상도로 보완한다. 청구서 원문은 별도 「정보공개 청구서(안)」로 정리하였다.</w:t>
-      </w:r>
-    </w:p>
-    <w:p>
-      <w:pPr>
-        <w:pStyle w:val="Heading2"/>
-      </w:pPr>
-      <w:r>
-        <w:rPr>
-          <w:rFonts w:ascii="Malgun Gothic" w:cs="Malgun Gothic" w:eastAsia="맑은 고딕" w:hAnsi="Malgun Gothic"/>
-          <w:b w:val="false"/>
-          <w:bCs w:val="false"/>
-        </w:rPr>
-        <w:t xml:space="preserve">4.5 표본 구성</w:t>
-      </w:r>
-    </w:p>
-    <w:p>
-      <w:pPr>
-        <w:pStyle w:val="ListParagraph"/>
-        <w:numPr>
-          <w:ilvl w:val="0"/>
-          <w:numId w:val="3"/>
-        </w:numPr>
-        <w:spacing w:after="60"/>
-      </w:pPr>
-      <w:r>
-        <w:rPr>
-          <w:rFonts w:ascii="Malgun Gothic" w:cs="Malgun Gothic" w:eastAsia="맑은 고딕" w:hAnsi="Malgun Gothic"/>
-          <w:b w:val="false"/>
-          <w:bCs w:val="false"/>
-        </w:rPr>
-        <w:t xml:space="preserve">표본 단위는 소반으로 한다. 임반은 100ha 내외로 구획되어 크고, 소반은 임상·임령·작업종 등이 다르면 따로 구획(최소 1ha)되므로 벌채 이력이 같은 단위이다.</w:t>
-      </w:r>
-    </w:p>
-    <w:p>
-      <w:pPr>
-        <w:pStyle w:val="ListParagraph"/>
-        <w:numPr>
-          <w:ilvl w:val="0"/>
-          <w:numId w:val="3"/>
-        </w:numPr>
-        <w:spacing w:after="60"/>
-      </w:pPr>
-      <w:r>
-        <w:rPr>
-          <w:rFonts w:ascii="Malgun Gothic" w:cs="Malgun Gothic" w:eastAsia="맑은 고딕" w:hAnsi="Malgun Gothic"/>
-          <w:b w:val="false"/>
-          <w:bCs w:val="false"/>
-        </w:rPr>
-        <w:t xml:space="preserve">한 사이트가 아니라 임도를 따라 벌채 후 경과연수가 다른 소반들을 고른다(예: 2017년 벌채 소반 약 9년 경과, 약 40년 전 벌채 소반).</w:t>
-      </w:r>
-    </w:p>
-    <w:p>
-      <w:pPr>
-        <w:pStyle w:val="ListParagraph"/>
-        <w:numPr>
-          <w:ilvl w:val="0"/>
-          <w:numId w:val="3"/>
-        </w:numPr>
-        <w:spacing w:after="60"/>
-      </w:pPr>
-      <w:r>
-        <w:rPr>
-          <w:rFonts w:ascii="Malgun Gothic" w:cs="Malgun Gothic" w:eastAsia="맑은 고딕" w:hAnsi="Malgun Gothic"/>
-          <w:b w:val="false"/>
-          <w:bCs w:val="false"/>
-        </w:rPr>
-        <w:t xml:space="preserve">전국자연환경조사 조사지점과 공간적으로 겹치는 소반을 우선 선정한다.</w:t>
-      </w:r>
-    </w:p>
-    <w:p>
-      <w:pPr>
-        <w:pStyle w:val="ListParagraph"/>
-        <w:numPr>
-          <w:ilvl w:val="0"/>
-          <w:numId w:val="3"/>
-        </w:numPr>
-        <w:spacing w:after="60"/>
-      </w:pPr>
-      <w:r>
-        <w:rPr>
-          <w:rFonts w:ascii="Malgun Gothic" w:cs="Malgun Gothic" w:eastAsia="맑은 고딕" w:hAnsi="Malgun Gothic"/>
-          <w:b w:val="false"/>
-          <w:bCs w:val="false"/>
-        </w:rPr>
-        <w:t xml:space="preserve">사례지 설명에는 입지 조건, 위치도, 소반별 경영이력, 측정 가능한 변수(경사·토양·임상·임도 거리 등)를 담는다.</w:t>
-      </w:r>
-    </w:p>
-    <w:p>
-      <w:pPr>
-        <w:pStyle w:val="Heading1"/>
-      </w:pPr>
-      <w:r>
-        <w:rPr>
-          <w:rFonts w:ascii="Malgun Gothic" w:cs="Malgun Gothic" w:eastAsia="맑은 고딕" w:hAnsi="Malgun Gothic"/>
-          <w:b w:val="false"/>
-          <w:bCs w:val="false"/>
-        </w:rPr>
-        <w:t xml:space="preserve">5. 추진 현황과 향후 일정</w:t>
-      </w:r>
-    </w:p>
-    <w:p>
-      <w:pPr>
-        <w:pStyle w:val="Heading2"/>
-      </w:pPr>
-      <w:r>
-        <w:rPr>
-          <w:rFonts w:ascii="Malgun Gothic" w:cs="Malgun Gothic" w:eastAsia="맑은 고딕" w:hAnsi="Malgun Gothic"/>
-          <w:b w:val="false"/>
-          <w:bCs w:val="false"/>
-        </w:rPr>
-        <w:t xml:space="preserve">5.1 착수보고서 대비 추진 현황</w:t>
+        </w:rPr>
+        <w:t xml:space="preserve">5.2 향후 일정</w:t>
       </w:r>
     </w:p>
     <w:tbl>
@@ -8801,9 +8913,9 @@
         </w:tblBorders>
       </w:tblPr>
       <w:tblGrid>
-        <w:gridCol w:w="1606"/>
-        <w:gridCol w:w="1071"/>
-        <w:gridCol w:w="6961"/>
+        <w:gridCol w:w="829"/>
+        <w:gridCol w:w="7980"/>
+        <w:gridCol w:w="829"/>
       </w:tblGrid>
       <w:tr>
         <w:trPr>
@@ -8811,7 +8923,7 @@
         </w:trPr>
         <w:tc>
           <w:tcPr>
-            <w:tcW w:type="dxa" w:w="1606"/>
+            <w:tcW w:type="dxa" w:w="829"/>
             <w:tcBorders>
               <w:top w:val="single" w:color="BFC6BC" w:sz="4"/>
               <w:left w:val="single" w:color="BFC6BC" w:sz="4"/>
@@ -8838,13 +8950,13 @@
                 <w:sz w:val="18"/>
                 <w:szCs w:val="18"/>
               </w:rPr>
-              <w:t xml:space="preserve">착수보고서 계획</w:t>
-            </w:r>
-          </w:p>
-        </w:tc>
-        <w:tc>
-          <w:tcPr>
-            <w:tcW w:type="dxa" w:w="1071"/>
+              <w:t xml:space="preserve">시기</w:t>
+            </w:r>
+          </w:p>
+        </w:tc>
+        <w:tc>
+          <w:tcPr>
+            <w:tcW w:type="dxa" w:w="7980"/>
             <w:tcBorders>
               <w:top w:val="single" w:color="BFC6BC" w:sz="4"/>
               <w:left w:val="single" w:color="BFC6BC" w:sz="4"/>
@@ -8871,13 +8983,13 @@
                 <w:sz w:val="18"/>
                 <w:szCs w:val="18"/>
               </w:rPr>
-              <w:t xml:space="preserve">시기</w:t>
-            </w:r>
-          </w:p>
-        </w:tc>
-        <w:tc>
-          <w:tcPr>
-            <w:tcW w:type="dxa" w:w="6961"/>
+              <w:t xml:space="preserve">주요 내용</w:t>
+            </w:r>
+          </w:p>
+        </w:tc>
+        <w:tc>
+          <w:tcPr>
+            <w:tcW w:type="dxa" w:w="829"/>
             <w:tcBorders>
               <w:top w:val="single" w:color="BFC6BC" w:sz="4"/>
               <w:left w:val="single" w:color="BFC6BC" w:sz="4"/>
@@ -8904,7 +9016,7 @@
                 <w:sz w:val="18"/>
                 <w:szCs w:val="18"/>
               </w:rPr>
-              <w:t xml:space="preserve">현황</w:t>
+              <w:t xml:space="preserve">산출</w:t>
             </w:r>
           </w:p>
         </w:tc>
@@ -8915,97 +9027,97 @@
         </w:trPr>
         <w:tc>
           <w:tcPr>
-            <w:tcW w:type="dxa" w:w="1606"/>
-            <w:tcBorders>
-              <w:top w:val="single" w:color="BFC6BC" w:sz="4"/>
-              <w:left w:val="single" w:color="BFC6BC" w:sz="4"/>
-              <w:bottom w:val="single" w:color="BFC6BC" w:sz="4"/>
-              <w:right w:val="single" w:color="BFC6BC" w:sz="4"/>
-            </w:tcBorders>
-            <w:tcMar>
-              <w:top w:type="dxa" w:w="60"/>
-              <w:left w:type="dxa" w:w="100"/>
-              <w:bottom w:type="dxa" w:w="60"/>
-              <w:right w:type="dxa" w:w="100"/>
-            </w:tcMar>
-          </w:tcPr>
-          <w:p>
-            <w:pPr>
-              <w:spacing w:after="0" w:line="276"/>
-            </w:pPr>
-            <w:r>
-              <w:rPr>
-                <w:rFonts w:ascii="Malgun Gothic" w:cs="Malgun Gothic" w:eastAsia="맑은 고딕" w:hAnsi="Malgun Gothic"/>
-                <w:b w:val="false"/>
-                <w:bCs w:val="false"/>
-                <w:sz w:val="18"/>
-                <w:szCs w:val="18"/>
-              </w:rPr>
-              <w:t xml:space="preserve">사례지 선정</w:t>
-            </w:r>
-          </w:p>
-        </w:tc>
-        <w:tc>
-          <w:tcPr>
-            <w:tcW w:type="dxa" w:w="1071"/>
-            <w:tcBorders>
-              <w:top w:val="single" w:color="BFC6BC" w:sz="4"/>
-              <w:left w:val="single" w:color="BFC6BC" w:sz="4"/>
-              <w:bottom w:val="single" w:color="BFC6BC" w:sz="4"/>
-              <w:right w:val="single" w:color="BFC6BC" w:sz="4"/>
-            </w:tcBorders>
-            <w:tcMar>
-              <w:top w:type="dxa" w:w="60"/>
-              <w:left w:type="dxa" w:w="100"/>
-              <w:bottom w:type="dxa" w:w="60"/>
-              <w:right w:type="dxa" w:w="100"/>
-            </w:tcMar>
-          </w:tcPr>
-          <w:p>
-            <w:pPr>
-              <w:spacing w:after="0" w:line="276"/>
-            </w:pPr>
-            <w:r>
-              <w:rPr>
-                <w:rFonts w:ascii="Malgun Gothic" w:cs="Malgun Gothic" w:eastAsia="맑은 고딕" w:hAnsi="Malgun Gothic"/>
-                <w:b w:val="false"/>
-                <w:bCs w:val="false"/>
-                <w:sz w:val="18"/>
-                <w:szCs w:val="18"/>
-              </w:rPr>
-              <w:t xml:space="preserve">9월</w:t>
-            </w:r>
-          </w:p>
-        </w:tc>
-        <w:tc>
-          <w:tcPr>
-            <w:tcW w:type="dxa" w:w="6961"/>
-            <w:tcBorders>
-              <w:top w:val="single" w:color="BFC6BC" w:sz="4"/>
-              <w:left w:val="single" w:color="BFC6BC" w:sz="4"/>
-              <w:bottom w:val="single" w:color="BFC6BC" w:sz="4"/>
-              <w:right w:val="single" w:color="BFC6BC" w:sz="4"/>
-            </w:tcBorders>
-            <w:tcMar>
-              <w:top w:type="dxa" w:w="60"/>
-              <w:left w:type="dxa" w:w="100"/>
-              <w:bottom w:type="dxa" w:w="60"/>
-              <w:right w:type="dxa" w:w="100"/>
-            </w:tcMar>
-          </w:tcPr>
-          <w:p>
-            <w:pPr>
-              <w:spacing w:after="0" w:line="276"/>
-            </w:pPr>
-            <w:r>
-              <w:rPr>
-                <w:rFonts w:ascii="Malgun Gothic" w:cs="Malgun Gothic" w:eastAsia="맑은 고딕" w:hAnsi="Malgun Gothic"/>
-                <w:b w:val="false"/>
-                <w:bCs w:val="false"/>
-                <w:sz w:val="18"/>
-                <w:szCs w:val="18"/>
-              </w:rPr>
-              <w:t xml:space="preserve">진행 중. 청구 대상(동부·북부지방산림청) 선정, 청구서(안) 작성 완료</w:t>
+            <w:tcW w:type="dxa" w:w="829"/>
+            <w:tcBorders>
+              <w:top w:val="single" w:color="BFC6BC" w:sz="4"/>
+              <w:left w:val="single" w:color="BFC6BC" w:sz="4"/>
+              <w:bottom w:val="single" w:color="BFC6BC" w:sz="4"/>
+              <w:right w:val="single" w:color="BFC6BC" w:sz="4"/>
+            </w:tcBorders>
+            <w:tcMar>
+              <w:top w:type="dxa" w:w="60"/>
+              <w:left w:type="dxa" w:w="100"/>
+              <w:bottom w:type="dxa" w:w="60"/>
+              <w:right w:type="dxa" w:w="100"/>
+            </w:tcMar>
+          </w:tcPr>
+          <w:p>
+            <w:pPr>
+              <w:spacing w:after="0" w:line="276"/>
+            </w:pPr>
+            <w:r>
+              <w:rPr>
+                <w:rFonts w:ascii="Malgun Gothic" w:cs="Malgun Gothic" w:eastAsia="맑은 고딕" w:hAnsi="Malgun Gothic"/>
+                <w:b w:val="false"/>
+                <w:bCs w:val="false"/>
+                <w:sz w:val="18"/>
+                <w:szCs w:val="18"/>
+              </w:rPr>
+              <w:t xml:space="preserve">2026.10</w:t>
+            </w:r>
+          </w:p>
+        </w:tc>
+        <w:tc>
+          <w:tcPr>
+            <w:tcW w:type="dxa" w:w="7980"/>
+            <w:tcBorders>
+              <w:top w:val="single" w:color="BFC6BC" w:sz="4"/>
+              <w:left w:val="single" w:color="BFC6BC" w:sz="4"/>
+              <w:bottom w:val="single" w:color="BFC6BC" w:sz="4"/>
+              <w:right w:val="single" w:color="BFC6BC" w:sz="4"/>
+            </w:tcBorders>
+            <w:tcMar>
+              <w:top w:type="dxa" w:w="60"/>
+              <w:left w:type="dxa" w:w="100"/>
+              <w:bottom w:type="dxa" w:w="60"/>
+              <w:right w:type="dxa" w:w="100"/>
+            </w:tcMar>
+          </w:tcPr>
+          <w:p>
+            <w:pPr>
+              <w:spacing w:after="0" w:line="276"/>
+            </w:pPr>
+            <w:r>
+              <w:rPr>
+                <w:rFonts w:ascii="Malgun Gothic" w:cs="Malgun Gothic" w:eastAsia="맑은 고딕" w:hAnsi="Malgun Gothic"/>
+                <w:b w:val="false"/>
+                <w:bCs w:val="false"/>
+                <w:sz w:val="18"/>
+                <w:szCs w:val="18"/>
+              </w:rPr>
+              <w:t xml:space="preserve">정보공개 청구(완료), WEPP 공통 입력자료(기상·DEM·토양도·임상도) 구축, 문헌 재분류, 자연환경조사 자료 확보</w:t>
+            </w:r>
+          </w:p>
+        </w:tc>
+        <w:tc>
+          <w:tcPr>
+            <w:tcW w:type="dxa" w:w="829"/>
+            <w:tcBorders>
+              <w:top w:val="single" w:color="BFC6BC" w:sz="4"/>
+              <w:left w:val="single" w:color="BFC6BC" w:sz="4"/>
+              <w:bottom w:val="single" w:color="BFC6BC" w:sz="4"/>
+              <w:right w:val="single" w:color="BFC6BC" w:sz="4"/>
+            </w:tcBorders>
+            <w:tcMar>
+              <w:top w:type="dxa" w:w="60"/>
+              <w:left w:type="dxa" w:w="100"/>
+              <w:bottom w:type="dxa" w:w="60"/>
+              <w:right w:type="dxa" w:w="100"/>
+            </w:tcMar>
+          </w:tcPr>
+          <w:p>
+            <w:pPr>
+              <w:spacing w:after="0" w:line="276"/>
+            </w:pPr>
+            <w:r>
+              <w:rPr>
+                <w:rFonts w:ascii="Malgun Gothic" w:cs="Malgun Gothic" w:eastAsia="맑은 고딕" w:hAnsi="Malgun Gothic"/>
+                <w:b w:val="false"/>
+                <w:bCs w:val="false"/>
+                <w:sz w:val="18"/>
+                <w:szCs w:val="18"/>
+              </w:rPr>
+              <w:t xml:space="preserve">문헌 정리표</w:t>
             </w:r>
           </w:p>
         </w:tc>
@@ -9016,97 +9128,97 @@
         </w:trPr>
         <w:tc>
           <w:tcPr>
-            <w:tcW w:type="dxa" w:w="1606"/>
-            <w:tcBorders>
-              <w:top w:val="single" w:color="BFC6BC" w:sz="4"/>
-              <w:left w:val="single" w:color="BFC6BC" w:sz="4"/>
-              <w:bottom w:val="single" w:color="BFC6BC" w:sz="4"/>
-              <w:right w:val="single" w:color="BFC6BC" w:sz="4"/>
-            </w:tcBorders>
-            <w:tcMar>
-              <w:top w:type="dxa" w:w="60"/>
-              <w:left w:type="dxa" w:w="100"/>
-              <w:bottom w:type="dxa" w:w="60"/>
-              <w:right w:type="dxa" w:w="100"/>
-            </w:tcMar>
-          </w:tcPr>
-          <w:p>
-            <w:pPr>
-              <w:spacing w:after="0" w:line="276"/>
-            </w:pPr>
-            <w:r>
-              <w:rPr>
-                <w:rFonts w:ascii="Malgun Gothic" w:cs="Malgun Gothic" w:eastAsia="맑은 고딕" w:hAnsi="Malgun Gothic"/>
-                <w:b w:val="false"/>
-                <w:bCs w:val="false"/>
-                <w:sz w:val="18"/>
-                <w:szCs w:val="18"/>
-              </w:rPr>
-              <w:t xml:space="preserve">경제성 산출 자료 수집</w:t>
-            </w:r>
-          </w:p>
-        </w:tc>
-        <w:tc>
-          <w:tcPr>
-            <w:tcW w:type="dxa" w:w="1071"/>
-            <w:tcBorders>
-              <w:top w:val="single" w:color="BFC6BC" w:sz="4"/>
-              <w:left w:val="single" w:color="BFC6BC" w:sz="4"/>
-              <w:bottom w:val="single" w:color="BFC6BC" w:sz="4"/>
-              <w:right w:val="single" w:color="BFC6BC" w:sz="4"/>
-            </w:tcBorders>
-            <w:tcMar>
-              <w:top w:type="dxa" w:w="60"/>
-              <w:left w:type="dxa" w:w="100"/>
-              <w:bottom w:type="dxa" w:w="60"/>
-              <w:right w:type="dxa" w:w="100"/>
-            </w:tcMar>
-          </w:tcPr>
-          <w:p>
-            <w:pPr>
-              <w:spacing w:after="0" w:line="276"/>
-            </w:pPr>
-            <w:r>
-              <w:rPr>
-                <w:rFonts w:ascii="Malgun Gothic" w:cs="Malgun Gothic" w:eastAsia="맑은 고딕" w:hAnsi="Malgun Gothic"/>
-                <w:b w:val="false"/>
-                <w:bCs w:val="false"/>
-                <w:sz w:val="18"/>
-                <w:szCs w:val="18"/>
-              </w:rPr>
-              <w:t xml:space="preserve">9월</w:t>
-            </w:r>
-          </w:p>
-        </w:tc>
-        <w:tc>
-          <w:tcPr>
-            <w:tcW w:type="dxa" w:w="6961"/>
-            <w:tcBorders>
-              <w:top w:val="single" w:color="BFC6BC" w:sz="4"/>
-              <w:left w:val="single" w:color="BFC6BC" w:sz="4"/>
-              <w:bottom w:val="single" w:color="BFC6BC" w:sz="4"/>
-              <w:right w:val="single" w:color="BFC6BC" w:sz="4"/>
-            </w:tcBorders>
-            <w:tcMar>
-              <w:top w:type="dxa" w:w="60"/>
-              <w:left w:type="dxa" w:w="100"/>
-              <w:bottom w:type="dxa" w:w="60"/>
-              <w:right w:type="dxa" w:w="100"/>
-            </w:tcMar>
-          </w:tcPr>
-          <w:p>
-            <w:pPr>
-              <w:spacing w:after="0" w:line="276"/>
-            </w:pPr>
-            <w:r>
-              <w:rPr>
-                <w:rFonts w:ascii="Malgun Gothic" w:cs="Malgun Gothic" w:eastAsia="맑은 고딕" w:hAnsi="Malgun Gothic"/>
-                <w:b w:val="false"/>
-                <w:bCs w:val="false"/>
-                <w:sz w:val="18"/>
-                <w:szCs w:val="18"/>
-              </w:rPr>
-              <w:t xml:space="preserve">진행 중. 국유림 경영비용·매각단가(홍석환·안미연, 2025), 목재매각실적 정리</w:t>
+            <w:tcW w:type="dxa" w:w="829"/>
+            <w:tcBorders>
+              <w:top w:val="single" w:color="BFC6BC" w:sz="4"/>
+              <w:left w:val="single" w:color="BFC6BC" w:sz="4"/>
+              <w:bottom w:val="single" w:color="BFC6BC" w:sz="4"/>
+              <w:right w:val="single" w:color="BFC6BC" w:sz="4"/>
+            </w:tcBorders>
+            <w:tcMar>
+              <w:top w:type="dxa" w:w="60"/>
+              <w:left w:type="dxa" w:w="100"/>
+              <w:bottom w:type="dxa" w:w="60"/>
+              <w:right w:type="dxa" w:w="100"/>
+            </w:tcMar>
+          </w:tcPr>
+          <w:p>
+            <w:pPr>
+              <w:spacing w:after="0" w:line="276"/>
+            </w:pPr>
+            <w:r>
+              <w:rPr>
+                <w:rFonts w:ascii="Malgun Gothic" w:cs="Malgun Gothic" w:eastAsia="맑은 고딕" w:hAnsi="Malgun Gothic"/>
+                <w:b w:val="false"/>
+                <w:bCs w:val="false"/>
+                <w:sz w:val="18"/>
+                <w:szCs w:val="18"/>
+              </w:rPr>
+              <w:t xml:space="preserve">2026.11</w:t>
+            </w:r>
+          </w:p>
+        </w:tc>
+        <w:tc>
+          <w:tcPr>
+            <w:tcW w:type="dxa" w:w="7980"/>
+            <w:tcBorders>
+              <w:top w:val="single" w:color="BFC6BC" w:sz="4"/>
+              <w:left w:val="single" w:color="BFC6BC" w:sz="4"/>
+              <w:bottom w:val="single" w:color="BFC6BC" w:sz="4"/>
+              <w:right w:val="single" w:color="BFC6BC" w:sz="4"/>
+            </w:tcBorders>
+            <w:tcMar>
+              <w:top w:type="dxa" w:w="60"/>
+              <w:left w:type="dxa" w:w="100"/>
+              <w:bottom w:type="dxa" w:w="60"/>
+              <w:right w:type="dxa" w:w="100"/>
+            </w:tcMar>
+          </w:tcPr>
+          <w:p>
+            <w:pPr>
+              <w:spacing w:after="0" w:line="276"/>
+            </w:pPr>
+            <w:r>
+              <w:rPr>
+                <w:rFonts w:ascii="Malgun Gothic" w:cs="Malgun Gothic" w:eastAsia="맑은 고딕" w:hAnsi="Malgun Gothic"/>
+                <w:b w:val="false"/>
+                <w:bCs w:val="false"/>
+                <w:sz w:val="18"/>
+                <w:szCs w:val="18"/>
+              </w:rPr>
+              <w:t xml:space="preserve">정보공개 자료 수령, 관리소·소반 선정, 자연환경조사 지점 중첩 확인, WEPP 모의, 생물다양성 지수 분석, 경제적 최적벌기령 산출 착수</w:t>
+            </w:r>
+          </w:p>
+        </w:tc>
+        <w:tc>
+          <w:tcPr>
+            <w:tcW w:type="dxa" w:w="829"/>
+            <w:tcBorders>
+              <w:top w:val="single" w:color="BFC6BC" w:sz="4"/>
+              <w:left w:val="single" w:color="BFC6BC" w:sz="4"/>
+              <w:bottom w:val="single" w:color="BFC6BC" w:sz="4"/>
+              <w:right w:val="single" w:color="BFC6BC" w:sz="4"/>
+            </w:tcBorders>
+            <w:tcMar>
+              <w:top w:type="dxa" w:w="60"/>
+              <w:left w:type="dxa" w:w="100"/>
+              <w:bottom w:type="dxa" w:w="60"/>
+              <w:right w:type="dxa" w:w="100"/>
+            </w:tcMar>
+          </w:tcPr>
+          <w:p>
+            <w:pPr>
+              <w:spacing w:after="0" w:line="276"/>
+            </w:pPr>
+            <w:r>
+              <w:rPr>
+                <w:rFonts w:ascii="Malgun Gothic" w:cs="Malgun Gothic" w:eastAsia="맑은 고딕" w:hAnsi="Malgun Gothic"/>
+                <w:b w:val="false"/>
+                <w:bCs w:val="false"/>
+                <w:sz w:val="18"/>
+                <w:szCs w:val="18"/>
+              </w:rPr>
+              <w:t xml:space="preserve">범위값 초안</w:t>
             </w:r>
           </w:p>
         </w:tc>
@@ -9117,1358 +9229,7 @@
         </w:trPr>
         <w:tc>
           <w:tcPr>
-            <w:tcW w:type="dxa" w:w="1606"/>
-            <w:tcBorders>
-              <w:top w:val="single" w:color="BFC6BC" w:sz="4"/>
-              <w:left w:val="single" w:color="BFC6BC" w:sz="4"/>
-              <w:bottom w:val="single" w:color="BFC6BC" w:sz="4"/>
-              <w:right w:val="single" w:color="BFC6BC" w:sz="4"/>
-            </w:tcBorders>
-            <w:tcMar>
-              <w:top w:type="dxa" w:w="60"/>
-              <w:left w:type="dxa" w:w="100"/>
-              <w:bottom w:type="dxa" w:w="60"/>
-              <w:right w:type="dxa" w:w="100"/>
-            </w:tcMar>
-          </w:tcPr>
-          <w:p>
-            <w:pPr>
-              <w:spacing w:after="0" w:line="276"/>
-            </w:pPr>
-            <w:r>
-              <w:rPr>
-                <w:rFonts w:ascii="Malgun Gothic" w:cs="Malgun Gothic" w:eastAsia="맑은 고딕" w:hAnsi="Malgun Gothic"/>
-                <w:b w:val="false"/>
-                <w:bCs w:val="false"/>
-                <w:sz w:val="18"/>
-                <w:szCs w:val="18"/>
-              </w:rPr>
-              <w:t xml:space="preserve">토사유출 전문가 자문</w:t>
-            </w:r>
-          </w:p>
-        </w:tc>
-        <w:tc>
-          <w:tcPr>
-            <w:tcW w:type="dxa" w:w="1071"/>
-            <w:tcBorders>
-              <w:top w:val="single" w:color="BFC6BC" w:sz="4"/>
-              <w:left w:val="single" w:color="BFC6BC" w:sz="4"/>
-              <w:bottom w:val="single" w:color="BFC6BC" w:sz="4"/>
-              <w:right w:val="single" w:color="BFC6BC" w:sz="4"/>
-            </w:tcBorders>
-            <w:tcMar>
-              <w:top w:type="dxa" w:w="60"/>
-              <w:left w:type="dxa" w:w="100"/>
-              <w:bottom w:type="dxa" w:w="60"/>
-              <w:right w:type="dxa" w:w="100"/>
-            </w:tcMar>
-          </w:tcPr>
-          <w:p>
-            <w:pPr>
-              <w:spacing w:after="0" w:line="276"/>
-            </w:pPr>
-            <w:r>
-              <w:rPr>
-                <w:rFonts w:ascii="Malgun Gothic" w:cs="Malgun Gothic" w:eastAsia="맑은 고딕" w:hAnsi="Malgun Gothic"/>
-                <w:b w:val="false"/>
-                <w:bCs w:val="false"/>
-                <w:sz w:val="18"/>
-                <w:szCs w:val="18"/>
-              </w:rPr>
-              <w:t xml:space="preserve">—</w:t>
-            </w:r>
-          </w:p>
-        </w:tc>
-        <w:tc>
-          <w:tcPr>
-            <w:tcW w:type="dxa" w:w="6961"/>
-            <w:tcBorders>
-              <w:top w:val="single" w:color="BFC6BC" w:sz="4"/>
-              <w:left w:val="single" w:color="BFC6BC" w:sz="4"/>
-              <w:bottom w:val="single" w:color="BFC6BC" w:sz="4"/>
-              <w:right w:val="single" w:color="BFC6BC" w:sz="4"/>
-            </w:tcBorders>
-            <w:tcMar>
-              <w:top w:type="dxa" w:w="60"/>
-              <w:left w:type="dxa" w:w="100"/>
-              <w:bottom w:type="dxa" w:w="60"/>
-              <w:right w:type="dxa" w:w="100"/>
-            </w:tcMar>
-          </w:tcPr>
-          <w:p>
-            <w:pPr>
-              <w:spacing w:after="0" w:line="276"/>
-            </w:pPr>
-            <w:r>
-              <w:rPr>
-                <w:rFonts w:ascii="Malgun Gothic" w:cs="Malgun Gothic" w:eastAsia="맑은 고딕" w:hAnsi="Malgun Gothic"/>
-                <w:b w:val="false"/>
-                <w:bCs w:val="false"/>
-                <w:sz w:val="18"/>
-                <w:szCs w:val="18"/>
-              </w:rPr>
-              <w:t xml:space="preserve">완료. 이학준 교수(집재 방식, 침식 모형)</w:t>
-            </w:r>
-          </w:p>
-        </w:tc>
-      </w:tr>
-      <w:tr>
-        <w:trPr>
-          <w:tblHeader w:val="false"/>
-        </w:trPr>
-        <w:tc>
-          <w:tcPr>
-            <w:tcW w:type="dxa" w:w="1606"/>
-            <w:tcBorders>
-              <w:top w:val="single" w:color="BFC6BC" w:sz="4"/>
-              <w:left w:val="single" w:color="BFC6BC" w:sz="4"/>
-              <w:bottom w:val="single" w:color="BFC6BC" w:sz="4"/>
-              <w:right w:val="single" w:color="BFC6BC" w:sz="4"/>
-            </w:tcBorders>
-            <w:tcMar>
-              <w:top w:type="dxa" w:w="60"/>
-              <w:left w:type="dxa" w:w="100"/>
-              <w:bottom w:type="dxa" w:w="60"/>
-              <w:right w:type="dxa" w:w="100"/>
-            </w:tcMar>
-          </w:tcPr>
-          <w:p>
-            <w:pPr>
-              <w:spacing w:after="0" w:line="276"/>
-            </w:pPr>
-            <w:r>
-              <w:rPr>
-                <w:rFonts w:ascii="Malgun Gothic" w:cs="Malgun Gothic" w:eastAsia="맑은 고딕" w:hAnsi="Malgun Gothic"/>
-                <w:b w:val="false"/>
-                <w:bCs w:val="false"/>
-                <w:sz w:val="18"/>
-                <w:szCs w:val="18"/>
-              </w:rPr>
-              <w:t xml:space="preserve">사례지 현장조사</w:t>
-            </w:r>
-          </w:p>
-        </w:tc>
-        <w:tc>
-          <w:tcPr>
-            <w:tcW w:type="dxa" w:w="1071"/>
-            <w:tcBorders>
-              <w:top w:val="single" w:color="BFC6BC" w:sz="4"/>
-              <w:left w:val="single" w:color="BFC6BC" w:sz="4"/>
-              <w:bottom w:val="single" w:color="BFC6BC" w:sz="4"/>
-              <w:right w:val="single" w:color="BFC6BC" w:sz="4"/>
-            </w:tcBorders>
-            <w:tcMar>
-              <w:top w:type="dxa" w:w="60"/>
-              <w:left w:type="dxa" w:w="100"/>
-              <w:bottom w:type="dxa" w:w="60"/>
-              <w:right w:type="dxa" w:w="100"/>
-            </w:tcMar>
-          </w:tcPr>
-          <w:p>
-            <w:pPr>
-              <w:spacing w:after="0" w:line="276"/>
-            </w:pPr>
-            <w:r>
-              <w:rPr>
-                <w:rFonts w:ascii="Malgun Gothic" w:cs="Malgun Gothic" w:eastAsia="맑은 고딕" w:hAnsi="Malgun Gothic"/>
-                <w:b w:val="false"/>
-                <w:bCs w:val="false"/>
-                <w:sz w:val="18"/>
-                <w:szCs w:val="18"/>
-              </w:rPr>
-              <w:t xml:space="preserve">10월</w:t>
-            </w:r>
-          </w:p>
-        </w:tc>
-        <w:tc>
-          <w:tcPr>
-            <w:tcW w:type="dxa" w:w="6961"/>
-            <w:tcBorders>
-              <w:top w:val="single" w:color="BFC6BC" w:sz="4"/>
-              <w:left w:val="single" w:color="BFC6BC" w:sz="4"/>
-              <w:bottom w:val="single" w:color="BFC6BC" w:sz="4"/>
-              <w:right w:val="single" w:color="BFC6BC" w:sz="4"/>
-            </w:tcBorders>
-            <w:tcMar>
-              <w:top w:type="dxa" w:w="60"/>
-              <w:left w:type="dxa" w:w="100"/>
-              <w:bottom w:type="dxa" w:w="60"/>
-              <w:right w:type="dxa" w:w="100"/>
-            </w:tcMar>
-          </w:tcPr>
-          <w:p>
-            <w:pPr>
-              <w:spacing w:after="0" w:line="276"/>
-            </w:pPr>
-            <w:r>
-              <w:rPr>
-                <w:rFonts w:ascii="Malgun Gothic" w:cs="Malgun Gothic" w:eastAsia="맑은 고딕" w:hAnsi="Malgun Gothic"/>
-                <w:b w:val="false"/>
-                <w:bCs w:val="false"/>
-                <w:sz w:val="18"/>
-                <w:szCs w:val="18"/>
-              </w:rPr>
-              <w:t xml:space="preserve">조정. 토사유출은 WEPP 예측과 문헌 실측값 보정, 생물다양성은 자연환경조사 자료 분석 중심</w:t>
-            </w:r>
-          </w:p>
-        </w:tc>
-      </w:tr>
-      <w:tr>
-        <w:trPr>
-          <w:tblHeader w:val="false"/>
-        </w:trPr>
-        <w:tc>
-          <w:tcPr>
-            <w:tcW w:type="dxa" w:w="1606"/>
-            <w:tcBorders>
-              <w:top w:val="single" w:color="BFC6BC" w:sz="4"/>
-              <w:left w:val="single" w:color="BFC6BC" w:sz="4"/>
-              <w:bottom w:val="single" w:color="BFC6BC" w:sz="4"/>
-              <w:right w:val="single" w:color="BFC6BC" w:sz="4"/>
-            </w:tcBorders>
-            <w:tcMar>
-              <w:top w:type="dxa" w:w="60"/>
-              <w:left w:type="dxa" w:w="100"/>
-              <w:bottom w:type="dxa" w:w="60"/>
-              <w:right w:type="dxa" w:w="100"/>
-            </w:tcMar>
-          </w:tcPr>
-          <w:p>
-            <w:pPr>
-              <w:spacing w:after="0" w:line="276"/>
-            </w:pPr>
-            <w:r>
-              <w:rPr>
-                <w:rFonts w:ascii="Malgun Gothic" w:cs="Malgun Gothic" w:eastAsia="맑은 고딕" w:hAnsi="Malgun Gothic"/>
-                <w:b w:val="false"/>
-                <w:bCs w:val="false"/>
-                <w:sz w:val="18"/>
-                <w:szCs w:val="18"/>
-              </w:rPr>
-              <w:t xml:space="preserve">문헌 종합</w:t>
-            </w:r>
-          </w:p>
-        </w:tc>
-        <w:tc>
-          <w:tcPr>
-            <w:tcW w:type="dxa" w:w="1071"/>
-            <w:tcBorders>
-              <w:top w:val="single" w:color="BFC6BC" w:sz="4"/>
-              <w:left w:val="single" w:color="BFC6BC" w:sz="4"/>
-              <w:bottom w:val="single" w:color="BFC6BC" w:sz="4"/>
-              <w:right w:val="single" w:color="BFC6BC" w:sz="4"/>
-            </w:tcBorders>
-            <w:tcMar>
-              <w:top w:type="dxa" w:w="60"/>
-              <w:left w:type="dxa" w:w="100"/>
-              <w:bottom w:type="dxa" w:w="60"/>
-              <w:right w:type="dxa" w:w="100"/>
-            </w:tcMar>
-          </w:tcPr>
-          <w:p>
-            <w:pPr>
-              <w:spacing w:after="0" w:line="276"/>
-            </w:pPr>
-            <w:r>
-              <w:rPr>
-                <w:rFonts w:ascii="Malgun Gothic" w:cs="Malgun Gothic" w:eastAsia="맑은 고딕" w:hAnsi="Malgun Gothic"/>
-                <w:b w:val="false"/>
-                <w:bCs w:val="false"/>
-                <w:sz w:val="18"/>
-                <w:szCs w:val="18"/>
-              </w:rPr>
-              <w:t xml:space="preserve">10월</w:t>
-            </w:r>
-          </w:p>
-        </w:tc>
-        <w:tc>
-          <w:tcPr>
-            <w:tcW w:type="dxa" w:w="6961"/>
-            <w:tcBorders>
-              <w:top w:val="single" w:color="BFC6BC" w:sz="4"/>
-              <w:left w:val="single" w:color="BFC6BC" w:sz="4"/>
-              <w:bottom w:val="single" w:color="BFC6BC" w:sz="4"/>
-              <w:right w:val="single" w:color="BFC6BC" w:sz="4"/>
-            </w:tcBorders>
-            <w:tcMar>
-              <w:top w:type="dxa" w:w="60"/>
-              <w:left w:type="dxa" w:w="100"/>
-              <w:bottom w:type="dxa" w:w="60"/>
-              <w:right w:type="dxa" w:w="100"/>
-            </w:tcMar>
-          </w:tcPr>
-          <w:p>
-            <w:pPr>
-              <w:spacing w:after="0" w:line="276"/>
-            </w:pPr>
-            <w:r>
-              <w:rPr>
-                <w:rFonts w:ascii="Malgun Gothic" w:cs="Malgun Gothic" w:eastAsia="맑은 고딕" w:hAnsi="Malgun Gothic"/>
-                <w:b w:val="false"/>
-                <w:bCs w:val="false"/>
-                <w:sz w:val="18"/>
-                <w:szCs w:val="18"/>
-              </w:rPr>
-              <w:t xml:space="preserve">진행 중. 토사유출 문헌을 집재 방법 기준으로 재분류</w:t>
-            </w:r>
-          </w:p>
-        </w:tc>
-      </w:tr>
-    </w:tbl>
-    <w:p>
-      <w:pPr>
-        <w:spacing w:after="60"/>
-      </w:pPr>
-    </w:p>
-    <w:p>
-      <w:pPr>
-        <w:pStyle w:val="Heading2"/>
-      </w:pPr>
-      <w:r>
-        <w:rPr>
-          <w:rFonts w:ascii="Malgun Gothic" w:cs="Malgun Gothic" w:eastAsia="맑은 고딕" w:hAnsi="Malgun Gothic"/>
-          <w:b w:val="false"/>
-          <w:bCs w:val="false"/>
-        </w:rPr>
-        <w:t xml:space="preserve">5.2 착수보고서 대비 변경 사항</w:t>
-      </w:r>
-    </w:p>
-    <w:tbl>
-      <w:tblPr>
-        <w:tblW w:type="dxa" w:w="9638"/>
-        <w:tblBorders>
-          <w:top w:val="single" w:color="auto" w:sz="4"/>
-          <w:left w:val="single" w:color="auto" w:sz="4"/>
-          <w:bottom w:val="single" w:color="auto" w:sz="4"/>
-          <w:right w:val="single" w:color="auto" w:sz="4"/>
-          <w:insideH w:val="single" w:color="auto" w:sz="4"/>
-          <w:insideV w:val="single" w:color="auto" w:sz="4"/>
-        </w:tblBorders>
-      </w:tblPr>
-      <w:tblGrid>
-        <w:gridCol w:w="701"/>
-        <w:gridCol w:w="2015"/>
-        <w:gridCol w:w="4731"/>
-        <w:gridCol w:w="2191"/>
-      </w:tblGrid>
-      <w:tr>
-        <w:trPr>
-          <w:tblHeader/>
-        </w:trPr>
-        <w:tc>
-          <w:tcPr>
-            <w:tcW w:type="dxa" w:w="701"/>
-            <w:tcBorders>
-              <w:top w:val="single" w:color="BFC6BC" w:sz="4"/>
-              <w:left w:val="single" w:color="BFC6BC" w:sz="4"/>
-              <w:bottom w:val="single" w:color="BFC6BC" w:sz="4"/>
-              <w:right w:val="single" w:color="BFC6BC" w:sz="4"/>
-            </w:tcBorders>
-            <w:shd w:fill="E4EDE6" w:color="auto" w:val="clear"/>
-            <w:tcMar>
-              <w:top w:type="dxa" w:w="60"/>
-              <w:left w:type="dxa" w:w="100"/>
-              <w:bottom w:type="dxa" w:w="60"/>
-              <w:right w:type="dxa" w:w="100"/>
-            </w:tcMar>
-          </w:tcPr>
-          <w:p>
-            <w:pPr>
-              <w:spacing w:after="0" w:line="276"/>
-            </w:pPr>
-            <w:r>
-              <w:rPr>
-                <w:rFonts w:ascii="Malgun Gothic" w:cs="Malgun Gothic" w:eastAsia="맑은 고딕" w:hAnsi="Malgun Gothic"/>
-                <w:b/>
-                <w:bCs/>
-                <w:sz w:val="18"/>
-                <w:szCs w:val="18"/>
-              </w:rPr>
-              <w:t xml:space="preserve">항목</w:t>
-            </w:r>
-          </w:p>
-        </w:tc>
-        <w:tc>
-          <w:tcPr>
-            <w:tcW w:type="dxa" w:w="2015"/>
-            <w:tcBorders>
-              <w:top w:val="single" w:color="BFC6BC" w:sz="4"/>
-              <w:left w:val="single" w:color="BFC6BC" w:sz="4"/>
-              <w:bottom w:val="single" w:color="BFC6BC" w:sz="4"/>
-              <w:right w:val="single" w:color="BFC6BC" w:sz="4"/>
-            </w:tcBorders>
-            <w:shd w:fill="E4EDE6" w:color="auto" w:val="clear"/>
-            <w:tcMar>
-              <w:top w:type="dxa" w:w="60"/>
-              <w:left w:type="dxa" w:w="100"/>
-              <w:bottom w:type="dxa" w:w="60"/>
-              <w:right w:type="dxa" w:w="100"/>
-            </w:tcMar>
-          </w:tcPr>
-          <w:p>
-            <w:pPr>
-              <w:spacing w:after="0" w:line="276"/>
-            </w:pPr>
-            <w:r>
-              <w:rPr>
-                <w:rFonts w:ascii="Malgun Gothic" w:cs="Malgun Gothic" w:eastAsia="맑은 고딕" w:hAnsi="Malgun Gothic"/>
-                <w:b/>
-                <w:bCs/>
-                <w:sz w:val="18"/>
-                <w:szCs w:val="18"/>
-              </w:rPr>
-              <w:t xml:space="preserve">착수보고서</w:t>
-            </w:r>
-          </w:p>
-        </w:tc>
-        <w:tc>
-          <w:tcPr>
-            <w:tcW w:type="dxa" w:w="4731"/>
-            <w:tcBorders>
-              <w:top w:val="single" w:color="BFC6BC" w:sz="4"/>
-              <w:left w:val="single" w:color="BFC6BC" w:sz="4"/>
-              <w:bottom w:val="single" w:color="BFC6BC" w:sz="4"/>
-              <w:right w:val="single" w:color="BFC6BC" w:sz="4"/>
-            </w:tcBorders>
-            <w:shd w:fill="E4EDE6" w:color="auto" w:val="clear"/>
-            <w:tcMar>
-              <w:top w:type="dxa" w:w="60"/>
-              <w:left w:type="dxa" w:w="100"/>
-              <w:bottom w:type="dxa" w:w="60"/>
-              <w:right w:type="dxa" w:w="100"/>
-            </w:tcMar>
-          </w:tcPr>
-          <w:p>
-            <w:pPr>
-              <w:spacing w:after="0" w:line="276"/>
-            </w:pPr>
-            <w:r>
-              <w:rPr>
-                <w:rFonts w:ascii="Malgun Gothic" w:cs="Malgun Gothic" w:eastAsia="맑은 고딕" w:hAnsi="Malgun Gothic"/>
-                <w:b/>
-                <w:bCs/>
-                <w:sz w:val="18"/>
-                <w:szCs w:val="18"/>
-              </w:rPr>
-              <w:t xml:space="preserve">변경</w:t>
-            </w:r>
-          </w:p>
-        </w:tc>
-        <w:tc>
-          <w:tcPr>
-            <w:tcW w:type="dxa" w:w="2191"/>
-            <w:tcBorders>
-              <w:top w:val="single" w:color="BFC6BC" w:sz="4"/>
-              <w:left w:val="single" w:color="BFC6BC" w:sz="4"/>
-              <w:bottom w:val="single" w:color="BFC6BC" w:sz="4"/>
-              <w:right w:val="single" w:color="BFC6BC" w:sz="4"/>
-            </w:tcBorders>
-            <w:shd w:fill="E4EDE6" w:color="auto" w:val="clear"/>
-            <w:tcMar>
-              <w:top w:type="dxa" w:w="60"/>
-              <w:left w:type="dxa" w:w="100"/>
-              <w:bottom w:type="dxa" w:w="60"/>
-              <w:right w:type="dxa" w:w="100"/>
-            </w:tcMar>
-          </w:tcPr>
-          <w:p>
-            <w:pPr>
-              <w:spacing w:after="0" w:line="276"/>
-            </w:pPr>
-            <w:r>
-              <w:rPr>
-                <w:rFonts w:ascii="Malgun Gothic" w:cs="Malgun Gothic" w:eastAsia="맑은 고딕" w:hAnsi="Malgun Gothic"/>
-                <w:b/>
-                <w:bCs/>
-                <w:sz w:val="18"/>
-                <w:szCs w:val="18"/>
-              </w:rPr>
-              <w:t xml:space="preserve">사유</w:t>
-            </w:r>
-          </w:p>
-        </w:tc>
-      </w:tr>
-      <w:tr>
-        <w:trPr>
-          <w:tblHeader w:val="false"/>
-        </w:trPr>
-        <w:tc>
-          <w:tcPr>
-            <w:tcW w:type="dxa" w:w="701"/>
-            <w:tcBorders>
-              <w:top w:val="single" w:color="BFC6BC" w:sz="4"/>
-              <w:left w:val="single" w:color="BFC6BC" w:sz="4"/>
-              <w:bottom w:val="single" w:color="BFC6BC" w:sz="4"/>
-              <w:right w:val="single" w:color="BFC6BC" w:sz="4"/>
-            </w:tcBorders>
-            <w:tcMar>
-              <w:top w:type="dxa" w:w="60"/>
-              <w:left w:type="dxa" w:w="100"/>
-              <w:bottom w:type="dxa" w:w="60"/>
-              <w:right w:type="dxa" w:w="100"/>
-            </w:tcMar>
-          </w:tcPr>
-          <w:p>
-            <w:pPr>
-              <w:spacing w:after="0" w:line="276"/>
-            </w:pPr>
-            <w:r>
-              <w:rPr>
-                <w:rFonts w:ascii="Malgun Gothic" w:cs="Malgun Gothic" w:eastAsia="맑은 고딕" w:hAnsi="Malgun Gothic"/>
-                <w:b w:val="false"/>
-                <w:bCs w:val="false"/>
-                <w:sz w:val="18"/>
-                <w:szCs w:val="18"/>
-              </w:rPr>
-              <w:t xml:space="preserve">토사유출 검증</w:t>
-            </w:r>
-          </w:p>
-        </w:tc>
-        <w:tc>
-          <w:tcPr>
-            <w:tcW w:type="dxa" w:w="2015"/>
-            <w:tcBorders>
-              <w:top w:val="single" w:color="BFC6BC" w:sz="4"/>
-              <w:left w:val="single" w:color="BFC6BC" w:sz="4"/>
-              <w:bottom w:val="single" w:color="BFC6BC" w:sz="4"/>
-              <w:right w:val="single" w:color="BFC6BC" w:sz="4"/>
-            </w:tcBorders>
-            <w:tcMar>
-              <w:top w:type="dxa" w:w="60"/>
-              <w:left w:type="dxa" w:w="100"/>
-              <w:bottom w:type="dxa" w:w="60"/>
-              <w:right w:type="dxa" w:w="100"/>
-            </w:tcMar>
-          </w:tcPr>
-          <w:p>
-            <w:pPr>
-              <w:spacing w:after="0" w:line="276"/>
-            </w:pPr>
-            <w:r>
-              <w:rPr>
-                <w:rFonts w:ascii="Malgun Gothic" w:cs="Malgun Gothic" w:eastAsia="맑은 고딕" w:hAnsi="Malgun Gothic"/>
-                <w:b w:val="false"/>
-                <w:bCs w:val="false"/>
-                <w:sz w:val="18"/>
-                <w:szCs w:val="18"/>
-              </w:rPr>
-              <w:t xml:space="preserve">현장조사로 침식 흔적 확인 후 문헌값 보정</w:t>
-            </w:r>
-          </w:p>
-        </w:tc>
-        <w:tc>
-          <w:tcPr>
-            <w:tcW w:type="dxa" w:w="4731"/>
-            <w:tcBorders>
-              <w:top w:val="single" w:color="BFC6BC" w:sz="4"/>
-              <w:left w:val="single" w:color="BFC6BC" w:sz="4"/>
-              <w:bottom w:val="single" w:color="BFC6BC" w:sz="4"/>
-              <w:right w:val="single" w:color="BFC6BC" w:sz="4"/>
-            </w:tcBorders>
-            <w:tcMar>
-              <w:top w:type="dxa" w:w="60"/>
-              <w:left w:type="dxa" w:w="100"/>
-              <w:bottom w:type="dxa" w:w="60"/>
-              <w:right w:type="dxa" w:w="100"/>
-            </w:tcMar>
-          </w:tcPr>
-          <w:p>
-            <w:pPr>
-              <w:spacing w:after="0" w:line="276"/>
-            </w:pPr>
-            <w:r>
-              <w:rPr>
-                <w:rFonts w:ascii="Malgun Gothic" w:cs="Malgun Gothic" w:eastAsia="맑은 고딕" w:hAnsi="Malgun Gothic"/>
-                <w:b w:val="false"/>
-                <w:bCs w:val="false"/>
-                <w:sz w:val="18"/>
-                <w:szCs w:val="18"/>
-              </w:rPr>
-              <w:t xml:space="preserve">WEPP 모의, 국내 실측 문헌값으로 보정</w:t>
-            </w:r>
-          </w:p>
-        </w:tc>
-        <w:tc>
-          <w:tcPr>
-            <w:tcW w:type="dxa" w:w="2191"/>
-            <w:tcBorders>
-              <w:top w:val="single" w:color="BFC6BC" w:sz="4"/>
-              <w:left w:val="single" w:color="BFC6BC" w:sz="4"/>
-              <w:bottom w:val="single" w:color="BFC6BC" w:sz="4"/>
-              <w:right w:val="single" w:color="BFC6BC" w:sz="4"/>
-            </w:tcBorders>
-            <w:tcMar>
-              <w:top w:type="dxa" w:w="60"/>
-              <w:left w:type="dxa" w:w="100"/>
-              <w:bottom w:type="dxa" w:w="60"/>
-              <w:right w:type="dxa" w:w="100"/>
-            </w:tcMar>
-          </w:tcPr>
-          <w:p>
-            <w:pPr>
-              <w:spacing w:after="0" w:line="276"/>
-            </w:pPr>
-            <w:r>
-              <w:rPr>
-                <w:rFonts w:ascii="Malgun Gothic" w:cs="Malgun Gothic" w:eastAsia="맑은 고딕" w:hAnsi="Malgun Gothic"/>
-                <w:b w:val="false"/>
-                <w:bCs w:val="false"/>
-                <w:sz w:val="18"/>
-                <w:szCs w:val="18"/>
-              </w:rPr>
-              <w:t xml:space="preserve">연구 기간·예산·인력 여건, 우기 경과</w:t>
-            </w:r>
-          </w:p>
-        </w:tc>
-      </w:tr>
-      <w:tr>
-        <w:trPr>
-          <w:tblHeader w:val="false"/>
-        </w:trPr>
-        <w:tc>
-          <w:tcPr>
-            <w:tcW w:type="dxa" w:w="701"/>
-            <w:tcBorders>
-              <w:top w:val="single" w:color="BFC6BC" w:sz="4"/>
-              <w:left w:val="single" w:color="BFC6BC" w:sz="4"/>
-              <w:bottom w:val="single" w:color="BFC6BC" w:sz="4"/>
-              <w:right w:val="single" w:color="BFC6BC" w:sz="4"/>
-            </w:tcBorders>
-            <w:tcMar>
-              <w:top w:type="dxa" w:w="60"/>
-              <w:left w:type="dxa" w:w="100"/>
-              <w:bottom w:type="dxa" w:w="60"/>
-              <w:right w:type="dxa" w:w="100"/>
-            </w:tcMar>
-          </w:tcPr>
-          <w:p>
-            <w:pPr>
-              <w:spacing w:after="0" w:line="276"/>
-            </w:pPr>
-            <w:r>
-              <w:rPr>
-                <w:rFonts w:ascii="Malgun Gothic" w:cs="Malgun Gothic" w:eastAsia="맑은 고딕" w:hAnsi="Malgun Gothic"/>
-                <w:b w:val="false"/>
-                <w:bCs w:val="false"/>
-                <w:sz w:val="18"/>
-                <w:szCs w:val="18"/>
-              </w:rPr>
-              <w:t xml:space="preserve">토사유출 문헌</w:t>
-            </w:r>
-          </w:p>
-        </w:tc>
-        <w:tc>
-          <w:tcPr>
-            <w:tcW w:type="dxa" w:w="2015"/>
-            <w:tcBorders>
-              <w:top w:val="single" w:color="BFC6BC" w:sz="4"/>
-              <w:left w:val="single" w:color="BFC6BC" w:sz="4"/>
-              <w:bottom w:val="single" w:color="BFC6BC" w:sz="4"/>
-              <w:right w:val="single" w:color="BFC6BC" w:sz="4"/>
-            </w:tcBorders>
-            <w:tcMar>
-              <w:top w:type="dxa" w:w="60"/>
-              <w:left w:type="dxa" w:w="100"/>
-              <w:bottom w:type="dxa" w:w="60"/>
-              <w:right w:type="dxa" w:w="100"/>
-            </w:tcMar>
-          </w:tcPr>
-          <w:p>
-            <w:pPr>
-              <w:spacing w:after="0" w:line="276"/>
-            </w:pPr>
-            <w:r>
-              <w:rPr>
-                <w:rFonts w:ascii="Malgun Gothic" w:cs="Malgun Gothic" w:eastAsia="맑은 고딕" w:hAnsi="Malgun Gothic"/>
-                <w:b w:val="false"/>
-                <w:bCs w:val="false"/>
-                <w:sz w:val="18"/>
-                <w:szCs w:val="18"/>
-              </w:rPr>
-              <w:t xml:space="preserve">국외 문헌값 중심</w:t>
-            </w:r>
-          </w:p>
-        </w:tc>
-        <w:tc>
-          <w:tcPr>
-            <w:tcW w:type="dxa" w:w="4731"/>
-            <w:tcBorders>
-              <w:top w:val="single" w:color="BFC6BC" w:sz="4"/>
-              <w:left w:val="single" w:color="BFC6BC" w:sz="4"/>
-              <w:bottom w:val="single" w:color="BFC6BC" w:sz="4"/>
-              <w:right w:val="single" w:color="BFC6BC" w:sz="4"/>
-            </w:tcBorders>
-            <w:tcMar>
-              <w:top w:type="dxa" w:w="60"/>
-              <w:left w:type="dxa" w:w="100"/>
-              <w:bottom w:type="dxa" w:w="60"/>
-              <w:right w:type="dxa" w:w="100"/>
-            </w:tcMar>
-          </w:tcPr>
-          <w:p>
-            <w:pPr>
-              <w:spacing w:after="0" w:line="276"/>
-            </w:pPr>
-            <w:r>
-              <w:rPr>
-                <w:rFonts w:ascii="Malgun Gothic" w:cs="Malgun Gothic" w:eastAsia="맑은 고딕" w:hAnsi="Malgun Gothic"/>
-                <w:b w:val="false"/>
-                <w:bCs w:val="false"/>
-                <w:sz w:val="18"/>
-                <w:szCs w:val="18"/>
-              </w:rPr>
-              <w:t xml:space="preserve">집재 방법별 분류, 국내 조건 근접 문헌 우선</w:t>
-            </w:r>
-          </w:p>
-        </w:tc>
-        <w:tc>
-          <w:tcPr>
-            <w:tcW w:type="dxa" w:w="2191"/>
-            <w:tcBorders>
-              <w:top w:val="single" w:color="BFC6BC" w:sz="4"/>
-              <w:left w:val="single" w:color="BFC6BC" w:sz="4"/>
-              <w:bottom w:val="single" w:color="BFC6BC" w:sz="4"/>
-              <w:right w:val="single" w:color="BFC6BC" w:sz="4"/>
-            </w:tcBorders>
-            <w:tcMar>
-              <w:top w:type="dxa" w:w="60"/>
-              <w:left w:type="dxa" w:w="100"/>
-              <w:bottom w:type="dxa" w:w="60"/>
-              <w:right w:type="dxa" w:w="100"/>
-            </w:tcMar>
-          </w:tcPr>
-          <w:p>
-            <w:pPr>
-              <w:spacing w:after="0" w:line="276"/>
-            </w:pPr>
-            <w:r>
-              <w:rPr>
-                <w:rFonts w:ascii="Malgun Gothic" w:cs="Malgun Gothic" w:eastAsia="맑은 고딕" w:hAnsi="Malgun Gothic"/>
-                <w:b w:val="false"/>
-                <w:bCs w:val="false"/>
-                <w:sz w:val="18"/>
-                <w:szCs w:val="18"/>
-              </w:rPr>
-              <w:t xml:space="preserve">국내 현장 약 99% 우드그랩</w:t>
-            </w:r>
-          </w:p>
-        </w:tc>
-      </w:tr>
-      <w:tr>
-        <w:trPr>
-          <w:tblHeader w:val="false"/>
-        </w:trPr>
-        <w:tc>
-          <w:tcPr>
-            <w:tcW w:type="dxa" w:w="701"/>
-            <w:tcBorders>
-              <w:top w:val="single" w:color="BFC6BC" w:sz="4"/>
-              <w:left w:val="single" w:color="BFC6BC" w:sz="4"/>
-              <w:bottom w:val="single" w:color="BFC6BC" w:sz="4"/>
-              <w:right w:val="single" w:color="BFC6BC" w:sz="4"/>
-            </w:tcBorders>
-            <w:tcMar>
-              <w:top w:type="dxa" w:w="60"/>
-              <w:left w:type="dxa" w:w="100"/>
-              <w:bottom w:type="dxa" w:w="60"/>
-              <w:right w:type="dxa" w:w="100"/>
-            </w:tcMar>
-          </w:tcPr>
-          <w:p>
-            <w:pPr>
-              <w:spacing w:after="0" w:line="276"/>
-            </w:pPr>
-            <w:r>
-              <w:rPr>
-                <w:rFonts w:ascii="Malgun Gothic" w:cs="Malgun Gothic" w:eastAsia="맑은 고딕" w:hAnsi="Malgun Gothic"/>
-                <w:b w:val="false"/>
-                <w:bCs w:val="false"/>
-                <w:sz w:val="18"/>
-                <w:szCs w:val="18"/>
-              </w:rPr>
-              <w:t xml:space="preserve">사례지</w:t>
-            </w:r>
-          </w:p>
-        </w:tc>
-        <w:tc>
-          <w:tcPr>
-            <w:tcW w:type="dxa" w:w="2015"/>
-            <w:tcBorders>
-              <w:top w:val="single" w:color="BFC6BC" w:sz="4"/>
-              <w:left w:val="single" w:color="BFC6BC" w:sz="4"/>
-              <w:bottom w:val="single" w:color="BFC6BC" w:sz="4"/>
-              <w:right w:val="single" w:color="BFC6BC" w:sz="4"/>
-            </w:tcBorders>
-            <w:tcMar>
-              <w:top w:type="dxa" w:w="60"/>
-              <w:left w:type="dxa" w:w="100"/>
-              <w:bottom w:type="dxa" w:w="60"/>
-              <w:right w:type="dxa" w:w="100"/>
-            </w:tcMar>
-          </w:tcPr>
-          <w:p>
-            <w:pPr>
-              <w:spacing w:after="0" w:line="276"/>
-            </w:pPr>
-            <w:r>
-              <w:rPr>
-                <w:rFonts w:ascii="Malgun Gothic" w:cs="Malgun Gothic" w:eastAsia="맑은 고딕" w:hAnsi="Malgun Gothic"/>
-                <w:b w:val="false"/>
-                <w:bCs w:val="false"/>
-                <w:sz w:val="18"/>
-                <w:szCs w:val="18"/>
-              </w:rPr>
-              <w:t xml:space="preserve">1개소, 9월 확정</w:t>
-            </w:r>
-          </w:p>
-        </w:tc>
-        <w:tc>
-          <w:tcPr>
-            <w:tcW w:type="dxa" w:w="4731"/>
-            <w:tcBorders>
-              <w:top w:val="single" w:color="BFC6BC" w:sz="4"/>
-              <w:left w:val="single" w:color="BFC6BC" w:sz="4"/>
-              <w:bottom w:val="single" w:color="BFC6BC" w:sz="4"/>
-              <w:right w:val="single" w:color="BFC6BC" w:sz="4"/>
-            </w:tcBorders>
-            <w:tcMar>
-              <w:top w:type="dxa" w:w="60"/>
-              <w:left w:type="dxa" w:w="100"/>
-              <w:bottom w:type="dxa" w:w="60"/>
-              <w:right w:type="dxa" w:w="100"/>
-            </w:tcMar>
-          </w:tcPr>
-          <w:p>
-            <w:pPr>
-              <w:spacing w:after="0" w:line="276"/>
-            </w:pPr>
-            <w:r>
-              <w:rPr>
-                <w:rFonts w:ascii="Malgun Gothic" w:cs="Malgun Gothic" w:eastAsia="맑은 고딕" w:hAnsi="Malgun Gothic"/>
-                <w:b w:val="false"/>
-                <w:bCs w:val="false"/>
-                <w:sz w:val="18"/>
-                <w:szCs w:val="18"/>
-              </w:rPr>
-              <w:t xml:space="preserve">벌채 실적 상위 2개 지방청 청구 후 소반 단위 표본, 11월 확정</w:t>
-            </w:r>
-          </w:p>
-        </w:tc>
-        <w:tc>
-          <w:tcPr>
-            <w:tcW w:type="dxa" w:w="2191"/>
-            <w:tcBorders>
-              <w:top w:val="single" w:color="BFC6BC" w:sz="4"/>
-              <w:left w:val="single" w:color="BFC6BC" w:sz="4"/>
-              <w:bottom w:val="single" w:color="BFC6BC" w:sz="4"/>
-              <w:right w:val="single" w:color="BFC6BC" w:sz="4"/>
-            </w:tcBorders>
-            <w:tcMar>
-              <w:top w:type="dxa" w:w="60"/>
-              <w:left w:type="dxa" w:w="100"/>
-              <w:bottom w:type="dxa" w:w="60"/>
-              <w:right w:type="dxa" w:w="100"/>
-            </w:tcMar>
-          </w:tcPr>
-          <w:p>
-            <w:pPr>
-              <w:spacing w:after="0" w:line="276"/>
-            </w:pPr>
-            <w:r>
-              <w:rPr>
-                <w:rFonts w:ascii="Malgun Gothic" w:cs="Malgun Gothic" w:eastAsia="맑은 고딕" w:hAnsi="Malgun Gothic"/>
-                <w:b w:val="false"/>
-                <w:bCs w:val="false"/>
-                <w:sz w:val="18"/>
-                <w:szCs w:val="18"/>
-              </w:rPr>
-              <w:t xml:space="preserve">경과연수별 비교구 확보</w:t>
-            </w:r>
-          </w:p>
-        </w:tc>
-      </w:tr>
-      <w:tr>
-        <w:trPr>
-          <w:tblHeader w:val="false"/>
-        </w:trPr>
-        <w:tc>
-          <w:tcPr>
-            <w:tcW w:type="dxa" w:w="701"/>
-            <w:tcBorders>
-              <w:top w:val="single" w:color="BFC6BC" w:sz="4"/>
-              <w:left w:val="single" w:color="BFC6BC" w:sz="4"/>
-              <w:bottom w:val="single" w:color="BFC6BC" w:sz="4"/>
-              <w:right w:val="single" w:color="BFC6BC" w:sz="4"/>
-            </w:tcBorders>
-            <w:tcMar>
-              <w:top w:type="dxa" w:w="60"/>
-              <w:left w:type="dxa" w:w="100"/>
-              <w:bottom w:type="dxa" w:w="60"/>
-              <w:right w:type="dxa" w:w="100"/>
-            </w:tcMar>
-          </w:tcPr>
-          <w:p>
-            <w:pPr>
-              <w:spacing w:after="0" w:line="276"/>
-            </w:pPr>
-            <w:r>
-              <w:rPr>
-                <w:rFonts w:ascii="Malgun Gothic" w:cs="Malgun Gothic" w:eastAsia="맑은 고딕" w:hAnsi="Malgun Gothic"/>
-                <w:b w:val="false"/>
-                <w:bCs w:val="false"/>
-                <w:sz w:val="18"/>
-                <w:szCs w:val="18"/>
-              </w:rPr>
-              <w:t xml:space="preserve">생물다양성</w:t>
-            </w:r>
-          </w:p>
-        </w:tc>
-        <w:tc>
-          <w:tcPr>
-            <w:tcW w:type="dxa" w:w="2015"/>
-            <w:tcBorders>
-              <w:top w:val="single" w:color="BFC6BC" w:sz="4"/>
-              <w:left w:val="single" w:color="BFC6BC" w:sz="4"/>
-              <w:bottom w:val="single" w:color="BFC6BC" w:sz="4"/>
-              <w:right w:val="single" w:color="BFC6BC" w:sz="4"/>
-            </w:tcBorders>
-            <w:tcMar>
-              <w:top w:type="dxa" w:w="60"/>
-              <w:left w:type="dxa" w:w="100"/>
-              <w:bottom w:type="dxa" w:w="60"/>
-              <w:right w:type="dxa" w:w="100"/>
-            </w:tcMar>
-          </w:tcPr>
-          <w:p>
-            <w:pPr>
-              <w:spacing w:after="0" w:line="276"/>
-            </w:pPr>
-            <w:r>
-              <w:rPr>
-                <w:rFonts w:ascii="Malgun Gothic" w:cs="Malgun Gothic" w:eastAsia="맑은 고딕" w:hAnsi="Malgun Gothic"/>
-                <w:b w:val="false"/>
-                <w:bCs w:val="false"/>
-                <w:sz w:val="18"/>
-                <w:szCs w:val="18"/>
-              </w:rPr>
-              <w:t xml:space="preserve">임령대별 표준지 현장조사</w:t>
-            </w:r>
-          </w:p>
-        </w:tc>
-        <w:tc>
-          <w:tcPr>
-            <w:tcW w:type="dxa" w:w="4731"/>
-            <w:tcBorders>
-              <w:top w:val="single" w:color="BFC6BC" w:sz="4"/>
-              <w:left w:val="single" w:color="BFC6BC" w:sz="4"/>
-              <w:bottom w:val="single" w:color="BFC6BC" w:sz="4"/>
-              <w:right w:val="single" w:color="BFC6BC" w:sz="4"/>
-            </w:tcBorders>
-            <w:tcMar>
-              <w:top w:type="dxa" w:w="60"/>
-              <w:left w:type="dxa" w:w="100"/>
-              <w:bottom w:type="dxa" w:w="60"/>
-              <w:right w:type="dxa" w:w="100"/>
-            </w:tcMar>
-          </w:tcPr>
-          <w:p>
-            <w:pPr>
-              <w:spacing w:after="0" w:line="276"/>
-            </w:pPr>
-            <w:r>
-              <w:rPr>
-                <w:rFonts w:ascii="Malgun Gothic" w:cs="Malgun Gothic" w:eastAsia="맑은 고딕" w:hAnsi="Malgun Gothic"/>
-                <w:b w:val="false"/>
-                <w:bCs w:val="false"/>
-                <w:sz w:val="18"/>
-                <w:szCs w:val="18"/>
-              </w:rPr>
-              <w:t xml:space="preserve">자연환경조사 자료로 지수 분석, 전문가와 사례지 1회 확인. 카메라 트랩 모니터링은 3차년도 제안</w:t>
-            </w:r>
-          </w:p>
-        </w:tc>
-        <w:tc>
-          <w:tcPr>
-            <w:tcW w:type="dxa" w:w="2191"/>
-            <w:tcBorders>
-              <w:top w:val="single" w:color="BFC6BC" w:sz="4"/>
-              <w:left w:val="single" w:color="BFC6BC" w:sz="4"/>
-              <w:bottom w:val="single" w:color="BFC6BC" w:sz="4"/>
-              <w:right w:val="single" w:color="BFC6BC" w:sz="4"/>
-            </w:tcBorders>
-            <w:tcMar>
-              <w:top w:type="dxa" w:w="60"/>
-              <w:left w:type="dxa" w:w="100"/>
-              <w:bottom w:type="dxa" w:w="60"/>
-              <w:right w:type="dxa" w:w="100"/>
-            </w:tcMar>
-          </w:tcPr>
-          <w:p>
-            <w:pPr>
-              <w:spacing w:after="0" w:line="276"/>
-            </w:pPr>
-            <w:r>
-              <w:rPr>
-                <w:rFonts w:ascii="Malgun Gothic" w:cs="Malgun Gothic" w:eastAsia="맑은 고딕" w:hAnsi="Malgun Gothic"/>
-                <w:b w:val="false"/>
-                <w:bCs w:val="false"/>
-                <w:sz w:val="18"/>
-                <w:szCs w:val="18"/>
-              </w:rPr>
-              <w:t xml:space="preserve">야생동물의 높은 이동성, 연구 기간·예산 여건</w:t>
-            </w:r>
-          </w:p>
-        </w:tc>
-      </w:tr>
-    </w:tbl>
-    <w:p>
-      <w:pPr>
-        <w:spacing w:after="60"/>
-      </w:pPr>
-    </w:p>
-    <w:p>
-      <w:pPr>
-        <w:pStyle w:val="Heading2"/>
-      </w:pPr>
-      <w:r>
-        <w:rPr>
-          <w:rFonts w:ascii="Malgun Gothic" w:cs="Malgun Gothic" w:eastAsia="맑은 고딕" w:hAnsi="Malgun Gothic"/>
-          <w:b w:val="false"/>
-          <w:bCs w:val="false"/>
-        </w:rPr>
-        <w:t xml:space="preserve">5.3 향후 일정</w:t>
-      </w:r>
-    </w:p>
-    <w:tbl>
-      <w:tblPr>
-        <w:tblW w:type="dxa" w:w="9638"/>
-        <w:tblBorders>
-          <w:top w:val="single" w:color="auto" w:sz="4"/>
-          <w:left w:val="single" w:color="auto" w:sz="4"/>
-          <w:bottom w:val="single" w:color="auto" w:sz="4"/>
-          <w:right w:val="single" w:color="auto" w:sz="4"/>
-          <w:insideH w:val="single" w:color="auto" w:sz="4"/>
-          <w:insideV w:val="single" w:color="auto" w:sz="4"/>
-        </w:tblBorders>
-      </w:tblPr>
-      <w:tblGrid>
-        <w:gridCol w:w="803"/>
-        <w:gridCol w:w="7730"/>
-        <w:gridCol w:w="1105"/>
-      </w:tblGrid>
-      <w:tr>
-        <w:trPr>
-          <w:tblHeader/>
-        </w:trPr>
-        <w:tc>
-          <w:tcPr>
-            <w:tcW w:type="dxa" w:w="803"/>
-            <w:tcBorders>
-              <w:top w:val="single" w:color="BFC6BC" w:sz="4"/>
-              <w:left w:val="single" w:color="BFC6BC" w:sz="4"/>
-              <w:bottom w:val="single" w:color="BFC6BC" w:sz="4"/>
-              <w:right w:val="single" w:color="BFC6BC" w:sz="4"/>
-            </w:tcBorders>
-            <w:shd w:fill="E4EDE6" w:color="auto" w:val="clear"/>
-            <w:tcMar>
-              <w:top w:type="dxa" w:w="60"/>
-              <w:left w:type="dxa" w:w="100"/>
-              <w:bottom w:type="dxa" w:w="60"/>
-              <w:right w:type="dxa" w:w="100"/>
-            </w:tcMar>
-          </w:tcPr>
-          <w:p>
-            <w:pPr>
-              <w:spacing w:after="0" w:line="276"/>
-            </w:pPr>
-            <w:r>
-              <w:rPr>
-                <w:rFonts w:ascii="Malgun Gothic" w:cs="Malgun Gothic" w:eastAsia="맑은 고딕" w:hAnsi="Malgun Gothic"/>
-                <w:b/>
-                <w:bCs/>
-                <w:sz w:val="18"/>
-                <w:szCs w:val="18"/>
-              </w:rPr>
-              <w:t xml:space="preserve">시기</w:t>
-            </w:r>
-          </w:p>
-        </w:tc>
-        <w:tc>
-          <w:tcPr>
-            <w:tcW w:type="dxa" w:w="7730"/>
-            <w:tcBorders>
-              <w:top w:val="single" w:color="BFC6BC" w:sz="4"/>
-              <w:left w:val="single" w:color="BFC6BC" w:sz="4"/>
-              <w:bottom w:val="single" w:color="BFC6BC" w:sz="4"/>
-              <w:right w:val="single" w:color="BFC6BC" w:sz="4"/>
-            </w:tcBorders>
-            <w:shd w:fill="E4EDE6" w:color="auto" w:val="clear"/>
-            <w:tcMar>
-              <w:top w:type="dxa" w:w="60"/>
-              <w:left w:type="dxa" w:w="100"/>
-              <w:bottom w:type="dxa" w:w="60"/>
-              <w:right w:type="dxa" w:w="100"/>
-            </w:tcMar>
-          </w:tcPr>
-          <w:p>
-            <w:pPr>
-              <w:spacing w:after="0" w:line="276"/>
-            </w:pPr>
-            <w:r>
-              <w:rPr>
-                <w:rFonts w:ascii="Malgun Gothic" w:cs="Malgun Gothic" w:eastAsia="맑은 고딕" w:hAnsi="Malgun Gothic"/>
-                <w:b/>
-                <w:bCs/>
-                <w:sz w:val="18"/>
-                <w:szCs w:val="18"/>
-              </w:rPr>
-              <w:t xml:space="preserve">주요 내용</w:t>
-            </w:r>
-          </w:p>
-        </w:tc>
-        <w:tc>
-          <w:tcPr>
-            <w:tcW w:type="dxa" w:w="1105"/>
-            <w:tcBorders>
-              <w:top w:val="single" w:color="BFC6BC" w:sz="4"/>
-              <w:left w:val="single" w:color="BFC6BC" w:sz="4"/>
-              <w:bottom w:val="single" w:color="BFC6BC" w:sz="4"/>
-              <w:right w:val="single" w:color="BFC6BC" w:sz="4"/>
-            </w:tcBorders>
-            <w:shd w:fill="E4EDE6" w:color="auto" w:val="clear"/>
-            <w:tcMar>
-              <w:top w:type="dxa" w:w="60"/>
-              <w:left w:type="dxa" w:w="100"/>
-              <w:bottom w:type="dxa" w:w="60"/>
-              <w:right w:type="dxa" w:w="100"/>
-            </w:tcMar>
-          </w:tcPr>
-          <w:p>
-            <w:pPr>
-              <w:spacing w:after="0" w:line="276"/>
-            </w:pPr>
-            <w:r>
-              <w:rPr>
-                <w:rFonts w:ascii="Malgun Gothic" w:cs="Malgun Gothic" w:eastAsia="맑은 고딕" w:hAnsi="Malgun Gothic"/>
-                <w:b/>
-                <w:bCs/>
-                <w:sz w:val="18"/>
-                <w:szCs w:val="18"/>
-              </w:rPr>
-              <w:t xml:space="preserve">산출</w:t>
-            </w:r>
-          </w:p>
-        </w:tc>
-      </w:tr>
-      <w:tr>
-        <w:trPr>
-          <w:tblHeader w:val="false"/>
-        </w:trPr>
-        <w:tc>
-          <w:tcPr>
-            <w:tcW w:type="dxa" w:w="803"/>
-            <w:tcBorders>
-              <w:top w:val="single" w:color="BFC6BC" w:sz="4"/>
-              <w:left w:val="single" w:color="BFC6BC" w:sz="4"/>
-              <w:bottom w:val="single" w:color="BFC6BC" w:sz="4"/>
-              <w:right w:val="single" w:color="BFC6BC" w:sz="4"/>
-            </w:tcBorders>
-            <w:tcMar>
-              <w:top w:type="dxa" w:w="60"/>
-              <w:left w:type="dxa" w:w="100"/>
-              <w:bottom w:type="dxa" w:w="60"/>
-              <w:right w:type="dxa" w:w="100"/>
-            </w:tcMar>
-          </w:tcPr>
-          <w:p>
-            <w:pPr>
-              <w:spacing w:after="0" w:line="276"/>
-            </w:pPr>
-            <w:r>
-              <w:rPr>
-                <w:rFonts w:ascii="Malgun Gothic" w:cs="Malgun Gothic" w:eastAsia="맑은 고딕" w:hAnsi="Malgun Gothic"/>
-                <w:b w:val="false"/>
-                <w:bCs w:val="false"/>
-                <w:sz w:val="18"/>
-                <w:szCs w:val="18"/>
-              </w:rPr>
-              <w:t xml:space="preserve">2026.10</w:t>
-            </w:r>
-          </w:p>
-        </w:tc>
-        <w:tc>
-          <w:tcPr>
-            <w:tcW w:type="dxa" w:w="7730"/>
-            <w:tcBorders>
-              <w:top w:val="single" w:color="BFC6BC" w:sz="4"/>
-              <w:left w:val="single" w:color="BFC6BC" w:sz="4"/>
-              <w:bottom w:val="single" w:color="BFC6BC" w:sz="4"/>
-              <w:right w:val="single" w:color="BFC6BC" w:sz="4"/>
-            </w:tcBorders>
-            <w:tcMar>
-              <w:top w:type="dxa" w:w="60"/>
-              <w:left w:type="dxa" w:w="100"/>
-              <w:bottom w:type="dxa" w:w="60"/>
-              <w:right w:type="dxa" w:w="100"/>
-            </w:tcMar>
-          </w:tcPr>
-          <w:p>
-            <w:pPr>
-              <w:spacing w:after="0" w:line="276"/>
-            </w:pPr>
-            <w:r>
-              <w:rPr>
-                <w:rFonts w:ascii="Malgun Gothic" w:cs="Malgun Gothic" w:eastAsia="맑은 고딕" w:hAnsi="Malgun Gothic"/>
-                <w:b w:val="false"/>
-                <w:bCs w:val="false"/>
-                <w:sz w:val="18"/>
-                <w:szCs w:val="18"/>
-              </w:rPr>
-              <w:t xml:space="preserve">정보공개 청구, WEPP 공통 입력자료(기상·DEM·토양도·임상도) 구축, 문헌 재분류, 자연환경조사 자료 확보</w:t>
-            </w:r>
-          </w:p>
-        </w:tc>
-        <w:tc>
-          <w:tcPr>
-            <w:tcW w:type="dxa" w:w="1105"/>
-            <w:tcBorders>
-              <w:top w:val="single" w:color="BFC6BC" w:sz="4"/>
-              <w:left w:val="single" w:color="BFC6BC" w:sz="4"/>
-              <w:bottom w:val="single" w:color="BFC6BC" w:sz="4"/>
-              <w:right w:val="single" w:color="BFC6BC" w:sz="4"/>
-            </w:tcBorders>
-            <w:tcMar>
-              <w:top w:type="dxa" w:w="60"/>
-              <w:left w:type="dxa" w:w="100"/>
-              <w:bottom w:type="dxa" w:w="60"/>
-              <w:right w:type="dxa" w:w="100"/>
-            </w:tcMar>
-          </w:tcPr>
-          <w:p>
-            <w:pPr>
-              <w:spacing w:after="0" w:line="276"/>
-            </w:pPr>
-            <w:r>
-              <w:rPr>
-                <w:rFonts w:ascii="Malgun Gothic" w:cs="Malgun Gothic" w:eastAsia="맑은 고딕" w:hAnsi="Malgun Gothic"/>
-                <w:b w:val="false"/>
-                <w:bCs w:val="false"/>
-                <w:sz w:val="18"/>
-                <w:szCs w:val="18"/>
-              </w:rPr>
-              <w:t xml:space="preserve">청구서, 문헌 정리표</w:t>
-            </w:r>
-          </w:p>
-        </w:tc>
-      </w:tr>
-      <w:tr>
-        <w:trPr>
-          <w:tblHeader w:val="false"/>
-        </w:trPr>
-        <w:tc>
-          <w:tcPr>
-            <w:tcW w:type="dxa" w:w="803"/>
-            <w:tcBorders>
-              <w:top w:val="single" w:color="BFC6BC" w:sz="4"/>
-              <w:left w:val="single" w:color="BFC6BC" w:sz="4"/>
-              <w:bottom w:val="single" w:color="BFC6BC" w:sz="4"/>
-              <w:right w:val="single" w:color="BFC6BC" w:sz="4"/>
-            </w:tcBorders>
-            <w:tcMar>
-              <w:top w:type="dxa" w:w="60"/>
-              <w:left w:type="dxa" w:w="100"/>
-              <w:bottom w:type="dxa" w:w="60"/>
-              <w:right w:type="dxa" w:w="100"/>
-            </w:tcMar>
-          </w:tcPr>
-          <w:p>
-            <w:pPr>
-              <w:spacing w:after="0" w:line="276"/>
-            </w:pPr>
-            <w:r>
-              <w:rPr>
-                <w:rFonts w:ascii="Malgun Gothic" w:cs="Malgun Gothic" w:eastAsia="맑은 고딕" w:hAnsi="Malgun Gothic"/>
-                <w:b w:val="false"/>
-                <w:bCs w:val="false"/>
-                <w:sz w:val="18"/>
-                <w:szCs w:val="18"/>
-              </w:rPr>
-              <w:t xml:space="preserve">2026.11</w:t>
-            </w:r>
-          </w:p>
-        </w:tc>
-        <w:tc>
-          <w:tcPr>
-            <w:tcW w:type="dxa" w:w="7730"/>
-            <w:tcBorders>
-              <w:top w:val="single" w:color="BFC6BC" w:sz="4"/>
-              <w:left w:val="single" w:color="BFC6BC" w:sz="4"/>
-              <w:bottom w:val="single" w:color="BFC6BC" w:sz="4"/>
-              <w:right w:val="single" w:color="BFC6BC" w:sz="4"/>
-            </w:tcBorders>
-            <w:tcMar>
-              <w:top w:type="dxa" w:w="60"/>
-              <w:left w:type="dxa" w:w="100"/>
-              <w:bottom w:type="dxa" w:w="60"/>
-              <w:right w:type="dxa" w:w="100"/>
-            </w:tcMar>
-          </w:tcPr>
-          <w:p>
-            <w:pPr>
-              <w:spacing w:after="0" w:line="276"/>
-            </w:pPr>
-            <w:r>
-              <w:rPr>
-                <w:rFonts w:ascii="Malgun Gothic" w:cs="Malgun Gothic" w:eastAsia="맑은 고딕" w:hAnsi="Malgun Gothic"/>
-                <w:b w:val="false"/>
-                <w:bCs w:val="false"/>
-                <w:sz w:val="18"/>
-                <w:szCs w:val="18"/>
-              </w:rPr>
-              <w:t xml:space="preserve">정보공개 자료 수령, 관리소·소반 선정, 자연환경조사 지점 중첩 확인, WEPP 모의, 생물다양성 지수 분석, 경제적 최적벌기령 산출 착수</w:t>
-            </w:r>
-          </w:p>
-        </w:tc>
-        <w:tc>
-          <w:tcPr>
-            <w:tcW w:type="dxa" w:w="1105"/>
-            <w:tcBorders>
-              <w:top w:val="single" w:color="BFC6BC" w:sz="4"/>
-              <w:left w:val="single" w:color="BFC6BC" w:sz="4"/>
-              <w:bottom w:val="single" w:color="BFC6BC" w:sz="4"/>
-              <w:right w:val="single" w:color="BFC6BC" w:sz="4"/>
-            </w:tcBorders>
-            <w:tcMar>
-              <w:top w:type="dxa" w:w="60"/>
-              <w:left w:type="dxa" w:w="100"/>
-              <w:bottom w:type="dxa" w:w="60"/>
-              <w:right w:type="dxa" w:w="100"/>
-            </w:tcMar>
-          </w:tcPr>
-          <w:p>
-            <w:pPr>
-              <w:spacing w:after="0" w:line="276"/>
-            </w:pPr>
-            <w:r>
-              <w:rPr>
-                <w:rFonts w:ascii="Malgun Gothic" w:cs="Malgun Gothic" w:eastAsia="맑은 고딕" w:hAnsi="Malgun Gothic"/>
-                <w:b w:val="false"/>
-                <w:bCs w:val="false"/>
-                <w:sz w:val="18"/>
-                <w:szCs w:val="18"/>
-              </w:rPr>
-              <w:t xml:space="preserve">범위값 초안</w:t>
-            </w:r>
-          </w:p>
-        </w:tc>
-      </w:tr>
-      <w:tr>
-        <w:trPr>
-          <w:tblHeader w:val="false"/>
-        </w:trPr>
-        <w:tc>
-          <w:tcPr>
-            <w:tcW w:type="dxa" w:w="803"/>
+            <w:tcW w:type="dxa" w:w="829"/>
             <w:tcBorders>
               <w:top w:val="single" w:color="BFC6BC" w:sz="4"/>
               <w:left w:val="single" w:color="BFC6BC" w:sz="4"/>
@@ -10500,7 +9261,7 @@
         </w:tc>
         <w:tc>
           <w:tcPr>
-            <w:tcW w:type="dxa" w:w="7730"/>
+            <w:tcW w:type="dxa" w:w="7980"/>
             <w:tcBorders>
               <w:top w:val="single" w:color="BFC6BC" w:sz="4"/>
               <w:left w:val="single" w:color="BFC6BC" w:sz="4"/>
@@ -10532,7 +9293,7 @@
         </w:tc>
         <w:tc>
           <w:tcPr>
-            <w:tcW w:type="dxa" w:w="1105"/>
+            <w:tcW w:type="dxa" w:w="829"/>
             <w:tcBorders>
               <w:top w:val="single" w:color="BFC6BC" w:sz="4"/>
               <w:left w:val="single" w:color="BFC6BC" w:sz="4"/>
@@ -10610,7 +9371,7 @@
           <w:b w:val="false"/>
           <w:bCs w:val="false"/>
         </w:rPr>
-        <w:t xml:space="preserve">토사유출을 현장 실측 대신 WEPP 모형으로 추정하고 국내 실측 문헌값으로 대조하는 방안</w:t>
+        <w:t xml:space="preserve">현장조사 조정안: 토사유출은 WEPP 예측과 국내 실측값 보정, 생물다양성은 자연환경조사 자료 분석으로 진행하고 카메라 트랩 모니터링은 3차년도 과제로 제안하는 방안</w:t>
       </w:r>
     </w:p>
     <w:p>
@@ -10628,25 +9389,7 @@
           <w:b w:val="false"/>
           <w:bCs w:val="false"/>
         </w:rPr>
-        <w:t xml:space="preserve">정보공개 청구서(안): 동부·북부지방산림청 1회 청구, 상세 자료는 주벌 실적 소반으로 한정, 대상 기간(보유 전체 여부)</w:t>
-      </w:r>
-    </w:p>
-    <w:p>
-      <w:pPr>
-        <w:pStyle w:val="ListParagraph"/>
-        <w:numPr>
-          <w:ilvl w:val="0"/>
-          <w:numId w:val="5"/>
-        </w:numPr>
-        <w:spacing w:after="60"/>
-      </w:pPr>
-      <w:r>
-        <w:rPr>
-          <w:rFonts w:ascii="Malgun Gothic" w:cs="Malgun Gothic" w:eastAsia="맑은 고딕" w:hAnsi="Malgun Gothic"/>
-          <w:b w:val="false"/>
-          <w:bCs w:val="false"/>
-        </w:rPr>
-        <w:t xml:space="preserve">생물다양성 범위: 2차년도는 자연환경조사 자료 분석으로 한정하고, 카메라 트랩 모니터링은 3차년도 과제로 제안하는 방안</w:t>
+        <w:t xml:space="preserve">정보공개 자료 수령 후 관리소·소반 선정 기준(벌채 실적, 경과연수별 비교구, 자연환경조사 지점 중첩)</w:t>
       </w:r>
     </w:p>
     <w:p>

</xml_diff>

<commit_message>
Remove divider lines from report
Co-Authored-By: Claude Opus 5.5 <noreply@anthropic.com>
Claude-Session: https://claude.ai/code/session_011DrJSR3zzQAfuEGwbEcRfw
</commit_message>
<xml_diff>
--- a/reports/2026-10_RQ1_월간보고.docx
+++ b/reports/2026-10_RQ1_월간보고.docx
@@ -54,9 +54,6 @@
     </w:p>
     <w:p>
       <w:pPr>
-        <w:pBdr>
-          <w:bottom w:val="single" w:color="2F5D46" w:sz="8" w:space="6"/>
-        </w:pBdr>
         <w:spacing w:after="240"/>
       </w:pPr>
       <w:r>
@@ -3727,10 +3724,6 @@
     </w:p>
     <w:p>
       <w:pPr>
-        <w:pBdr>
-          <w:top w:val="dashed" w:color="BFC6BC" w:sz="4" w:space="4"/>
-          <w:bottom w:val="dashed" w:color="BFC6BC" w:sz="4" w:space="4"/>
-        </w:pBdr>
         <w:shd w:fill="F1F3EE" w:color="auto" w:val="clear"/>
         <w:spacing w:after="120" w:before="80"/>
         <w:jc w:val="center"/>
@@ -10012,9 +10005,6 @@
     <w:next w:val="Normal"/>
     <w:qFormat/>
     <w:pPr>
-      <w:pBdr>
-        <w:bottom w:val="single" w:color="2F5D46" w:sz="8" w:space="4"/>
-      </w:pBdr>
       <w:spacing w:after="160" w:before="360"/>
       <w:outlineLvl w:val="0"/>
     </w:pPr>

</xml_diff>